<commit_message>
docs: update diary for today's progress
</commit_message>
<xml_diff>
--- a/日記.docx
+++ b/日記.docx
@@ -331,8 +331,6 @@
         </w:rPr>
         <w:t>UI</w:t>
       </w:r>
-      <w:bookmarkStart w:id="0" w:name="_GoBack"/>
-      <w:bookmarkEnd w:id="0"/>
     </w:p>
     <w:p>
       <w:pPr>
@@ -412,6 +410,484 @@
           <w:lang w:val="en-US" w:eastAsia="zh-TW"/>
         </w:rPr>
         <w:t>才能呼叫</w:t>
+      </w:r>
+    </w:p>
+    <w:p>
+      <w:pPr>
+        <w:pStyle w:val="28"/>
+        <w:widowControl w:val="0"/>
+        <w:numPr>
+          <w:numId w:val="0"/>
+        </w:numPr>
+        <w:tabs>
+          <w:tab w:val="left" w:pos="420"/>
+        </w:tabs>
+        <w:spacing w:after="160" w:line="278" w:lineRule="auto"/>
+        <w:contextualSpacing/>
+        <w:rPr>
+          <w:rFonts w:hint="eastAsia" w:eastAsia="新細明體"/>
+          <w:lang w:val="en-US" w:eastAsia="zh-TW"/>
+        </w:rPr>
+      </w:pPr>
+    </w:p>
+    <w:p>
+      <w:pPr>
+        <w:pStyle w:val="28"/>
+        <w:widowControl w:val="0"/>
+        <w:numPr>
+          <w:numId w:val="0"/>
+        </w:numPr>
+        <w:tabs>
+          <w:tab w:val="left" w:pos="420"/>
+        </w:tabs>
+        <w:spacing w:after="160" w:line="278" w:lineRule="auto"/>
+        <w:contextualSpacing/>
+        <w:rPr>
+          <w:rFonts w:hint="default" w:eastAsia="新細明體"/>
+          <w:lang w:val="en-US" w:eastAsia="zh-TW"/>
+        </w:rPr>
+      </w:pPr>
+      <w:r>
+        <w:rPr>
+          <w:rFonts w:hint="default" w:eastAsia="新細明體"/>
+          <w:lang w:val="en-US" w:eastAsia="zh-TW"/>
+        </w:rPr>
+        <w:t>5/13</w:t>
+      </w:r>
+    </w:p>
+    <w:p>
+      <w:pPr>
+        <w:pStyle w:val="28"/>
+        <w:widowControl w:val="0"/>
+        <w:numPr>
+          <w:ilvl w:val="0"/>
+          <w:numId w:val="3"/>
+        </w:numPr>
+        <w:spacing w:after="160" w:line="278" w:lineRule="auto"/>
+        <w:ind w:left="420" w:leftChars="0" w:hanging="420" w:firstLineChars="0"/>
+        <w:contextualSpacing/>
+        <w:rPr>
+          <w:rFonts w:hint="default" w:eastAsia="新細明體"/>
+          <w:lang w:val="en-US" w:eastAsia="zh-TW"/>
+        </w:rPr>
+      </w:pPr>
+      <w:r>
+        <w:rPr>
+          <w:rFonts w:hint="eastAsia" w:eastAsia="新細明體"/>
+          <w:lang w:val="en-US" w:eastAsia="zh-TW"/>
+        </w:rPr>
+        <w:t>進度：</w:t>
+      </w:r>
+    </w:p>
+    <w:p>
+      <w:pPr>
+        <w:pStyle w:val="28"/>
+        <w:widowControl w:val="0"/>
+        <w:numPr>
+          <w:ilvl w:val="1"/>
+          <w:numId w:val="2"/>
+        </w:numPr>
+        <w:spacing w:after="160" w:line="278" w:lineRule="auto"/>
+        <w:ind w:left="840" w:leftChars="0" w:hanging="420" w:firstLineChars="0"/>
+        <w:contextualSpacing/>
+        <w:rPr>
+          <w:rFonts w:hint="default"/>
+          <w:lang w:val="en-US"/>
+        </w:rPr>
+      </w:pPr>
+      <w:r>
+        <w:rPr>
+          <w:rFonts w:hint="eastAsia" w:eastAsia="新細明體"/>
+          <w:lang w:val="en-US" w:eastAsia="zh-TW"/>
+        </w:rPr>
+        <w:t xml:space="preserve">加上 </w:t>
+      </w:r>
+      <w:r>
+        <w:rPr>
+          <w:rFonts w:hint="default" w:eastAsia="新細明體"/>
+          <w:lang w:val="en-US" w:eastAsia="zh-TW"/>
+        </w:rPr>
+        <w:t xml:space="preserve">navigate </w:t>
+      </w:r>
+      <w:r>
+        <w:rPr>
+          <w:rFonts w:hint="eastAsia" w:eastAsia="新細明體"/>
+          <w:lang w:val="en-US" w:eastAsia="zh-TW"/>
+        </w:rPr>
+        <w:t>的功能自動跳轉頁面</w:t>
+      </w:r>
+    </w:p>
+    <w:p>
+      <w:pPr>
+        <w:pStyle w:val="28"/>
+        <w:widowControl w:val="0"/>
+        <w:numPr>
+          <w:ilvl w:val="1"/>
+          <w:numId w:val="3"/>
+        </w:numPr>
+        <w:spacing w:after="160" w:line="278" w:lineRule="auto"/>
+        <w:ind w:left="840" w:leftChars="0" w:hanging="420" w:firstLineChars="0"/>
+        <w:contextualSpacing/>
+        <w:rPr>
+          <w:rFonts w:hint="default" w:eastAsia="新細明體"/>
+          <w:lang w:val="en-US" w:eastAsia="zh-TW"/>
+        </w:rPr>
+      </w:pPr>
+      <w:r>
+        <w:rPr>
+          <w:rFonts w:hint="eastAsia" w:eastAsia="新細明體"/>
+          <w:lang w:val="en-US" w:eastAsia="zh-TW"/>
+        </w:rPr>
+        <w:t xml:space="preserve">可以呈現 </w:t>
+      </w:r>
+      <w:r>
+        <w:rPr>
+          <w:rFonts w:hint="default" w:eastAsia="新細明體"/>
+          <w:lang w:val="en-US" w:eastAsia="zh-TW"/>
+        </w:rPr>
+        <w:t xml:space="preserve">pdf </w:t>
+      </w:r>
+      <w:r>
+        <w:rPr>
+          <w:rFonts w:hint="eastAsia" w:eastAsia="新細明體"/>
+          <w:lang w:val="en-US" w:eastAsia="zh-TW"/>
+        </w:rPr>
+        <w:t>的內容</w:t>
+      </w:r>
+    </w:p>
+    <w:p>
+      <w:pPr>
+        <w:pStyle w:val="28"/>
+        <w:widowControl w:val="0"/>
+        <w:numPr>
+          <w:ilvl w:val="0"/>
+          <w:numId w:val="3"/>
+        </w:numPr>
+        <w:spacing w:after="160" w:line="278" w:lineRule="auto"/>
+        <w:ind w:left="420" w:leftChars="0" w:hanging="420" w:firstLineChars="0"/>
+        <w:contextualSpacing/>
+        <w:rPr>
+          <w:rFonts w:hint="default" w:eastAsia="新細明體"/>
+          <w:lang w:val="en-US" w:eastAsia="zh-TW"/>
+        </w:rPr>
+      </w:pPr>
+      <w:r>
+        <w:rPr>
+          <w:rFonts w:hint="eastAsia" w:eastAsia="新細明體"/>
+          <w:lang w:val="en-US" w:eastAsia="zh-TW"/>
+        </w:rPr>
+        <w:t>下次規劃：</w:t>
+      </w:r>
+    </w:p>
+    <w:p>
+      <w:pPr>
+        <w:pStyle w:val="28"/>
+        <w:widowControl w:val="0"/>
+        <w:numPr>
+          <w:ilvl w:val="1"/>
+          <w:numId w:val="3"/>
+        </w:numPr>
+        <w:spacing w:after="160" w:line="278" w:lineRule="auto"/>
+        <w:ind w:left="840" w:leftChars="0" w:hanging="420" w:firstLineChars="0"/>
+        <w:contextualSpacing/>
+        <w:rPr>
+          <w:rFonts w:hint="default" w:eastAsia="新細明體"/>
+          <w:lang w:val="en-US" w:eastAsia="zh-TW"/>
+        </w:rPr>
+      </w:pPr>
+      <w:r>
+        <w:rPr>
+          <w:rFonts w:hint="eastAsia" w:eastAsia="新細明體"/>
+          <w:lang w:val="en-US" w:eastAsia="zh-TW"/>
+        </w:rPr>
+        <w:t xml:space="preserve">優化首頁 </w:t>
+      </w:r>
+      <w:r>
+        <w:rPr>
+          <w:rFonts w:hint="default" w:eastAsia="新細明體"/>
+          <w:lang w:val="en-US" w:eastAsia="zh-TW"/>
+        </w:rPr>
+        <w:t>UI</w:t>
+      </w:r>
+    </w:p>
+    <w:p>
+      <w:pPr>
+        <w:pStyle w:val="28"/>
+        <w:widowControl w:val="0"/>
+        <w:numPr>
+          <w:ilvl w:val="1"/>
+          <w:numId w:val="3"/>
+        </w:numPr>
+        <w:spacing w:after="160" w:line="278" w:lineRule="auto"/>
+        <w:ind w:left="840" w:leftChars="0" w:hanging="420" w:firstLineChars="0"/>
+        <w:contextualSpacing/>
+        <w:rPr>
+          <w:rFonts w:hint="default" w:eastAsia="新細明體"/>
+          <w:lang w:val="en-US" w:eastAsia="zh-TW"/>
+        </w:rPr>
+      </w:pPr>
+      <w:r>
+        <w:rPr>
+          <w:rFonts w:hint="eastAsia" w:eastAsia="新細明體"/>
+          <w:lang w:val="en-US" w:eastAsia="zh-TW"/>
+        </w:rPr>
+        <w:t xml:space="preserve">讀取 </w:t>
+      </w:r>
+      <w:r>
+        <w:rPr>
+          <w:rFonts w:hint="default" w:eastAsia="新細明體"/>
+          <w:lang w:val="en-US" w:eastAsia="zh-TW"/>
+        </w:rPr>
+        <w:t xml:space="preserve">pdf </w:t>
+      </w:r>
+      <w:r>
+        <w:rPr>
+          <w:rFonts w:hint="eastAsia" w:eastAsia="新細明體"/>
+          <w:lang w:val="en-US" w:eastAsia="zh-TW"/>
+        </w:rPr>
+        <w:t>文字</w:t>
+      </w:r>
+    </w:p>
+    <w:p>
+      <w:pPr>
+        <w:pStyle w:val="28"/>
+        <w:widowControl w:val="0"/>
+        <w:numPr>
+          <w:ilvl w:val="1"/>
+          <w:numId w:val="3"/>
+        </w:numPr>
+        <w:spacing w:after="160" w:line="278" w:lineRule="auto"/>
+        <w:ind w:left="840" w:leftChars="0" w:hanging="420" w:firstLineChars="0"/>
+        <w:contextualSpacing/>
+        <w:rPr>
+          <w:rFonts w:hint="default" w:eastAsia="新細明體"/>
+          <w:lang w:val="en-US" w:eastAsia="zh-TW"/>
+        </w:rPr>
+      </w:pPr>
+      <w:r>
+        <w:rPr>
+          <w:rFonts w:hint="eastAsia" w:eastAsia="新細明體"/>
+          <w:lang w:val="en-US" w:eastAsia="zh-TW"/>
+        </w:rPr>
+        <w:t xml:space="preserve">導入 </w:t>
+      </w:r>
+      <w:r>
+        <w:rPr>
+          <w:rFonts w:hint="default" w:eastAsia="新細明體"/>
+          <w:lang w:val="en-US" w:eastAsia="zh-TW"/>
+        </w:rPr>
+        <w:t xml:space="preserve">AI </w:t>
+      </w:r>
+    </w:p>
+    <w:p>
+      <w:pPr>
+        <w:pStyle w:val="28"/>
+        <w:widowControl w:val="0"/>
+        <w:numPr>
+          <w:ilvl w:val="1"/>
+          <w:numId w:val="3"/>
+        </w:numPr>
+        <w:spacing w:after="160" w:line="278" w:lineRule="auto"/>
+        <w:ind w:left="840" w:leftChars="0" w:hanging="420" w:firstLineChars="0"/>
+        <w:contextualSpacing/>
+        <w:rPr>
+          <w:rFonts w:hint="default" w:eastAsia="新細明體"/>
+          <w:lang w:val="en-US" w:eastAsia="zh-TW"/>
+        </w:rPr>
+      </w:pPr>
+      <w:r>
+        <w:rPr>
+          <w:rFonts w:hint="eastAsia" w:eastAsia="新細明體"/>
+          <w:lang w:val="en-US" w:eastAsia="zh-TW"/>
+        </w:rPr>
+        <w:t xml:space="preserve">問題：這些 </w:t>
+      </w:r>
+      <w:r>
+        <w:rPr>
+          <w:rFonts w:hint="default" w:eastAsia="新細明體"/>
+          <w:lang w:val="en-US" w:eastAsia="zh-TW"/>
+        </w:rPr>
+        <w:t xml:space="preserve">pdf </w:t>
+      </w:r>
+      <w:r>
+        <w:rPr>
+          <w:rFonts w:hint="eastAsia" w:eastAsia="新細明體"/>
+          <w:lang w:val="en-US" w:eastAsia="zh-TW"/>
+        </w:rPr>
+        <w:t>有辦法存雲端嗎？目前是存本地</w:t>
+      </w:r>
+    </w:p>
+    <w:p>
+      <w:pPr>
+        <w:pStyle w:val="28"/>
+        <w:widowControl w:val="0"/>
+        <w:numPr>
+          <w:ilvl w:val="0"/>
+          <w:numId w:val="3"/>
+        </w:numPr>
+        <w:spacing w:after="160" w:line="278" w:lineRule="auto"/>
+        <w:ind w:left="420" w:leftChars="0" w:hanging="420" w:firstLineChars="0"/>
+        <w:contextualSpacing/>
+        <w:rPr>
+          <w:rFonts w:hint="default" w:eastAsia="新細明體"/>
+          <w:lang w:val="en-US" w:eastAsia="zh-TW"/>
+        </w:rPr>
+      </w:pPr>
+      <w:r>
+        <w:rPr>
+          <w:rFonts w:hint="eastAsia" w:eastAsia="新細明體"/>
+          <w:lang w:val="en-US" w:eastAsia="zh-TW"/>
+        </w:rPr>
+        <w:t>心得：</w:t>
+      </w:r>
+      <w:bookmarkStart w:id="0" w:name="_GoBack"/>
+      <w:bookmarkEnd w:id="0"/>
+      <w:r>
+        <w:rPr>
+          <w:rFonts w:hint="eastAsia" w:eastAsia="新細明體"/>
+          <w:lang w:val="en-US" w:eastAsia="zh-TW"/>
+        </w:rPr>
+        <w:t xml:space="preserve">今天把讀取 </w:t>
+      </w:r>
+      <w:r>
+        <w:rPr>
+          <w:rFonts w:hint="default" w:eastAsia="新細明體"/>
+          <w:lang w:val="en-US" w:eastAsia="zh-TW"/>
+        </w:rPr>
+        <w:t xml:space="preserve">pdf </w:t>
+      </w:r>
+      <w:r>
+        <w:rPr>
+          <w:rFonts w:hint="eastAsia" w:eastAsia="新細明體"/>
+          <w:lang w:val="en-US" w:eastAsia="zh-TW"/>
+        </w:rPr>
+        <w:t xml:space="preserve">並呈現出來的功能包成一個 </w:t>
+      </w:r>
+      <w:r>
+        <w:rPr>
+          <w:rFonts w:hint="default" w:eastAsia="新細明體"/>
+          <w:lang w:val="en-US" w:eastAsia="zh-TW"/>
+        </w:rPr>
+        <w:t>api</w:t>
+      </w:r>
+      <w:r>
+        <w:rPr>
+          <w:rFonts w:hint="eastAsia" w:eastAsia="新細明體"/>
+          <w:lang w:val="en-US" w:eastAsia="zh-TW"/>
+        </w:rPr>
+        <w:t>，然後在</w:t>
+      </w:r>
+      <w:r>
+        <w:rPr>
+          <w:rFonts w:hint="default" w:eastAsia="新細明體"/>
+          <w:lang w:val="en-US" w:eastAsia="zh-TW"/>
+        </w:rPr>
+        <w:t xml:space="preserve">component </w:t>
+      </w:r>
+      <w:r>
+        <w:rPr>
+          <w:rFonts w:hint="eastAsia" w:eastAsia="新細明體"/>
+          <w:lang w:val="en-US" w:eastAsia="zh-TW"/>
+        </w:rPr>
+        <w:t>中設計一個</w:t>
+      </w:r>
+      <w:r>
+        <w:rPr>
+          <w:rFonts w:hint="default" w:eastAsia="新細明體"/>
+          <w:lang w:val="en-US" w:eastAsia="zh-TW"/>
+        </w:rPr>
+        <w:t>function</w:t>
+      </w:r>
+      <w:r>
+        <w:rPr>
+          <w:rFonts w:hint="eastAsia" w:eastAsia="新細明體"/>
+          <w:lang w:val="en-US" w:eastAsia="zh-TW"/>
+        </w:rPr>
+        <w:t xml:space="preserve"> 把 </w:t>
+      </w:r>
+      <w:r>
+        <w:rPr>
+          <w:rFonts w:hint="default" w:eastAsia="新細明體"/>
+          <w:lang w:val="en-US" w:eastAsia="zh-TW"/>
+        </w:rPr>
+        <w:t>params</w:t>
+      </w:r>
+      <w:r>
+        <w:rPr>
+          <w:rFonts w:hint="eastAsia" w:eastAsia="新細明體"/>
+          <w:lang w:val="en-US" w:eastAsia="zh-TW"/>
+        </w:rPr>
+        <w:t xml:space="preserve"> 設計成呼叫此 </w:t>
+      </w:r>
+      <w:r>
+        <w:rPr>
+          <w:rFonts w:hint="default" w:eastAsia="新細明體"/>
+          <w:lang w:val="en-US" w:eastAsia="zh-TW"/>
+        </w:rPr>
+        <w:t xml:space="preserve">api </w:t>
+      </w:r>
+      <w:r>
+        <w:rPr>
+          <w:rFonts w:hint="eastAsia" w:eastAsia="新細明體"/>
+          <w:lang w:val="en-US" w:eastAsia="zh-TW"/>
+        </w:rPr>
+        <w:t xml:space="preserve">的 </w:t>
+      </w:r>
+      <w:r>
+        <w:rPr>
+          <w:rFonts w:hint="default" w:eastAsia="新細明體"/>
+          <w:lang w:val="en-US" w:eastAsia="zh-TW"/>
+        </w:rPr>
+        <w:t>url</w:t>
+      </w:r>
+      <w:r>
+        <w:rPr>
+          <w:rFonts w:hint="eastAsia" w:eastAsia="新細明體"/>
+          <w:lang w:val="en-US" w:eastAsia="zh-TW"/>
+        </w:rPr>
+        <w:t xml:space="preserve">，並且在 </w:t>
+      </w:r>
+      <w:r>
+        <w:rPr>
+          <w:rFonts w:hint="default" w:eastAsia="新細明體"/>
+          <w:lang w:val="en-US" w:eastAsia="zh-TW"/>
+        </w:rPr>
+        <w:t>page.tsx</w:t>
+      </w:r>
+      <w:r>
+        <w:rPr>
+          <w:rFonts w:hint="eastAsia" w:eastAsia="新細明體"/>
+          <w:lang w:val="en-US" w:eastAsia="zh-TW"/>
+        </w:rPr>
+        <w:t xml:space="preserve"> 中加上此 </w:t>
+      </w:r>
+      <w:r>
+        <w:rPr>
+          <w:rFonts w:hint="default" w:eastAsia="新細明體"/>
+          <w:lang w:val="en-US" w:eastAsia="zh-TW"/>
+        </w:rPr>
+        <w:t xml:space="preserve">component </w:t>
+      </w:r>
+      <w:r>
+        <w:rPr>
+          <w:rFonts w:hint="eastAsia" w:eastAsia="新細明體"/>
+          <w:lang w:val="en-US" w:eastAsia="zh-TW"/>
+        </w:rPr>
+        <w:t xml:space="preserve">的 </w:t>
+      </w:r>
+      <w:r>
+        <w:rPr>
+          <w:rFonts w:hint="default" w:eastAsia="新細明體"/>
+          <w:lang w:val="en-US" w:eastAsia="zh-TW"/>
+        </w:rPr>
+        <w:t>tag</w:t>
+      </w:r>
+      <w:r>
+        <w:rPr>
+          <w:rFonts w:hint="eastAsia" w:eastAsia="新細明體"/>
+          <w:lang w:val="en-US" w:eastAsia="zh-TW"/>
+        </w:rPr>
+        <w:t>，整體流程讓我更熟悉撰寫流程了</w:t>
       </w:r>
     </w:p>
     <w:sectPr>
@@ -617,6 +1093,146 @@
     </w:lvl>
   </w:abstractNum>
   <w:abstractNum w:abstractNumId="1">
+    <w:nsid w:val="FFFBD9F0"/>
+    <w:multiLevelType w:val="multilevel"/>
+    <w:tmpl w:val="FFFBD9F0"/>
+    <w:lvl w:ilvl="0" w:tentative="0">
+      <w:start w:val="1"/>
+      <w:numFmt w:val="bullet"/>
+      <w:lvlText w:val=""/>
+      <w:lvlJc w:val="left"/>
+      <w:pPr>
+        <w:tabs>
+          <w:tab w:val="left" w:pos="420"/>
+        </w:tabs>
+        <w:ind w:left="420" w:leftChars="0" w:hanging="420" w:firstLineChars="0"/>
+      </w:pPr>
+      <w:rPr>
+        <w:rFonts w:hint="default" w:ascii="Wingdings" w:hAnsi="Wingdings"/>
+      </w:rPr>
+    </w:lvl>
+    <w:lvl w:ilvl="1" w:tentative="0">
+      <w:start w:val="1"/>
+      <w:numFmt w:val="bullet"/>
+      <w:lvlText w:val=""/>
+      <w:lvlJc w:val="left"/>
+      <w:pPr>
+        <w:tabs>
+          <w:tab w:val="left" w:pos="840"/>
+        </w:tabs>
+        <w:ind w:left="840" w:leftChars="0" w:hanging="420" w:firstLineChars="0"/>
+      </w:pPr>
+      <w:rPr>
+        <w:rFonts w:hint="default" w:ascii="Wingdings" w:hAnsi="Wingdings"/>
+      </w:rPr>
+    </w:lvl>
+    <w:lvl w:ilvl="2" w:tentative="0">
+      <w:start w:val="1"/>
+      <w:numFmt w:val="bullet"/>
+      <w:lvlText w:val=""/>
+      <w:lvlJc w:val="left"/>
+      <w:pPr>
+        <w:tabs>
+          <w:tab w:val="left" w:pos="1260"/>
+        </w:tabs>
+        <w:ind w:left="1260" w:leftChars="0" w:hanging="420" w:firstLineChars="0"/>
+      </w:pPr>
+      <w:rPr>
+        <w:rFonts w:hint="default" w:ascii="Wingdings" w:hAnsi="Wingdings"/>
+      </w:rPr>
+    </w:lvl>
+    <w:lvl w:ilvl="3" w:tentative="0">
+      <w:start w:val="1"/>
+      <w:numFmt w:val="bullet"/>
+      <w:lvlText w:val=""/>
+      <w:lvlJc w:val="left"/>
+      <w:pPr>
+        <w:tabs>
+          <w:tab w:val="left" w:pos="1680"/>
+        </w:tabs>
+        <w:ind w:left="1680" w:leftChars="0" w:hanging="420" w:firstLineChars="0"/>
+      </w:pPr>
+      <w:rPr>
+        <w:rFonts w:hint="default" w:ascii="Wingdings" w:hAnsi="Wingdings"/>
+      </w:rPr>
+    </w:lvl>
+    <w:lvl w:ilvl="4" w:tentative="0">
+      <w:start w:val="1"/>
+      <w:numFmt w:val="bullet"/>
+      <w:lvlText w:val=""/>
+      <w:lvlJc w:val="left"/>
+      <w:pPr>
+        <w:tabs>
+          <w:tab w:val="left" w:pos="2100"/>
+        </w:tabs>
+        <w:ind w:left="2100" w:leftChars="0" w:hanging="420" w:firstLineChars="0"/>
+      </w:pPr>
+      <w:rPr>
+        <w:rFonts w:hint="default" w:ascii="Wingdings" w:hAnsi="Wingdings"/>
+      </w:rPr>
+    </w:lvl>
+    <w:lvl w:ilvl="5" w:tentative="0">
+      <w:start w:val="1"/>
+      <w:numFmt w:val="bullet"/>
+      <w:lvlText w:val=""/>
+      <w:lvlJc w:val="left"/>
+      <w:pPr>
+        <w:tabs>
+          <w:tab w:val="left" w:pos="2520"/>
+        </w:tabs>
+        <w:ind w:left="2520" w:leftChars="0" w:hanging="420" w:firstLineChars="0"/>
+      </w:pPr>
+      <w:rPr>
+        <w:rFonts w:hint="default" w:ascii="Wingdings" w:hAnsi="Wingdings"/>
+      </w:rPr>
+    </w:lvl>
+    <w:lvl w:ilvl="6" w:tentative="0">
+      <w:start w:val="1"/>
+      <w:numFmt w:val="bullet"/>
+      <w:lvlText w:val=""/>
+      <w:lvlJc w:val="left"/>
+      <w:pPr>
+        <w:tabs>
+          <w:tab w:val="left" w:pos="2940"/>
+        </w:tabs>
+        <w:ind w:left="2940" w:leftChars="0" w:hanging="420" w:firstLineChars="0"/>
+      </w:pPr>
+      <w:rPr>
+        <w:rFonts w:hint="default" w:ascii="Wingdings" w:hAnsi="Wingdings"/>
+      </w:rPr>
+    </w:lvl>
+    <w:lvl w:ilvl="7" w:tentative="0">
+      <w:start w:val="1"/>
+      <w:numFmt w:val="bullet"/>
+      <w:lvlText w:val=""/>
+      <w:lvlJc w:val="left"/>
+      <w:pPr>
+        <w:tabs>
+          <w:tab w:val="left" w:pos="3360"/>
+        </w:tabs>
+        <w:ind w:left="3360" w:leftChars="0" w:hanging="420" w:firstLineChars="0"/>
+      </w:pPr>
+      <w:rPr>
+        <w:rFonts w:hint="default" w:ascii="Wingdings" w:hAnsi="Wingdings"/>
+      </w:rPr>
+    </w:lvl>
+    <w:lvl w:ilvl="8" w:tentative="0">
+      <w:start w:val="1"/>
+      <w:numFmt w:val="bullet"/>
+      <w:lvlText w:val=""/>
+      <w:lvlJc w:val="left"/>
+      <w:pPr>
+        <w:tabs>
+          <w:tab w:val="left" w:pos="3780"/>
+        </w:tabs>
+        <w:ind w:left="3780" w:leftChars="0" w:hanging="420" w:firstLineChars="0"/>
+      </w:pPr>
+      <w:rPr>
+        <w:rFonts w:hint="default" w:ascii="Wingdings" w:hAnsi="Wingdings"/>
+      </w:rPr>
+    </w:lvl>
+  </w:abstractNum>
+  <w:abstractNum w:abstractNumId="2">
     <w:nsid w:val="0B3C2EF0"/>
     <w:multiLevelType w:val="multilevel"/>
     <w:tmpl w:val="0B3C2EF0"/>
@@ -730,10 +1346,13 @@
     </w:lvl>
   </w:abstractNum>
   <w:num w:numId="1">
-    <w:abstractNumId w:val="1"/>
+    <w:abstractNumId w:val="2"/>
   </w:num>
   <w:num w:numId="2">
     <w:abstractNumId w:val="0"/>
+  </w:num>
+  <w:num w:numId="3">
+    <w:abstractNumId w:val="1"/>
   </w:num>
 </w:numbering>
 </file>

</xml_diff>

<commit_message>
feat: implement PDF text extraction and database schema for page content
</commit_message>
<xml_diff>
--- a/日記.docx
+++ b/日記.docx
@@ -410,6 +410,477 @@
           <w:lang w:val="en-US" w:eastAsia="zh-TW"/>
         </w:rPr>
         <w:t>才能呼叫</w:t>
+      </w:r>
+    </w:p>
+    <w:p>
+      <w:pPr>
+        <w:pStyle w:val="28"/>
+        <w:widowControl w:val="0"/>
+        <w:numPr>
+          <w:ilvl w:val="0"/>
+          <w:numId w:val="0"/>
+        </w:numPr>
+        <w:tabs>
+          <w:tab w:val="left" w:pos="420"/>
+        </w:tabs>
+        <w:spacing w:after="160" w:line="278" w:lineRule="auto"/>
+        <w:contextualSpacing/>
+        <w:rPr>
+          <w:rFonts w:hint="eastAsia" w:eastAsia="新細明體"/>
+          <w:lang w:val="en-US" w:eastAsia="zh-TW"/>
+        </w:rPr>
+      </w:pPr>
+    </w:p>
+    <w:p>
+      <w:pPr>
+        <w:pStyle w:val="28"/>
+        <w:widowControl w:val="0"/>
+        <w:numPr>
+          <w:ilvl w:val="0"/>
+          <w:numId w:val="0"/>
+        </w:numPr>
+        <w:tabs>
+          <w:tab w:val="left" w:pos="420"/>
+        </w:tabs>
+        <w:spacing w:after="160" w:line="278" w:lineRule="auto"/>
+        <w:contextualSpacing/>
+        <w:rPr>
+          <w:rFonts w:hint="default" w:eastAsia="新細明體"/>
+          <w:lang w:val="en-US" w:eastAsia="zh-TW"/>
+        </w:rPr>
+      </w:pPr>
+      <w:r>
+        <w:rPr>
+          <w:rFonts w:hint="default" w:eastAsia="新細明體"/>
+          <w:lang w:val="en-US" w:eastAsia="zh-TW"/>
+        </w:rPr>
+        <w:t>5/13</w:t>
+      </w:r>
+    </w:p>
+    <w:p>
+      <w:pPr>
+        <w:pStyle w:val="28"/>
+        <w:widowControl w:val="0"/>
+        <w:numPr>
+          <w:ilvl w:val="0"/>
+          <w:numId w:val="3"/>
+        </w:numPr>
+        <w:spacing w:after="160" w:line="278" w:lineRule="auto"/>
+        <w:ind w:left="420" w:leftChars="0" w:hanging="420" w:firstLineChars="0"/>
+        <w:contextualSpacing/>
+        <w:rPr>
+          <w:rFonts w:hint="default" w:eastAsia="新細明體"/>
+          <w:lang w:val="en-US" w:eastAsia="zh-TW"/>
+        </w:rPr>
+      </w:pPr>
+      <w:r>
+        <w:rPr>
+          <w:rFonts w:hint="eastAsia" w:eastAsia="新細明體"/>
+          <w:lang w:val="en-US" w:eastAsia="zh-TW"/>
+        </w:rPr>
+        <w:t>進度：</w:t>
+      </w:r>
+    </w:p>
+    <w:p>
+      <w:pPr>
+        <w:pStyle w:val="28"/>
+        <w:widowControl w:val="0"/>
+        <w:numPr>
+          <w:ilvl w:val="1"/>
+          <w:numId w:val="2"/>
+        </w:numPr>
+        <w:spacing w:after="160" w:line="278" w:lineRule="auto"/>
+        <w:ind w:left="840" w:leftChars="0" w:hanging="420" w:firstLineChars="0"/>
+        <w:contextualSpacing/>
+        <w:rPr>
+          <w:rFonts w:hint="default"/>
+          <w:lang w:val="en-US"/>
+        </w:rPr>
+      </w:pPr>
+      <w:r>
+        <w:rPr>
+          <w:rFonts w:hint="eastAsia" w:eastAsia="新細明體"/>
+          <w:lang w:val="en-US" w:eastAsia="zh-TW"/>
+        </w:rPr>
+        <w:t xml:space="preserve">加上 </w:t>
+      </w:r>
+      <w:r>
+        <w:rPr>
+          <w:rFonts w:hint="default" w:eastAsia="新細明體"/>
+          <w:lang w:val="en-US" w:eastAsia="zh-TW"/>
+        </w:rPr>
+        <w:t xml:space="preserve">navigate </w:t>
+      </w:r>
+      <w:r>
+        <w:rPr>
+          <w:rFonts w:hint="eastAsia" w:eastAsia="新細明體"/>
+          <w:lang w:val="en-US" w:eastAsia="zh-TW"/>
+        </w:rPr>
+        <w:t>的功能自動跳轉頁面</w:t>
+      </w:r>
+    </w:p>
+    <w:p>
+      <w:pPr>
+        <w:pStyle w:val="28"/>
+        <w:widowControl w:val="0"/>
+        <w:numPr>
+          <w:ilvl w:val="1"/>
+          <w:numId w:val="3"/>
+        </w:numPr>
+        <w:spacing w:after="160" w:line="278" w:lineRule="auto"/>
+        <w:ind w:left="840" w:leftChars="0" w:hanging="420" w:firstLineChars="0"/>
+        <w:contextualSpacing/>
+        <w:rPr>
+          <w:rFonts w:hint="default" w:eastAsia="新細明體"/>
+          <w:lang w:val="en-US" w:eastAsia="zh-TW"/>
+        </w:rPr>
+      </w:pPr>
+      <w:r>
+        <w:rPr>
+          <w:rFonts w:hint="eastAsia" w:eastAsia="新細明體"/>
+          <w:lang w:val="en-US" w:eastAsia="zh-TW"/>
+        </w:rPr>
+        <w:t xml:space="preserve">可以呈現 </w:t>
+      </w:r>
+      <w:r>
+        <w:rPr>
+          <w:rFonts w:hint="default" w:eastAsia="新細明體"/>
+          <w:lang w:val="en-US" w:eastAsia="zh-TW"/>
+        </w:rPr>
+        <w:t xml:space="preserve">pdf </w:t>
+      </w:r>
+      <w:r>
+        <w:rPr>
+          <w:rFonts w:hint="eastAsia" w:eastAsia="新細明體"/>
+          <w:lang w:val="en-US" w:eastAsia="zh-TW"/>
+        </w:rPr>
+        <w:t>的內容</w:t>
+      </w:r>
+    </w:p>
+    <w:p>
+      <w:pPr>
+        <w:pStyle w:val="28"/>
+        <w:widowControl w:val="0"/>
+        <w:numPr>
+          <w:ilvl w:val="0"/>
+          <w:numId w:val="3"/>
+        </w:numPr>
+        <w:spacing w:after="160" w:line="278" w:lineRule="auto"/>
+        <w:ind w:left="420" w:leftChars="0" w:hanging="420" w:firstLineChars="0"/>
+        <w:contextualSpacing/>
+        <w:rPr>
+          <w:rFonts w:hint="default" w:eastAsia="新細明體"/>
+          <w:lang w:val="en-US" w:eastAsia="zh-TW"/>
+        </w:rPr>
+      </w:pPr>
+      <w:r>
+        <w:rPr>
+          <w:rFonts w:hint="eastAsia" w:eastAsia="新細明體"/>
+          <w:lang w:val="en-US" w:eastAsia="zh-TW"/>
+        </w:rPr>
+        <w:t>下次規劃：</w:t>
+      </w:r>
+    </w:p>
+    <w:p>
+      <w:pPr>
+        <w:pStyle w:val="28"/>
+        <w:widowControl w:val="0"/>
+        <w:numPr>
+          <w:ilvl w:val="1"/>
+          <w:numId w:val="3"/>
+        </w:numPr>
+        <w:spacing w:after="160" w:line="278" w:lineRule="auto"/>
+        <w:ind w:left="840" w:leftChars="0" w:hanging="420" w:firstLineChars="0"/>
+        <w:contextualSpacing/>
+        <w:rPr>
+          <w:rFonts w:hint="default" w:eastAsia="新細明體"/>
+          <w:lang w:val="en-US" w:eastAsia="zh-TW"/>
+        </w:rPr>
+      </w:pPr>
+      <w:r>
+        <w:rPr>
+          <w:rFonts w:hint="eastAsia" w:eastAsia="新細明體"/>
+          <w:lang w:val="en-US" w:eastAsia="zh-TW"/>
+        </w:rPr>
+        <w:t xml:space="preserve">優化首頁 </w:t>
+      </w:r>
+      <w:r>
+        <w:rPr>
+          <w:rFonts w:hint="default" w:eastAsia="新細明體"/>
+          <w:lang w:val="en-US" w:eastAsia="zh-TW"/>
+        </w:rPr>
+        <w:t>UI</w:t>
+      </w:r>
+    </w:p>
+    <w:p>
+      <w:pPr>
+        <w:pStyle w:val="28"/>
+        <w:widowControl w:val="0"/>
+        <w:numPr>
+          <w:ilvl w:val="1"/>
+          <w:numId w:val="3"/>
+        </w:numPr>
+        <w:spacing w:after="160" w:line="278" w:lineRule="auto"/>
+        <w:ind w:left="840" w:leftChars="0" w:hanging="420" w:firstLineChars="0"/>
+        <w:contextualSpacing/>
+        <w:rPr>
+          <w:rFonts w:hint="default" w:eastAsia="新細明體"/>
+          <w:lang w:val="en-US" w:eastAsia="zh-TW"/>
+        </w:rPr>
+      </w:pPr>
+      <w:r>
+        <w:rPr>
+          <w:rFonts w:hint="eastAsia" w:eastAsia="新細明體"/>
+          <w:lang w:val="en-US" w:eastAsia="zh-TW"/>
+        </w:rPr>
+        <w:t xml:space="preserve">讀取 </w:t>
+      </w:r>
+      <w:r>
+        <w:rPr>
+          <w:rFonts w:hint="default" w:eastAsia="新細明體"/>
+          <w:lang w:val="en-US" w:eastAsia="zh-TW"/>
+        </w:rPr>
+        <w:t xml:space="preserve">pdf </w:t>
+      </w:r>
+      <w:r>
+        <w:rPr>
+          <w:rFonts w:hint="eastAsia" w:eastAsia="新細明體"/>
+          <w:lang w:val="en-US" w:eastAsia="zh-TW"/>
+        </w:rPr>
+        <w:t>文字</w:t>
+      </w:r>
+    </w:p>
+    <w:p>
+      <w:pPr>
+        <w:pStyle w:val="28"/>
+        <w:widowControl w:val="0"/>
+        <w:numPr>
+          <w:ilvl w:val="1"/>
+          <w:numId w:val="3"/>
+        </w:numPr>
+        <w:spacing w:after="160" w:line="278" w:lineRule="auto"/>
+        <w:ind w:left="840" w:leftChars="0" w:hanging="420" w:firstLineChars="0"/>
+        <w:contextualSpacing/>
+        <w:rPr>
+          <w:rFonts w:hint="default" w:eastAsia="新細明體"/>
+          <w:lang w:val="en-US" w:eastAsia="zh-TW"/>
+        </w:rPr>
+      </w:pPr>
+      <w:r>
+        <w:rPr>
+          <w:rFonts w:hint="eastAsia" w:eastAsia="新細明體"/>
+          <w:lang w:val="en-US" w:eastAsia="zh-TW"/>
+        </w:rPr>
+        <w:t xml:space="preserve">導入 </w:t>
+      </w:r>
+      <w:r>
+        <w:rPr>
+          <w:rFonts w:hint="default" w:eastAsia="新細明體"/>
+          <w:lang w:val="en-US" w:eastAsia="zh-TW"/>
+        </w:rPr>
+        <w:t xml:space="preserve">AI </w:t>
+      </w:r>
+    </w:p>
+    <w:p>
+      <w:pPr>
+        <w:pStyle w:val="28"/>
+        <w:widowControl w:val="0"/>
+        <w:numPr>
+          <w:ilvl w:val="1"/>
+          <w:numId w:val="3"/>
+        </w:numPr>
+        <w:spacing w:after="160" w:line="278" w:lineRule="auto"/>
+        <w:ind w:left="840" w:leftChars="0" w:hanging="420" w:firstLineChars="0"/>
+        <w:contextualSpacing/>
+        <w:rPr>
+          <w:rFonts w:hint="default" w:eastAsia="新細明體"/>
+          <w:lang w:val="en-US" w:eastAsia="zh-TW"/>
+        </w:rPr>
+      </w:pPr>
+      <w:r>
+        <w:rPr>
+          <w:rFonts w:hint="eastAsia" w:eastAsia="新細明體"/>
+          <w:lang w:val="en-US" w:eastAsia="zh-TW"/>
+        </w:rPr>
+        <w:t xml:space="preserve">問題：這些 </w:t>
+      </w:r>
+      <w:r>
+        <w:rPr>
+          <w:rFonts w:hint="default" w:eastAsia="新細明體"/>
+          <w:lang w:val="en-US" w:eastAsia="zh-TW"/>
+        </w:rPr>
+        <w:t xml:space="preserve">pdf </w:t>
+      </w:r>
+      <w:r>
+        <w:rPr>
+          <w:rFonts w:hint="eastAsia" w:eastAsia="新細明體"/>
+          <w:lang w:val="en-US" w:eastAsia="zh-TW"/>
+        </w:rPr>
+        <w:t>有辦法存雲端嗎？目前是存本地</w:t>
+      </w:r>
+    </w:p>
+    <w:p>
+      <w:pPr>
+        <w:pStyle w:val="28"/>
+        <w:widowControl w:val="0"/>
+        <w:numPr>
+          <w:ilvl w:val="0"/>
+          <w:numId w:val="3"/>
+        </w:numPr>
+        <w:spacing w:after="160" w:line="278" w:lineRule="auto"/>
+        <w:ind w:left="420" w:leftChars="0" w:hanging="420" w:firstLineChars="0"/>
+        <w:contextualSpacing/>
+        <w:rPr>
+          <w:rFonts w:hint="default" w:eastAsia="新細明體"/>
+          <w:lang w:val="en-US" w:eastAsia="zh-TW"/>
+        </w:rPr>
+      </w:pPr>
+      <w:r>
+        <w:rPr>
+          <w:rFonts w:hint="eastAsia" w:eastAsia="新細明體"/>
+          <w:lang w:val="en-US" w:eastAsia="zh-TW"/>
+        </w:rPr>
+        <w:t xml:space="preserve">心得：今天把讀取 </w:t>
+      </w:r>
+      <w:r>
+        <w:rPr>
+          <w:rFonts w:hint="default" w:eastAsia="新細明體"/>
+          <w:lang w:val="en-US" w:eastAsia="zh-TW"/>
+        </w:rPr>
+        <w:t xml:space="preserve">pdf </w:t>
+      </w:r>
+      <w:r>
+        <w:rPr>
+          <w:rFonts w:hint="eastAsia" w:eastAsia="新細明體"/>
+          <w:lang w:val="en-US" w:eastAsia="zh-TW"/>
+        </w:rPr>
+        <w:t xml:space="preserve">並呈現出來的功能包成一個 </w:t>
+      </w:r>
+      <w:r>
+        <w:rPr>
+          <w:rFonts w:hint="default" w:eastAsia="新細明體"/>
+          <w:lang w:val="en-US" w:eastAsia="zh-TW"/>
+        </w:rPr>
+        <w:t>api</w:t>
+      </w:r>
+      <w:r>
+        <w:rPr>
+          <w:rFonts w:hint="eastAsia" w:eastAsia="新細明體"/>
+          <w:lang w:val="en-US" w:eastAsia="zh-TW"/>
+        </w:rPr>
+        <w:t>，然後在</w:t>
+      </w:r>
+      <w:r>
+        <w:rPr>
+          <w:rFonts w:hint="default" w:eastAsia="新細明體"/>
+          <w:lang w:val="en-US" w:eastAsia="zh-TW"/>
+        </w:rPr>
+        <w:t xml:space="preserve">component </w:t>
+      </w:r>
+      <w:r>
+        <w:rPr>
+          <w:rFonts w:hint="eastAsia" w:eastAsia="新細明體"/>
+          <w:lang w:val="en-US" w:eastAsia="zh-TW"/>
+        </w:rPr>
+        <w:t>中設計一個</w:t>
+      </w:r>
+      <w:r>
+        <w:rPr>
+          <w:rFonts w:hint="default" w:eastAsia="新細明體"/>
+          <w:lang w:val="en-US" w:eastAsia="zh-TW"/>
+        </w:rPr>
+        <w:t>function</w:t>
+      </w:r>
+      <w:r>
+        <w:rPr>
+          <w:rFonts w:hint="eastAsia" w:eastAsia="新細明體"/>
+          <w:lang w:val="en-US" w:eastAsia="zh-TW"/>
+        </w:rPr>
+        <w:t xml:space="preserve"> 把 </w:t>
+      </w:r>
+      <w:r>
+        <w:rPr>
+          <w:rFonts w:hint="default" w:eastAsia="新細明體"/>
+          <w:lang w:val="en-US" w:eastAsia="zh-TW"/>
+        </w:rPr>
+        <w:t>params</w:t>
+      </w:r>
+      <w:r>
+        <w:rPr>
+          <w:rFonts w:hint="eastAsia" w:eastAsia="新細明體"/>
+          <w:lang w:val="en-US" w:eastAsia="zh-TW"/>
+        </w:rPr>
+        <w:t xml:space="preserve"> 設計成呼叫此 </w:t>
+      </w:r>
+      <w:r>
+        <w:rPr>
+          <w:rFonts w:hint="default" w:eastAsia="新細明體"/>
+          <w:lang w:val="en-US" w:eastAsia="zh-TW"/>
+        </w:rPr>
+        <w:t xml:space="preserve">api </w:t>
+      </w:r>
+      <w:r>
+        <w:rPr>
+          <w:rFonts w:hint="eastAsia" w:eastAsia="新細明體"/>
+          <w:lang w:val="en-US" w:eastAsia="zh-TW"/>
+        </w:rPr>
+        <w:t xml:space="preserve">的 </w:t>
+      </w:r>
+      <w:r>
+        <w:rPr>
+          <w:rFonts w:hint="default" w:eastAsia="新細明體"/>
+          <w:lang w:val="en-US" w:eastAsia="zh-TW"/>
+        </w:rPr>
+        <w:t>url</w:t>
+      </w:r>
+      <w:r>
+        <w:rPr>
+          <w:rFonts w:hint="eastAsia" w:eastAsia="新細明體"/>
+          <w:lang w:val="en-US" w:eastAsia="zh-TW"/>
+        </w:rPr>
+        <w:t xml:space="preserve">，並且在 </w:t>
+      </w:r>
+      <w:r>
+        <w:rPr>
+          <w:rFonts w:hint="default" w:eastAsia="新細明體"/>
+          <w:lang w:val="en-US" w:eastAsia="zh-TW"/>
+        </w:rPr>
+        <w:t>page.tsx</w:t>
+      </w:r>
+      <w:r>
+        <w:rPr>
+          <w:rFonts w:hint="eastAsia" w:eastAsia="新細明體"/>
+          <w:lang w:val="en-US" w:eastAsia="zh-TW"/>
+        </w:rPr>
+        <w:t xml:space="preserve"> 中加上此 </w:t>
+      </w:r>
+      <w:r>
+        <w:rPr>
+          <w:rFonts w:hint="default" w:eastAsia="新細明體"/>
+          <w:lang w:val="en-US" w:eastAsia="zh-TW"/>
+        </w:rPr>
+        <w:t xml:space="preserve">component </w:t>
+      </w:r>
+      <w:r>
+        <w:rPr>
+          <w:rFonts w:hint="eastAsia" w:eastAsia="新細明體"/>
+          <w:lang w:val="en-US" w:eastAsia="zh-TW"/>
+        </w:rPr>
+        <w:t xml:space="preserve">的 </w:t>
+      </w:r>
+      <w:r>
+        <w:rPr>
+          <w:rFonts w:hint="default" w:eastAsia="新細明體"/>
+          <w:lang w:val="en-US" w:eastAsia="zh-TW"/>
+        </w:rPr>
+        <w:t>tag</w:t>
+      </w:r>
+      <w:r>
+        <w:rPr>
+          <w:rFonts w:hint="eastAsia" w:eastAsia="新細明體"/>
+          <w:lang w:val="en-US" w:eastAsia="zh-TW"/>
+        </w:rPr>
+        <w:t>，整體流程讓我更熟悉撰寫流程了</w:t>
       </w:r>
     </w:p>
     <w:p>
@@ -452,8 +923,10 @@
           <w:rFonts w:hint="default" w:eastAsia="新細明體"/>
           <w:lang w:val="en-US" w:eastAsia="zh-TW"/>
         </w:rPr>
-        <w:t>5/13</w:t>
-      </w:r>
+        <w:t>5/18</w:t>
+      </w:r>
+      <w:bookmarkStart w:id="0" w:name="_GoBack"/>
+      <w:bookmarkEnd w:id="0"/>
     </w:p>
     <w:p>
       <w:pPr>
@@ -461,7 +934,7 @@
         <w:widowControl w:val="0"/>
         <w:numPr>
           <w:ilvl w:val="0"/>
-          <w:numId w:val="3"/>
+          <w:numId w:val="4"/>
         </w:numPr>
         <w:spacing w:after="160" w:line="278" w:lineRule="auto"/>
         <w:ind w:left="420" w:leftChars="0" w:hanging="420" w:firstLineChars="0"/>
@@ -476,69 +949,7 @@
           <w:rFonts w:hint="eastAsia" w:eastAsia="新細明體"/>
           <w:lang w:val="en-US" w:eastAsia="zh-TW"/>
         </w:rPr>
-        <w:t>進度：</w:t>
-      </w:r>
-    </w:p>
-    <w:p>
-      <w:pPr>
-        <w:pStyle w:val="28"/>
-        <w:widowControl w:val="0"/>
-        <w:numPr>
-          <w:ilvl w:val="1"/>
-          <w:numId w:val="2"/>
-        </w:numPr>
-        <w:spacing w:after="160" w:line="278" w:lineRule="auto"/>
-        <w:ind w:left="840" w:leftChars="0" w:hanging="420" w:firstLineChars="0"/>
-        <w:contextualSpacing/>
-        <w:rPr>
-          <w:rFonts w:hint="default"/>
-          <w:lang w:val="en-US"/>
-        </w:rPr>
-      </w:pPr>
-      <w:r>
-        <w:rPr>
-          <w:rFonts w:hint="eastAsia" w:eastAsia="新細明體"/>
-          <w:lang w:val="en-US" w:eastAsia="zh-TW"/>
-        </w:rPr>
-        <w:t xml:space="preserve">加上 </w:t>
-      </w:r>
-      <w:r>
-        <w:rPr>
-          <w:rFonts w:hint="default" w:eastAsia="新細明體"/>
-          <w:lang w:val="en-US" w:eastAsia="zh-TW"/>
-        </w:rPr>
-        <w:t xml:space="preserve">navigate </w:t>
-      </w:r>
-      <w:r>
-        <w:rPr>
-          <w:rFonts w:hint="eastAsia" w:eastAsia="新細明體"/>
-          <w:lang w:val="en-US" w:eastAsia="zh-TW"/>
-        </w:rPr>
-        <w:t>的功能自動跳轉頁面</w:t>
-      </w:r>
-    </w:p>
-    <w:p>
-      <w:pPr>
-        <w:pStyle w:val="28"/>
-        <w:widowControl w:val="0"/>
-        <w:numPr>
-          <w:ilvl w:val="1"/>
-          <w:numId w:val="3"/>
-        </w:numPr>
-        <w:spacing w:after="160" w:line="278" w:lineRule="auto"/>
-        <w:ind w:left="840" w:leftChars="0" w:hanging="420" w:firstLineChars="0"/>
-        <w:contextualSpacing/>
-        <w:rPr>
-          <w:rFonts w:hint="default" w:eastAsia="新細明體"/>
-          <w:lang w:val="en-US" w:eastAsia="zh-TW"/>
-        </w:rPr>
-      </w:pPr>
-      <w:r>
-        <w:rPr>
-          <w:rFonts w:hint="eastAsia" w:eastAsia="新細明體"/>
-          <w:lang w:val="en-US" w:eastAsia="zh-TW"/>
-        </w:rPr>
-        <w:t xml:space="preserve">可以呈現 </w:t>
+        <w:t xml:space="preserve">上傳 </w:t>
       </w:r>
       <w:r>
         <w:rPr>
@@ -552,342 +963,21 @@
           <w:rFonts w:hint="eastAsia" w:eastAsia="新細明體"/>
           <w:lang w:val="en-US" w:eastAsia="zh-TW"/>
         </w:rPr>
-        <w:t>的內容</w:t>
-      </w:r>
-    </w:p>
-    <w:p>
-      <w:pPr>
-        <w:pStyle w:val="28"/>
-        <w:widowControl w:val="0"/>
-        <w:numPr>
-          <w:ilvl w:val="0"/>
-          <w:numId w:val="3"/>
-        </w:numPr>
-        <w:spacing w:after="160" w:line="278" w:lineRule="auto"/>
-        <w:ind w:left="420" w:leftChars="0" w:hanging="420" w:firstLineChars="0"/>
-        <w:contextualSpacing/>
-        <w:rPr>
-          <w:rFonts w:hint="default" w:eastAsia="新細明體"/>
-          <w:lang w:val="en-US" w:eastAsia="zh-TW"/>
-        </w:rPr>
-      </w:pPr>
-      <w:r>
-        <w:rPr>
-          <w:rFonts w:hint="eastAsia" w:eastAsia="新細明體"/>
-          <w:lang w:val="en-US" w:eastAsia="zh-TW"/>
-        </w:rPr>
-        <w:t>下次規劃：</w:t>
-      </w:r>
-    </w:p>
-    <w:p>
-      <w:pPr>
-        <w:pStyle w:val="28"/>
-        <w:widowControl w:val="0"/>
-        <w:numPr>
-          <w:ilvl w:val="1"/>
-          <w:numId w:val="3"/>
-        </w:numPr>
-        <w:spacing w:after="160" w:line="278" w:lineRule="auto"/>
-        <w:ind w:left="840" w:leftChars="0" w:hanging="420" w:firstLineChars="0"/>
-        <w:contextualSpacing/>
-        <w:rPr>
-          <w:rFonts w:hint="default" w:eastAsia="新細明體"/>
-          <w:lang w:val="en-US" w:eastAsia="zh-TW"/>
-        </w:rPr>
-      </w:pPr>
-      <w:r>
-        <w:rPr>
-          <w:rFonts w:hint="eastAsia" w:eastAsia="新細明體"/>
-          <w:lang w:val="en-US" w:eastAsia="zh-TW"/>
-        </w:rPr>
-        <w:t xml:space="preserve">優化首頁 </w:t>
-      </w:r>
-      <w:r>
-        <w:rPr>
-          <w:rFonts w:hint="default" w:eastAsia="新細明體"/>
-          <w:lang w:val="en-US" w:eastAsia="zh-TW"/>
-        </w:rPr>
-        <w:t>UI</w:t>
-      </w:r>
-    </w:p>
-    <w:p>
-      <w:pPr>
-        <w:pStyle w:val="28"/>
-        <w:widowControl w:val="0"/>
-        <w:numPr>
-          <w:ilvl w:val="1"/>
-          <w:numId w:val="3"/>
-        </w:numPr>
-        <w:spacing w:after="160" w:line="278" w:lineRule="auto"/>
-        <w:ind w:left="840" w:leftChars="0" w:hanging="420" w:firstLineChars="0"/>
-        <w:contextualSpacing/>
-        <w:rPr>
-          <w:rFonts w:hint="default" w:eastAsia="新細明體"/>
-          <w:lang w:val="en-US" w:eastAsia="zh-TW"/>
-        </w:rPr>
-      </w:pPr>
-      <w:r>
-        <w:rPr>
-          <w:rFonts w:hint="eastAsia" w:eastAsia="新細明體"/>
-          <w:lang w:val="en-US" w:eastAsia="zh-TW"/>
-        </w:rPr>
-        <w:t xml:space="preserve">讀取 </w:t>
-      </w:r>
-      <w:r>
-        <w:rPr>
-          <w:rFonts w:hint="default" w:eastAsia="新細明體"/>
-          <w:lang w:val="en-US" w:eastAsia="zh-TW"/>
-        </w:rPr>
-        <w:t xml:space="preserve">pdf </w:t>
-      </w:r>
-      <w:r>
-        <w:rPr>
-          <w:rFonts w:hint="eastAsia" w:eastAsia="新細明體"/>
-          <w:lang w:val="en-US" w:eastAsia="zh-TW"/>
-        </w:rPr>
-        <w:t>文字</w:t>
-      </w:r>
-    </w:p>
-    <w:p>
-      <w:pPr>
-        <w:pStyle w:val="28"/>
-        <w:widowControl w:val="0"/>
-        <w:numPr>
-          <w:ilvl w:val="1"/>
-          <w:numId w:val="3"/>
-        </w:numPr>
-        <w:spacing w:after="160" w:line="278" w:lineRule="auto"/>
-        <w:ind w:left="840" w:leftChars="0" w:hanging="420" w:firstLineChars="0"/>
-        <w:contextualSpacing/>
-        <w:rPr>
-          <w:rFonts w:hint="default" w:eastAsia="新細明體"/>
-          <w:lang w:val="en-US" w:eastAsia="zh-TW"/>
-        </w:rPr>
-      </w:pPr>
-      <w:r>
-        <w:rPr>
-          <w:rFonts w:hint="eastAsia" w:eastAsia="新細明體"/>
-          <w:lang w:val="en-US" w:eastAsia="zh-TW"/>
-        </w:rPr>
-        <w:t xml:space="preserve">導入 </w:t>
-      </w:r>
-      <w:r>
-        <w:rPr>
-          <w:rFonts w:hint="default" w:eastAsia="新細明體"/>
-          <w:lang w:val="en-US" w:eastAsia="zh-TW"/>
-        </w:rPr>
-        <w:t xml:space="preserve">AI </w:t>
-      </w:r>
-    </w:p>
-    <w:p>
-      <w:pPr>
-        <w:pStyle w:val="28"/>
-        <w:widowControl w:val="0"/>
-        <w:numPr>
-          <w:ilvl w:val="1"/>
-          <w:numId w:val="3"/>
-        </w:numPr>
-        <w:spacing w:after="160" w:line="278" w:lineRule="auto"/>
-        <w:ind w:left="840" w:leftChars="0" w:hanging="420" w:firstLineChars="0"/>
-        <w:contextualSpacing/>
-        <w:rPr>
-          <w:rFonts w:hint="default" w:eastAsia="新細明體"/>
-          <w:lang w:val="en-US" w:eastAsia="zh-TW"/>
-        </w:rPr>
-      </w:pPr>
-      <w:r>
-        <w:rPr>
-          <w:rFonts w:hint="eastAsia" w:eastAsia="新細明體"/>
-          <w:lang w:val="en-US" w:eastAsia="zh-TW"/>
-        </w:rPr>
-        <w:t xml:space="preserve">問題：這些 </w:t>
-      </w:r>
-      <w:r>
-        <w:rPr>
-          <w:rFonts w:hint="default" w:eastAsia="新細明體"/>
-          <w:lang w:val="en-US" w:eastAsia="zh-TW"/>
-        </w:rPr>
-        <w:t xml:space="preserve">pdf </w:t>
-      </w:r>
-      <w:r>
-        <w:rPr>
-          <w:rFonts w:hint="eastAsia" w:eastAsia="新細明體"/>
-          <w:lang w:val="en-US" w:eastAsia="zh-TW"/>
-        </w:rPr>
-        <w:t>有辦法存雲端嗎？目前是存本地</w:t>
-      </w:r>
-    </w:p>
-    <w:p>
-      <w:pPr>
-        <w:pStyle w:val="28"/>
-        <w:widowControl w:val="0"/>
-        <w:numPr>
-          <w:ilvl w:val="0"/>
-          <w:numId w:val="3"/>
-        </w:numPr>
-        <w:spacing w:after="160" w:line="278" w:lineRule="auto"/>
-        <w:ind w:left="420" w:leftChars="0" w:hanging="420" w:firstLineChars="0"/>
-        <w:contextualSpacing/>
-        <w:rPr>
-          <w:rFonts w:hint="default" w:eastAsia="新細明體"/>
-          <w:lang w:val="en-US" w:eastAsia="zh-TW"/>
-        </w:rPr>
-      </w:pPr>
-      <w:r>
-        <w:rPr>
-          <w:rFonts w:hint="eastAsia" w:eastAsia="新細明體"/>
-          <w:lang w:val="en-US" w:eastAsia="zh-TW"/>
-        </w:rPr>
-        <w:t>心得：</w:t>
-      </w:r>
-      <w:bookmarkStart w:id="0" w:name="_GoBack"/>
-      <w:bookmarkEnd w:id="0"/>
-      <w:r>
-        <w:rPr>
-          <w:rFonts w:hint="eastAsia" w:eastAsia="新細明體"/>
-          <w:lang w:val="en-US" w:eastAsia="zh-TW"/>
-        </w:rPr>
-        <w:t xml:space="preserve">今天把讀取 </w:t>
-      </w:r>
-      <w:r>
-        <w:rPr>
-          <w:rFonts w:hint="default" w:eastAsia="新細明體"/>
-          <w:lang w:val="en-US" w:eastAsia="zh-TW"/>
-        </w:rPr>
-        <w:t xml:space="preserve">pdf </w:t>
-      </w:r>
-      <w:r>
-        <w:rPr>
-          <w:rFonts w:hint="eastAsia" w:eastAsia="新細明體"/>
-          <w:lang w:val="en-US" w:eastAsia="zh-TW"/>
-        </w:rPr>
-        <w:t xml:space="preserve">並呈現出來的功能包成一個 </w:t>
-      </w:r>
-      <w:r>
-        <w:rPr>
-          <w:rFonts w:hint="default" w:eastAsia="新細明體"/>
-          <w:lang w:val="en-US" w:eastAsia="zh-TW"/>
-        </w:rPr>
-        <w:t>api</w:t>
-      </w:r>
-      <w:r>
-        <w:rPr>
-          <w:rFonts w:hint="eastAsia" w:eastAsia="新細明體"/>
-          <w:lang w:val="en-US" w:eastAsia="zh-TW"/>
-        </w:rPr>
-        <w:t>，然後在</w:t>
-      </w:r>
-      <w:r>
-        <w:rPr>
-          <w:rFonts w:hint="default" w:eastAsia="新細明體"/>
-          <w:lang w:val="en-US" w:eastAsia="zh-TW"/>
-        </w:rPr>
-        <w:t xml:space="preserve">component </w:t>
-      </w:r>
-      <w:r>
-        <w:rPr>
-          <w:rFonts w:hint="eastAsia" w:eastAsia="新細明體"/>
-          <w:lang w:val="en-US" w:eastAsia="zh-TW"/>
-        </w:rPr>
-        <w:t>中設計一個</w:t>
-      </w:r>
-      <w:r>
-        <w:rPr>
-          <w:rFonts w:hint="default" w:eastAsia="新細明體"/>
-          <w:lang w:val="en-US" w:eastAsia="zh-TW"/>
-        </w:rPr>
-        <w:t>function</w:t>
-      </w:r>
-      <w:r>
-        <w:rPr>
-          <w:rFonts w:hint="eastAsia" w:eastAsia="新細明體"/>
-          <w:lang w:val="en-US" w:eastAsia="zh-TW"/>
-        </w:rPr>
-        <w:t xml:space="preserve"> 把 </w:t>
-      </w:r>
-      <w:r>
-        <w:rPr>
-          <w:rFonts w:hint="default" w:eastAsia="新細明體"/>
-          <w:lang w:val="en-US" w:eastAsia="zh-TW"/>
-        </w:rPr>
-        <w:t>params</w:t>
-      </w:r>
-      <w:r>
-        <w:rPr>
-          <w:rFonts w:hint="eastAsia" w:eastAsia="新細明體"/>
-          <w:lang w:val="en-US" w:eastAsia="zh-TW"/>
-        </w:rPr>
-        <w:t xml:space="preserve"> 設計成呼叫此 </w:t>
-      </w:r>
-      <w:r>
-        <w:rPr>
-          <w:rFonts w:hint="default" w:eastAsia="新細明體"/>
-          <w:lang w:val="en-US" w:eastAsia="zh-TW"/>
-        </w:rPr>
-        <w:t xml:space="preserve">api </w:t>
-      </w:r>
-      <w:r>
-        <w:rPr>
-          <w:rFonts w:hint="eastAsia" w:eastAsia="新細明體"/>
-          <w:lang w:val="en-US" w:eastAsia="zh-TW"/>
-        </w:rPr>
-        <w:t xml:space="preserve">的 </w:t>
-      </w:r>
-      <w:r>
-        <w:rPr>
-          <w:rFonts w:hint="default" w:eastAsia="新細明體"/>
-          <w:lang w:val="en-US" w:eastAsia="zh-TW"/>
-        </w:rPr>
-        <w:t>url</w:t>
-      </w:r>
-      <w:r>
-        <w:rPr>
-          <w:rFonts w:hint="eastAsia" w:eastAsia="新細明體"/>
-          <w:lang w:val="en-US" w:eastAsia="zh-TW"/>
-        </w:rPr>
-        <w:t xml:space="preserve">，並且在 </w:t>
-      </w:r>
-      <w:r>
-        <w:rPr>
-          <w:rFonts w:hint="default" w:eastAsia="新細明體"/>
-          <w:lang w:val="en-US" w:eastAsia="zh-TW"/>
-        </w:rPr>
-        <w:t>page.tsx</w:t>
-      </w:r>
-      <w:r>
-        <w:rPr>
-          <w:rFonts w:hint="eastAsia" w:eastAsia="新細明體"/>
-          <w:lang w:val="en-US" w:eastAsia="zh-TW"/>
-        </w:rPr>
-        <w:t xml:space="preserve"> 中加上此 </w:t>
-      </w:r>
-      <w:r>
-        <w:rPr>
-          <w:rFonts w:hint="default" w:eastAsia="新細明體"/>
-          <w:lang w:val="en-US" w:eastAsia="zh-TW"/>
-        </w:rPr>
-        <w:t xml:space="preserve">component </w:t>
-      </w:r>
-      <w:r>
-        <w:rPr>
-          <w:rFonts w:hint="eastAsia" w:eastAsia="新細明體"/>
-          <w:lang w:val="en-US" w:eastAsia="zh-TW"/>
-        </w:rPr>
-        <w:t xml:space="preserve">的 </w:t>
-      </w:r>
-      <w:r>
-        <w:rPr>
-          <w:rFonts w:hint="default" w:eastAsia="新細明體"/>
-          <w:lang w:val="en-US" w:eastAsia="zh-TW"/>
-        </w:rPr>
-        <w:t>tag</w:t>
-      </w:r>
-      <w:r>
-        <w:rPr>
-          <w:rFonts w:hint="eastAsia" w:eastAsia="新細明體"/>
-          <w:lang w:val="en-US" w:eastAsia="zh-TW"/>
-        </w:rPr>
-        <w:t>，整體流程讓我更熟悉撰寫流程了</w:t>
+        <w:t xml:space="preserve">後可以把文字存到 </w:t>
+      </w:r>
+      <w:r>
+        <w:rPr>
+          <w:rFonts w:hint="default" w:eastAsia="新細明體"/>
+          <w:lang w:val="en-US" w:eastAsia="zh-TW"/>
+        </w:rPr>
+        <w:t>DB</w:t>
+      </w:r>
+      <w:r>
+        <w:rPr>
+          <w:rFonts w:hint="eastAsia" w:eastAsia="新細明體"/>
+          <w:lang w:val="en-US" w:eastAsia="zh-TW"/>
+        </w:rPr>
+        <w:t xml:space="preserve"> 裏</w:t>
       </w:r>
     </w:p>
     <w:sectPr>
@@ -1093,6 +1183,26 @@
     </w:lvl>
   </w:abstractNum>
   <w:abstractNum w:abstractNumId="1">
+    <w:nsid w:val="BFDA4B58"/>
+    <w:multiLevelType w:val="singleLevel"/>
+    <w:tmpl w:val="BFDA4B58"/>
+    <w:lvl w:ilvl="0" w:tentative="0">
+      <w:start w:val="1"/>
+      <w:numFmt w:val="bullet"/>
+      <w:lvlText w:val=""/>
+      <w:lvlJc w:val="left"/>
+      <w:pPr>
+        <w:tabs>
+          <w:tab w:val="left" w:pos="420"/>
+        </w:tabs>
+        <w:ind w:left="420" w:leftChars="0" w:hanging="420" w:firstLineChars="0"/>
+      </w:pPr>
+      <w:rPr>
+        <w:rFonts w:hint="default" w:ascii="Wingdings" w:hAnsi="Wingdings"/>
+      </w:rPr>
+    </w:lvl>
+  </w:abstractNum>
+  <w:abstractNum w:abstractNumId="2">
     <w:nsid w:val="FFFBD9F0"/>
     <w:multiLevelType w:val="multilevel"/>
     <w:tmpl w:val="FFFBD9F0"/>
@@ -1232,7 +1342,7 @@
       </w:rPr>
     </w:lvl>
   </w:abstractNum>
-  <w:abstractNum w:abstractNumId="2">
+  <w:abstractNum w:abstractNumId="3">
     <w:nsid w:val="0B3C2EF0"/>
     <w:multiLevelType w:val="multilevel"/>
     <w:tmpl w:val="0B3C2EF0"/>
@@ -1346,12 +1456,15 @@
     </w:lvl>
   </w:abstractNum>
   <w:num w:numId="1">
-    <w:abstractNumId w:val="2"/>
+    <w:abstractNumId w:val="3"/>
   </w:num>
   <w:num w:numId="2">
     <w:abstractNumId w:val="0"/>
   </w:num>
   <w:num w:numId="3">
+    <w:abstractNumId w:val="2"/>
+  </w:num>
+  <w:num w:numId="4">
     <w:abstractNumId w:val="1"/>
   </w:num>
 </w:numbering>

</xml_diff>

<commit_message>
feat: add summary generation API and integrate Anthropic SDK
</commit_message>
<xml_diff>
--- a/日記.docx
+++ b/日記.docx
@@ -83,24 +83,886 @@
           <w:ilvl w:val="0"/>
           <w:numId w:val="1"/>
         </w:numPr>
+      </w:pPr>
+      <w:r>
         <w:rPr>
           <w:rFonts w:hint="eastAsia"/>
         </w:rPr>
-      </w:pPr>
+        <w:t>心得：</w:t>
+      </w:r>
+      <w:r>
+        <w:t>prisma</w:t>
+      </w:r>
       <w:r>
         <w:rPr>
           <w:rFonts w:hint="eastAsia"/>
         </w:rPr>
+        <w:t>好酷，可以直接線上編輯，看到檔案上傳後資料庫也更新就好感動</w:t>
+      </w:r>
+    </w:p>
+    <w:p>
+      <w:pPr>
+        <w:pStyle w:val="28"/>
+        <w:ind w:left="0"/>
+      </w:pPr>
+    </w:p>
+    <w:p>
+      <w:pPr>
+        <w:pStyle w:val="28"/>
+        <w:ind w:left="0"/>
+      </w:pPr>
+      <w:r>
+        <w:t>5/12</w:t>
+      </w:r>
+    </w:p>
+    <w:p>
+      <w:pPr>
+        <w:pStyle w:val="28"/>
+        <w:numPr>
+          <w:ilvl w:val="0"/>
+          <w:numId w:val="2"/>
+        </w:numPr>
+      </w:pPr>
+      <w:r>
+        <w:rPr>
+          <w:rFonts w:hint="eastAsia" w:eastAsia="新細明體"/>
+        </w:rPr>
+        <w:t xml:space="preserve">進度：寫 </w:t>
+      </w:r>
+      <w:r>
+        <w:rPr>
+          <w:rFonts w:eastAsia="新細明體"/>
+        </w:rPr>
+        <w:t xml:space="preserve">upload </w:t>
+      </w:r>
+      <w:r>
+        <w:rPr>
+          <w:rFonts w:hint="eastAsia" w:eastAsia="新細明體"/>
+        </w:rPr>
+        <w:t xml:space="preserve">完後要進入該 </w:t>
+      </w:r>
+      <w:r>
+        <w:rPr>
+          <w:rFonts w:eastAsia="新細明體"/>
+        </w:rPr>
+        <w:t xml:space="preserve">document </w:t>
+      </w:r>
+      <w:r>
+        <w:rPr>
+          <w:rFonts w:hint="eastAsia" w:eastAsia="新細明體"/>
+        </w:rPr>
+        <w:t xml:space="preserve">的頁面的 </w:t>
+      </w:r>
+      <w:r>
+        <w:rPr>
+          <w:rFonts w:eastAsia="新細明體"/>
+        </w:rPr>
+        <w:t>api</w:t>
+      </w:r>
+    </w:p>
+    <w:p>
+      <w:pPr>
+        <w:pStyle w:val="28"/>
+        <w:numPr>
+          <w:ilvl w:val="0"/>
+          <w:numId w:val="2"/>
+        </w:numPr>
+      </w:pPr>
+      <w:r>
+        <w:rPr>
+          <w:rFonts w:hint="eastAsia" w:eastAsia="新細明體"/>
+        </w:rPr>
+        <w:t>下次規劃：</w:t>
+      </w:r>
+    </w:p>
+    <w:p>
+      <w:pPr>
+        <w:pStyle w:val="28"/>
+        <w:numPr>
+          <w:ilvl w:val="1"/>
+          <w:numId w:val="2"/>
+        </w:numPr>
+      </w:pPr>
+      <w:r>
+        <w:rPr>
+          <w:rFonts w:hint="eastAsia" w:eastAsia="新細明體"/>
+        </w:rPr>
+        <w:t xml:space="preserve">可以加速撰寫速度，要加上 </w:t>
+      </w:r>
+      <w:r>
+        <w:rPr>
+          <w:rFonts w:eastAsia="新細明體"/>
+        </w:rPr>
+        <w:t xml:space="preserve">navigate </w:t>
+      </w:r>
+      <w:r>
+        <w:rPr>
+          <w:rFonts w:hint="eastAsia" w:eastAsia="新細明體"/>
+        </w:rPr>
+        <w:t>的功能自動跳轉頁面</w:t>
+      </w:r>
+    </w:p>
+    <w:p>
+      <w:pPr>
+        <w:pStyle w:val="28"/>
+        <w:numPr>
+          <w:ilvl w:val="1"/>
+          <w:numId w:val="2"/>
+        </w:numPr>
+      </w:pPr>
+      <w:r>
+        <w:rPr>
+          <w:rFonts w:hint="eastAsia" w:eastAsia="新細明體"/>
+        </w:rPr>
+        <w:t xml:space="preserve">開始寫讀取 </w:t>
+      </w:r>
+      <w:r>
+        <w:rPr>
+          <w:rFonts w:eastAsia="新細明體"/>
+        </w:rPr>
+        <w:t xml:space="preserve">pdf </w:t>
+      </w:r>
+      <w:r>
+        <w:rPr>
+          <w:rFonts w:hint="eastAsia" w:eastAsia="新細明體"/>
+        </w:rPr>
+        <w:t>文字內容的功能</w:t>
+      </w:r>
+    </w:p>
+    <w:p>
+      <w:pPr>
+        <w:pStyle w:val="28"/>
+        <w:numPr>
+          <w:ilvl w:val="1"/>
+          <w:numId w:val="2"/>
+        </w:numPr>
+      </w:pPr>
+      <w:r>
+        <w:rPr>
+          <w:rFonts w:hint="eastAsia" w:eastAsia="新細明體"/>
+        </w:rPr>
+        <w:t xml:space="preserve">優化目前的 </w:t>
+      </w:r>
+      <w:r>
+        <w:rPr>
+          <w:rFonts w:eastAsia="新細明體"/>
+        </w:rPr>
+        <w:t>UI</w:t>
+      </w:r>
+    </w:p>
+    <w:p>
+      <w:pPr>
+        <w:pStyle w:val="28"/>
+        <w:numPr>
+          <w:ilvl w:val="0"/>
+          <w:numId w:val="2"/>
+        </w:numPr>
+      </w:pPr>
+      <w:r>
+        <w:rPr>
+          <w:rFonts w:hint="eastAsia" w:eastAsia="新細明體"/>
+        </w:rPr>
         <w:t>心得：</w:t>
       </w:r>
       <w:r>
-        <w:t>prisma</w:t>
-      </w:r>
-      <w:r>
-        <w:rPr>
-          <w:rFonts w:hint="eastAsia"/>
-        </w:rPr>
-        <w:t>好酷，可以直接線上編輯，看到檔案上傳後資料庫也更新就好感動</w:t>
+        <w:rPr>
+          <w:rFonts w:eastAsia="新細明體"/>
+        </w:rPr>
+        <w:t xml:space="preserve">params </w:t>
+      </w:r>
+      <w:r>
+        <w:rPr>
+          <w:rFonts w:hint="eastAsia" w:eastAsia="新細明體"/>
+        </w:rPr>
+        <w:t xml:space="preserve">在新版 </w:t>
+      </w:r>
+      <w:r>
+        <w:rPr>
+          <w:rFonts w:eastAsia="新細明體"/>
+        </w:rPr>
+        <w:t xml:space="preserve">ts </w:t>
+      </w:r>
+      <w:r>
+        <w:rPr>
+          <w:rFonts w:hint="eastAsia" w:eastAsia="新細明體"/>
+        </w:rPr>
+        <w:t xml:space="preserve">都改成 </w:t>
+      </w:r>
+      <w:r>
+        <w:rPr>
+          <w:rFonts w:eastAsia="新細明體"/>
+        </w:rPr>
+        <w:t>promise</w:t>
+      </w:r>
+      <w:r>
+        <w:rPr>
+          <w:rFonts w:hint="eastAsia" w:eastAsia="新細明體"/>
+        </w:rPr>
+        <w:t xml:space="preserve">，所以需要 </w:t>
+      </w:r>
+      <w:r>
+        <w:rPr>
+          <w:rFonts w:eastAsia="新細明體"/>
+        </w:rPr>
+        <w:t xml:space="preserve">await </w:t>
+      </w:r>
+      <w:r>
+        <w:rPr>
+          <w:rFonts w:hint="eastAsia" w:eastAsia="新細明體"/>
+        </w:rPr>
+        <w:t>才能呼叫</w:t>
+      </w:r>
+    </w:p>
+    <w:p>
+      <w:pPr>
+        <w:pStyle w:val="28"/>
+        <w:tabs>
+          <w:tab w:val="left" w:pos="420"/>
+        </w:tabs>
+        <w:ind w:left="0"/>
+        <w:rPr>
+          <w:rFonts w:eastAsia="新細明體"/>
+        </w:rPr>
+      </w:pPr>
+    </w:p>
+    <w:p>
+      <w:pPr>
+        <w:pStyle w:val="28"/>
+        <w:tabs>
+          <w:tab w:val="left" w:pos="420"/>
+        </w:tabs>
+        <w:ind w:left="0"/>
+        <w:rPr>
+          <w:rFonts w:eastAsia="新細明體"/>
+        </w:rPr>
+      </w:pPr>
+      <w:r>
+        <w:rPr>
+          <w:rFonts w:eastAsia="新細明體"/>
+        </w:rPr>
+        <w:t>5/13</w:t>
+      </w:r>
+    </w:p>
+    <w:p>
+      <w:pPr>
+        <w:pStyle w:val="28"/>
+        <w:numPr>
+          <w:ilvl w:val="0"/>
+          <w:numId w:val="3"/>
+        </w:numPr>
+        <w:rPr>
+          <w:rFonts w:eastAsia="新細明體"/>
+        </w:rPr>
+      </w:pPr>
+      <w:r>
+        <w:rPr>
+          <w:rFonts w:hint="eastAsia" w:eastAsia="新細明體"/>
+        </w:rPr>
+        <w:t>進度：</w:t>
+      </w:r>
+    </w:p>
+    <w:p>
+      <w:pPr>
+        <w:pStyle w:val="28"/>
+        <w:numPr>
+          <w:ilvl w:val="1"/>
+          <w:numId w:val="2"/>
+        </w:numPr>
+      </w:pPr>
+      <w:r>
+        <w:rPr>
+          <w:rFonts w:hint="eastAsia" w:eastAsia="新細明體"/>
+        </w:rPr>
+        <w:t xml:space="preserve">加上 </w:t>
+      </w:r>
+      <w:r>
+        <w:rPr>
+          <w:rFonts w:eastAsia="新細明體"/>
+        </w:rPr>
+        <w:t xml:space="preserve">navigate </w:t>
+      </w:r>
+      <w:r>
+        <w:rPr>
+          <w:rFonts w:hint="eastAsia" w:eastAsia="新細明體"/>
+        </w:rPr>
+        <w:t>的功能自動跳轉頁面</w:t>
+      </w:r>
+    </w:p>
+    <w:p>
+      <w:pPr>
+        <w:pStyle w:val="28"/>
+        <w:numPr>
+          <w:ilvl w:val="1"/>
+          <w:numId w:val="3"/>
+        </w:numPr>
+        <w:rPr>
+          <w:rFonts w:eastAsia="新細明體"/>
+        </w:rPr>
+      </w:pPr>
+      <w:r>
+        <w:rPr>
+          <w:rFonts w:hint="eastAsia" w:eastAsia="新細明體"/>
+        </w:rPr>
+        <w:t xml:space="preserve">可以呈現 </w:t>
+      </w:r>
+      <w:r>
+        <w:rPr>
+          <w:rFonts w:eastAsia="新細明體"/>
+        </w:rPr>
+        <w:t xml:space="preserve">pdf </w:t>
+      </w:r>
+      <w:r>
+        <w:rPr>
+          <w:rFonts w:hint="eastAsia" w:eastAsia="新細明體"/>
+        </w:rPr>
+        <w:t>的內容</w:t>
+      </w:r>
+    </w:p>
+    <w:p>
+      <w:pPr>
+        <w:pStyle w:val="28"/>
+        <w:numPr>
+          <w:ilvl w:val="0"/>
+          <w:numId w:val="3"/>
+        </w:numPr>
+        <w:rPr>
+          <w:rFonts w:eastAsia="新細明體"/>
+        </w:rPr>
+      </w:pPr>
+      <w:r>
+        <w:rPr>
+          <w:rFonts w:hint="eastAsia" w:eastAsia="新細明體"/>
+        </w:rPr>
+        <w:t>下次規劃：</w:t>
+      </w:r>
+    </w:p>
+    <w:p>
+      <w:pPr>
+        <w:pStyle w:val="28"/>
+        <w:numPr>
+          <w:ilvl w:val="1"/>
+          <w:numId w:val="3"/>
+        </w:numPr>
+        <w:rPr>
+          <w:rFonts w:eastAsia="新細明體"/>
+        </w:rPr>
+      </w:pPr>
+      <w:r>
+        <w:rPr>
+          <w:rFonts w:hint="eastAsia" w:eastAsia="新細明體"/>
+        </w:rPr>
+        <w:t xml:space="preserve">優化首頁 </w:t>
+      </w:r>
+      <w:r>
+        <w:rPr>
+          <w:rFonts w:eastAsia="新細明體"/>
+        </w:rPr>
+        <w:t>UI</w:t>
+      </w:r>
+    </w:p>
+    <w:p>
+      <w:pPr>
+        <w:pStyle w:val="28"/>
+        <w:numPr>
+          <w:ilvl w:val="1"/>
+          <w:numId w:val="3"/>
+        </w:numPr>
+        <w:rPr>
+          <w:rFonts w:eastAsia="新細明體"/>
+        </w:rPr>
+      </w:pPr>
+      <w:r>
+        <w:rPr>
+          <w:rFonts w:hint="eastAsia" w:eastAsia="新細明體"/>
+        </w:rPr>
+        <w:t xml:space="preserve">讀取 </w:t>
+      </w:r>
+      <w:r>
+        <w:rPr>
+          <w:rFonts w:eastAsia="新細明體"/>
+        </w:rPr>
+        <w:t xml:space="preserve">pdf </w:t>
+      </w:r>
+      <w:r>
+        <w:rPr>
+          <w:rFonts w:hint="eastAsia" w:eastAsia="新細明體"/>
+        </w:rPr>
+        <w:t>文字</w:t>
+      </w:r>
+    </w:p>
+    <w:p>
+      <w:pPr>
+        <w:pStyle w:val="28"/>
+        <w:numPr>
+          <w:ilvl w:val="1"/>
+          <w:numId w:val="3"/>
+        </w:numPr>
+        <w:rPr>
+          <w:rFonts w:eastAsia="新細明體"/>
+        </w:rPr>
+      </w:pPr>
+      <w:r>
+        <w:rPr>
+          <w:rFonts w:hint="eastAsia" w:eastAsia="新細明體"/>
+        </w:rPr>
+        <w:t xml:space="preserve">導入 </w:t>
+      </w:r>
+      <w:r>
+        <w:rPr>
+          <w:rFonts w:eastAsia="新細明體"/>
+        </w:rPr>
+        <w:t xml:space="preserve">AI </w:t>
+      </w:r>
+    </w:p>
+    <w:p>
+      <w:pPr>
+        <w:pStyle w:val="28"/>
+        <w:numPr>
+          <w:ilvl w:val="1"/>
+          <w:numId w:val="3"/>
+        </w:numPr>
+        <w:rPr>
+          <w:rFonts w:eastAsia="新細明體"/>
+        </w:rPr>
+      </w:pPr>
+      <w:r>
+        <w:rPr>
+          <w:rFonts w:hint="eastAsia" w:eastAsia="新細明體"/>
+        </w:rPr>
+        <w:t xml:space="preserve">問題：這些 </w:t>
+      </w:r>
+      <w:r>
+        <w:rPr>
+          <w:rFonts w:eastAsia="新細明體"/>
+        </w:rPr>
+        <w:t xml:space="preserve">pdf </w:t>
+      </w:r>
+      <w:r>
+        <w:rPr>
+          <w:rFonts w:hint="eastAsia" w:eastAsia="新細明體"/>
+        </w:rPr>
+        <w:t>有辦法存雲端嗎？目前是存本地</w:t>
+      </w:r>
+    </w:p>
+    <w:p>
+      <w:pPr>
+        <w:pStyle w:val="28"/>
+        <w:numPr>
+          <w:ilvl w:val="0"/>
+          <w:numId w:val="3"/>
+        </w:numPr>
+        <w:rPr>
+          <w:rFonts w:eastAsia="新細明體"/>
+        </w:rPr>
+      </w:pPr>
+      <w:r>
+        <w:rPr>
+          <w:rFonts w:hint="eastAsia" w:eastAsia="新細明體"/>
+        </w:rPr>
+        <w:t xml:space="preserve">心得：今天把讀取 </w:t>
+      </w:r>
+      <w:r>
+        <w:rPr>
+          <w:rFonts w:eastAsia="新細明體"/>
+        </w:rPr>
+        <w:t xml:space="preserve">pdf </w:t>
+      </w:r>
+      <w:r>
+        <w:rPr>
+          <w:rFonts w:hint="eastAsia" w:eastAsia="新細明體"/>
+        </w:rPr>
+        <w:t xml:space="preserve">並呈現出來的功能包成一個 </w:t>
+      </w:r>
+      <w:r>
+        <w:rPr>
+          <w:rFonts w:eastAsia="新細明體"/>
+        </w:rPr>
+        <w:t>api</w:t>
+      </w:r>
+      <w:r>
+        <w:rPr>
+          <w:rFonts w:hint="eastAsia" w:eastAsia="新細明體"/>
+        </w:rPr>
+        <w:t>，然後在</w:t>
+      </w:r>
+      <w:r>
+        <w:rPr>
+          <w:rFonts w:eastAsia="新細明體"/>
+        </w:rPr>
+        <w:t xml:space="preserve">component </w:t>
+      </w:r>
+      <w:r>
+        <w:rPr>
+          <w:rFonts w:hint="eastAsia" w:eastAsia="新細明體"/>
+        </w:rPr>
+        <w:t>中設計一個</w:t>
+      </w:r>
+      <w:r>
+        <w:rPr>
+          <w:rFonts w:eastAsia="新細明體"/>
+        </w:rPr>
+        <w:t>function</w:t>
+      </w:r>
+      <w:r>
+        <w:rPr>
+          <w:rFonts w:hint="eastAsia" w:eastAsia="新細明體"/>
+        </w:rPr>
+        <w:t xml:space="preserve"> 把 </w:t>
+      </w:r>
+      <w:r>
+        <w:rPr>
+          <w:rFonts w:eastAsia="新細明體"/>
+        </w:rPr>
+        <w:t>params</w:t>
+      </w:r>
+      <w:r>
+        <w:rPr>
+          <w:rFonts w:hint="eastAsia" w:eastAsia="新細明體"/>
+        </w:rPr>
+        <w:t xml:space="preserve"> 設計成呼叫此 </w:t>
+      </w:r>
+      <w:r>
+        <w:rPr>
+          <w:rFonts w:eastAsia="新細明體"/>
+        </w:rPr>
+        <w:t xml:space="preserve">api </w:t>
+      </w:r>
+      <w:r>
+        <w:rPr>
+          <w:rFonts w:hint="eastAsia" w:eastAsia="新細明體"/>
+        </w:rPr>
+        <w:t xml:space="preserve">的 </w:t>
+      </w:r>
+      <w:r>
+        <w:rPr>
+          <w:rFonts w:eastAsia="新細明體"/>
+        </w:rPr>
+        <w:t>url</w:t>
+      </w:r>
+      <w:r>
+        <w:rPr>
+          <w:rFonts w:hint="eastAsia" w:eastAsia="新細明體"/>
+        </w:rPr>
+        <w:t xml:space="preserve">，並且在 </w:t>
+      </w:r>
+      <w:r>
+        <w:rPr>
+          <w:rFonts w:eastAsia="新細明體"/>
+        </w:rPr>
+        <w:t>page.tsx</w:t>
+      </w:r>
+      <w:r>
+        <w:rPr>
+          <w:rFonts w:hint="eastAsia" w:eastAsia="新細明體"/>
+        </w:rPr>
+        <w:t xml:space="preserve"> 中加上此 </w:t>
+      </w:r>
+      <w:r>
+        <w:rPr>
+          <w:rFonts w:eastAsia="新細明體"/>
+        </w:rPr>
+        <w:t xml:space="preserve">component </w:t>
+      </w:r>
+      <w:r>
+        <w:rPr>
+          <w:rFonts w:hint="eastAsia" w:eastAsia="新細明體"/>
+        </w:rPr>
+        <w:t xml:space="preserve">的 </w:t>
+      </w:r>
+      <w:r>
+        <w:rPr>
+          <w:rFonts w:eastAsia="新細明體"/>
+        </w:rPr>
+        <w:t>tag</w:t>
+      </w:r>
+      <w:r>
+        <w:rPr>
+          <w:rFonts w:hint="eastAsia" w:eastAsia="新細明體"/>
+        </w:rPr>
+        <w:t>，整體流程讓我更熟悉撰寫流程了</w:t>
+      </w:r>
+    </w:p>
+    <w:p>
+      <w:pPr>
+        <w:pStyle w:val="28"/>
+        <w:tabs>
+          <w:tab w:val="left" w:pos="420"/>
+        </w:tabs>
+        <w:ind w:left="0"/>
+        <w:rPr>
+          <w:rFonts w:eastAsia="新細明體"/>
+        </w:rPr>
+      </w:pPr>
+    </w:p>
+    <w:p>
+      <w:pPr>
+        <w:pStyle w:val="28"/>
+        <w:tabs>
+          <w:tab w:val="left" w:pos="420"/>
+        </w:tabs>
+        <w:ind w:left="0"/>
+        <w:rPr>
+          <w:rFonts w:eastAsia="新細明體"/>
+        </w:rPr>
+      </w:pPr>
+      <w:r>
+        <w:rPr>
+          <w:rFonts w:eastAsia="新細明體"/>
+        </w:rPr>
+        <w:t>5/18</w:t>
+      </w:r>
+    </w:p>
+    <w:p>
+      <w:pPr>
+        <w:pStyle w:val="28"/>
+        <w:numPr>
+          <w:ilvl w:val="0"/>
+          <w:numId w:val="4"/>
+        </w:numPr>
+        <w:rPr>
+          <w:rFonts w:eastAsia="新細明體"/>
+        </w:rPr>
+      </w:pPr>
+      <w:r>
+        <w:rPr>
+          <w:rFonts w:hint="eastAsia" w:eastAsia="新細明體"/>
+        </w:rPr>
+        <w:t xml:space="preserve">上傳 </w:t>
+      </w:r>
+      <w:r>
+        <w:rPr>
+          <w:rFonts w:eastAsia="新細明體"/>
+        </w:rPr>
+        <w:t xml:space="preserve">pdf </w:t>
+      </w:r>
+      <w:r>
+        <w:rPr>
+          <w:rFonts w:hint="eastAsia" w:eastAsia="新細明體"/>
+        </w:rPr>
+        <w:t xml:space="preserve">後可以把文字存到 </w:t>
+      </w:r>
+      <w:r>
+        <w:rPr>
+          <w:rFonts w:eastAsia="新細明體"/>
+        </w:rPr>
+        <w:t>DB</w:t>
+      </w:r>
+      <w:r>
+        <w:rPr>
+          <w:rFonts w:hint="eastAsia" w:eastAsia="新細明體"/>
+        </w:rPr>
+        <w:t xml:space="preserve"> 裏</w:t>
+      </w:r>
+    </w:p>
+    <w:p>
+      <w:pPr>
+        <w:rPr>
+          <w:rFonts w:eastAsia="新細明體"/>
+        </w:rPr>
+      </w:pPr>
+      <w:r>
+        <w:rPr>
+          <w:rFonts w:eastAsia="新細明體"/>
+        </w:rPr>
+        <w:t>5/19</w:t>
+      </w:r>
+    </w:p>
+    <w:p>
+      <w:pPr>
+        <w:pStyle w:val="28"/>
+        <w:numPr>
+          <w:ilvl w:val="0"/>
+          <w:numId w:val="5"/>
+        </w:numPr>
+        <w:rPr>
+          <w:rFonts w:eastAsia="新細明體"/>
+        </w:rPr>
+      </w:pPr>
+      <w:r>
+        <w:rPr>
+          <w:rFonts w:hint="eastAsia" w:eastAsia="新細明體"/>
+        </w:rPr>
+        <w:t>進度：</w:t>
+      </w:r>
+    </w:p>
+    <w:p>
+      <w:pPr>
+        <w:pStyle w:val="28"/>
+        <w:numPr>
+          <w:ilvl w:val="1"/>
+          <w:numId w:val="5"/>
+        </w:numPr>
+        <w:rPr>
+          <w:rFonts w:eastAsia="新細明體"/>
+        </w:rPr>
+      </w:pPr>
+      <w:r>
+        <w:rPr>
+          <w:rFonts w:hint="eastAsia" w:eastAsia="新細明體"/>
+        </w:rPr>
+        <w:t xml:space="preserve">嘗試導入 </w:t>
+      </w:r>
+      <w:r>
+        <w:rPr>
+          <w:rFonts w:eastAsia="新細明體"/>
+        </w:rPr>
+        <w:t xml:space="preserve">AI </w:t>
+      </w:r>
+      <w:r>
+        <w:rPr>
+          <w:rFonts w:hint="eastAsia" w:eastAsia="新細明體"/>
+        </w:rPr>
+        <w:t xml:space="preserve">，但因為 </w:t>
+      </w:r>
+      <w:r>
+        <w:rPr>
+          <w:rFonts w:eastAsia="新細明體"/>
+        </w:rPr>
+        <w:t xml:space="preserve">API Key </w:t>
+      </w:r>
+      <w:r>
+        <w:rPr>
+          <w:rFonts w:hint="eastAsia" w:eastAsia="新細明體"/>
+        </w:rPr>
+        <w:t>的問題還沒處理好，所以沒成功</w:t>
+      </w:r>
+    </w:p>
+    <w:p>
+      <w:pPr>
+        <w:pStyle w:val="28"/>
+        <w:numPr>
+          <w:ilvl w:val="0"/>
+          <w:numId w:val="5"/>
+        </w:numPr>
+        <w:rPr>
+          <w:rFonts w:eastAsia="新細明體"/>
+        </w:rPr>
+      </w:pPr>
+      <w:r>
+        <w:rPr>
+          <w:rFonts w:hint="eastAsia" w:eastAsia="新細明體"/>
+        </w:rPr>
+        <w:t>下次規劃：</w:t>
+      </w:r>
+    </w:p>
+    <w:p>
+      <w:pPr>
+        <w:pStyle w:val="28"/>
+        <w:numPr>
+          <w:ilvl w:val="1"/>
+          <w:numId w:val="5"/>
+        </w:numPr>
+        <w:rPr>
+          <w:rFonts w:eastAsia="新細明體"/>
+        </w:rPr>
+      </w:pPr>
+      <w:r>
+        <w:rPr>
+          <w:rFonts w:hint="eastAsia" w:eastAsia="新細明體"/>
+        </w:rPr>
+        <w:t xml:space="preserve">把 </w:t>
+      </w:r>
+      <w:r>
+        <w:rPr>
+          <w:rFonts w:eastAsia="新細明體"/>
+        </w:rPr>
+        <w:t xml:space="preserve">AI API key </w:t>
+      </w:r>
+      <w:r>
+        <w:rPr>
+          <w:rFonts w:hint="eastAsia" w:eastAsia="新細明體"/>
+        </w:rPr>
+        <w:t xml:space="preserve">處理好，並且寫好 </w:t>
+      </w:r>
+      <w:r>
+        <w:rPr>
+          <w:rFonts w:eastAsia="新細明體"/>
+        </w:rPr>
+        <w:t>lib/ai.ts</w:t>
+      </w:r>
+      <w:r>
+        <w:rPr>
+          <w:rFonts w:hint="eastAsia" w:eastAsia="新細明體"/>
+        </w:rPr>
+        <w:t xml:space="preserve"> 去建立完整 </w:t>
+      </w:r>
+      <w:r>
+        <w:rPr>
+          <w:rFonts w:eastAsia="新細明體"/>
+        </w:rPr>
+        <w:t xml:space="preserve">client </w:t>
+      </w:r>
+      <w:r>
+        <w:rPr>
+          <w:rFonts w:hint="eastAsia" w:eastAsia="新細明體"/>
+        </w:rPr>
+        <w:t xml:space="preserve">並讓此 </w:t>
+      </w:r>
+      <w:r>
+        <w:rPr>
+          <w:rFonts w:eastAsia="新細明體"/>
+        </w:rPr>
+        <w:t xml:space="preserve">client </w:t>
+      </w:r>
+      <w:r>
+        <w:rPr>
+          <w:rFonts w:hint="eastAsia" w:eastAsia="新細明體"/>
+        </w:rPr>
+        <w:t xml:space="preserve">可以接收 </w:t>
+      </w:r>
+      <w:r>
+        <w:rPr>
+          <w:rFonts w:eastAsia="新細明體"/>
+        </w:rPr>
+        <w:t xml:space="preserve">pdf text </w:t>
+      </w:r>
+      <w:r>
+        <w:rPr>
+          <w:rFonts w:hint="eastAsia" w:eastAsia="新細明體"/>
+        </w:rPr>
+        <w:t xml:space="preserve">當作 </w:t>
+      </w:r>
+      <w:r>
+        <w:rPr>
+          <w:rFonts w:eastAsia="新細明體"/>
+        </w:rPr>
+        <w:t>prompt</w:t>
+      </w:r>
+      <w:r>
+        <w:rPr>
+          <w:rFonts w:hint="eastAsia" w:eastAsia="新細明體"/>
+        </w:rPr>
+        <w:t xml:space="preserve">，並研究如何加入 </w:t>
+      </w:r>
+      <w:r>
+        <w:rPr>
+          <w:rFonts w:eastAsia="新細明體"/>
+        </w:rPr>
+        <w:t>system prompt</w:t>
+      </w:r>
+      <w:r>
+        <w:rPr>
+          <w:rFonts w:hint="eastAsia" w:eastAsia="新細明體"/>
+        </w:rPr>
+        <w:t>。</w:t>
+      </w:r>
+    </w:p>
+    <w:p>
+      <w:pPr>
+        <w:pStyle w:val="28"/>
+        <w:numPr>
+          <w:ilvl w:val="1"/>
+          <w:numId w:val="5"/>
+        </w:numPr>
+        <w:rPr>
+          <w:rFonts w:hint="eastAsia" w:eastAsia="新細明體"/>
+        </w:rPr>
+      </w:pPr>
+      <w:r>
+        <w:rPr>
+          <w:rFonts w:hint="eastAsia" w:eastAsia="新細明體"/>
+        </w:rPr>
+        <w:t>前端要能顯示每一頁的摘要</w:t>
       </w:r>
     </w:p>
     <w:p>
@@ -108,13 +970,12 @@
         <w:pStyle w:val="28"/>
         <w:widowControl w:val="0"/>
         <w:numPr>
-          <w:ilvl w:val="0"/>
           <w:numId w:val="0"/>
         </w:numPr>
         <w:spacing w:after="160" w:line="278" w:lineRule="auto"/>
         <w:contextualSpacing/>
         <w:rPr>
-          <w:rFonts w:hint="eastAsia"/>
+          <w:rFonts w:hint="eastAsia" w:eastAsia="新細明體"/>
         </w:rPr>
       </w:pPr>
     </w:p>
@@ -123,38 +984,36 @@
         <w:pStyle w:val="28"/>
         <w:widowControl w:val="0"/>
         <w:numPr>
+          <w:numId w:val="0"/>
+        </w:numPr>
+        <w:spacing w:after="160" w:line="278" w:lineRule="auto"/>
+        <w:contextualSpacing/>
+        <w:rPr>
+          <w:rFonts w:hint="default" w:eastAsia="新細明體"/>
+          <w:lang w:val="en-US"/>
+        </w:rPr>
+      </w:pPr>
+      <w:r>
+        <w:rPr>
+          <w:rFonts w:hint="default" w:eastAsia="新細明體"/>
+          <w:lang w:val="en-US"/>
+        </w:rPr>
+        <w:t>5/30</w:t>
+      </w:r>
+    </w:p>
+    <w:p>
+      <w:pPr>
+        <w:pStyle w:val="28"/>
+        <w:widowControl w:val="0"/>
+        <w:numPr>
           <w:ilvl w:val="0"/>
-          <w:numId w:val="0"/>
-        </w:numPr>
-        <w:spacing w:after="160" w:line="278" w:lineRule="auto"/>
-        <w:ind w:leftChars="0"/>
-        <w:contextualSpacing/>
-        <w:rPr>
-          <w:rFonts w:hint="default"/>
-          <w:lang w:val="en-US"/>
-        </w:rPr>
-      </w:pPr>
-      <w:r>
-        <w:rPr>
-          <w:rFonts w:hint="default"/>
-          <w:lang w:val="en-US"/>
-        </w:rPr>
-        <w:t>5/12</w:t>
-      </w:r>
-    </w:p>
-    <w:p>
-      <w:pPr>
-        <w:pStyle w:val="28"/>
-        <w:widowControl w:val="0"/>
-        <w:numPr>
-          <w:ilvl w:val="0"/>
-          <w:numId w:val="2"/>
+          <w:numId w:val="6"/>
         </w:numPr>
         <w:spacing w:after="160" w:line="278" w:lineRule="auto"/>
         <w:ind w:left="420" w:leftChars="0" w:hanging="420" w:firstLineChars="0"/>
         <w:contextualSpacing/>
         <w:rPr>
-          <w:rFonts w:hint="default"/>
+          <w:rFonts w:hint="default" w:eastAsia="新細明體"/>
           <w:lang w:val="en-US"/>
         </w:rPr>
       </w:pPr>
@@ -163,42 +1022,105 @@
           <w:rFonts w:hint="eastAsia" w:eastAsia="新細明體"/>
           <w:lang w:val="en-US" w:eastAsia="zh-TW"/>
         </w:rPr>
-        <w:t xml:space="preserve">進度：寫 </w:t>
+        <w:t xml:space="preserve">進度：重新學習連線 </w:t>
       </w:r>
       <w:r>
         <w:rPr>
           <w:rFonts w:hint="default" w:eastAsia="新細明體"/>
           <w:lang w:val="en-US" w:eastAsia="zh-TW"/>
         </w:rPr>
-        <w:t xml:space="preserve">upload </w:t>
-      </w:r>
-      <w:r>
-        <w:rPr>
-          <w:rFonts w:hint="eastAsia" w:eastAsia="新細明體"/>
-          <w:lang w:val="en-US" w:eastAsia="zh-TW"/>
-        </w:rPr>
-        <w:t xml:space="preserve">完後要進入該 </w:t>
+        <w:t xml:space="preserve">anthropic </w:t>
+      </w:r>
+      <w:r>
+        <w:rPr>
+          <w:rFonts w:hint="eastAsia" w:eastAsia="新細明體"/>
+          <w:lang w:val="en-US" w:eastAsia="zh-TW"/>
+        </w:rPr>
+        <w:t xml:space="preserve">＋建立 </w:t>
       </w:r>
       <w:r>
         <w:rPr>
           <w:rFonts w:hint="default" w:eastAsia="新細明體"/>
           <w:lang w:val="en-US" w:eastAsia="zh-TW"/>
         </w:rPr>
-        <w:t xml:space="preserve">document </w:t>
-      </w:r>
-      <w:r>
-        <w:rPr>
-          <w:rFonts w:hint="eastAsia" w:eastAsia="新細明體"/>
-          <w:lang w:val="en-US" w:eastAsia="zh-TW"/>
-        </w:rPr>
-        <w:t xml:space="preserve">的頁面的 </w:t>
+        <w:t xml:space="preserve">client </w:t>
+      </w:r>
+      <w:r>
+        <w:rPr>
+          <w:rFonts w:hint="eastAsia" w:eastAsia="新細明體"/>
+          <w:lang w:val="en-US" w:eastAsia="zh-TW"/>
+        </w:rPr>
+        <w:t xml:space="preserve">＋做 </w:t>
       </w:r>
       <w:r>
         <w:rPr>
           <w:rFonts w:hint="default" w:eastAsia="新細明體"/>
           <w:lang w:val="en-US" w:eastAsia="zh-TW"/>
         </w:rPr>
-        <w:t>api</w:t>
+        <w:t xml:space="preserve">summary </w:t>
+      </w:r>
+      <w:r>
+        <w:rPr>
+          <w:rFonts w:hint="eastAsia" w:eastAsia="新細明體"/>
+          <w:lang w:val="en-US" w:eastAsia="zh-TW"/>
+        </w:rPr>
+        <w:t xml:space="preserve">的 </w:t>
+      </w:r>
+      <w:r>
+        <w:rPr>
+          <w:rFonts w:hint="default" w:eastAsia="新細明體"/>
+          <w:lang w:val="en-US" w:eastAsia="zh-TW"/>
+        </w:rPr>
+        <w:t>tool</w:t>
+      </w:r>
+      <w:r>
+        <w:rPr>
+          <w:rFonts w:hint="eastAsia" w:eastAsia="新細明體"/>
+          <w:lang w:val="en-US" w:eastAsia="zh-TW"/>
+        </w:rPr>
+        <w:t xml:space="preserve"> ＋做</w:t>
+      </w:r>
+      <w:r>
+        <w:rPr>
+          <w:rFonts w:hint="default" w:eastAsia="新細明體"/>
+          <w:lang w:val="en-US" w:eastAsia="zh-TW"/>
+        </w:rPr>
+        <w:t>pdf</w:t>
+      </w:r>
+      <w:r>
+        <w:rPr>
+          <w:rFonts w:hint="eastAsia" w:eastAsia="新細明體"/>
+          <w:lang w:val="en-US" w:eastAsia="zh-TW"/>
+        </w:rPr>
+        <w:t xml:space="preserve"> </w:t>
+      </w:r>
+      <w:r>
+        <w:rPr>
+          <w:rFonts w:hint="default" w:eastAsia="新細明體"/>
+          <w:lang w:val="en-US" w:eastAsia="zh-TW"/>
+        </w:rPr>
+        <w:t xml:space="preserve">summary </w:t>
+      </w:r>
+      <w:r>
+        <w:rPr>
+          <w:rFonts w:hint="eastAsia" w:eastAsia="新細明體"/>
+          <w:lang w:val="en-US" w:eastAsia="zh-TW"/>
+        </w:rPr>
+        <w:t xml:space="preserve">的 </w:t>
+      </w:r>
+      <w:r>
+        <w:rPr>
+          <w:rFonts w:hint="default" w:eastAsia="新細明體"/>
+          <w:lang w:val="en-US" w:eastAsia="zh-TW"/>
+        </w:rPr>
+        <w:t>API</w:t>
+      </w:r>
+      <w:r>
+        <w:rPr>
+          <w:rFonts w:hint="eastAsia" w:eastAsia="新細明體"/>
+          <w:lang w:val="en-US" w:eastAsia="zh-TW"/>
+        </w:rPr>
+        <w:t xml:space="preserve"> </w:t>
       </w:r>
     </w:p>
     <w:p>
@@ -207,13 +1129,13 @@
         <w:widowControl w:val="0"/>
         <w:numPr>
           <w:ilvl w:val="0"/>
-          <w:numId w:val="2"/>
+          <w:numId w:val="6"/>
         </w:numPr>
         <w:spacing w:after="160" w:line="278" w:lineRule="auto"/>
         <w:ind w:left="420" w:leftChars="0" w:hanging="420" w:firstLineChars="0"/>
         <w:contextualSpacing/>
         <w:rPr>
-          <w:rFonts w:hint="default"/>
+          <w:rFonts w:hint="default" w:eastAsia="新細明體"/>
           <w:lang w:val="en-US"/>
         </w:rPr>
       </w:pPr>
@@ -222,7 +1144,7 @@
           <w:rFonts w:hint="eastAsia" w:eastAsia="新細明體"/>
           <w:lang w:val="en-US" w:eastAsia="zh-TW"/>
         </w:rPr>
-        <w:t>下次規劃：</w:t>
+        <w:t>心得：</w:t>
       </w:r>
     </w:p>
     <w:p>
@@ -231,13 +1153,13 @@
         <w:widowControl w:val="0"/>
         <w:numPr>
           <w:ilvl w:val="1"/>
-          <w:numId w:val="2"/>
+          <w:numId w:val="6"/>
         </w:numPr>
         <w:spacing w:after="160" w:line="278" w:lineRule="auto"/>
         <w:ind w:left="840" w:leftChars="0" w:hanging="420" w:firstLineChars="0"/>
         <w:contextualSpacing/>
         <w:rPr>
-          <w:rFonts w:hint="default"/>
+          <w:rFonts w:hint="default" w:eastAsia="新細明體"/>
           <w:lang w:val="en-US"/>
         </w:rPr>
       </w:pPr>
@@ -246,21 +1168,35 @@
           <w:rFonts w:hint="eastAsia" w:eastAsia="新細明體"/>
           <w:lang w:val="en-US" w:eastAsia="zh-TW"/>
         </w:rPr>
-        <w:t xml:space="preserve">可以加速撰寫速度，要加上 </w:t>
+        <w:t>直接去看</w:t>
       </w:r>
       <w:r>
         <w:rPr>
           <w:rFonts w:hint="default" w:eastAsia="新細明體"/>
           <w:lang w:val="en-US" w:eastAsia="zh-TW"/>
         </w:rPr>
-        <w:t xml:space="preserve">navigate </w:t>
-      </w:r>
-      <w:r>
-        <w:rPr>
-          <w:rFonts w:hint="eastAsia" w:eastAsia="新細明體"/>
-          <w:lang w:val="en-US" w:eastAsia="zh-TW"/>
-        </w:rPr>
-        <w:t>的功能自動跳轉頁面</w:t>
+        <w:t xml:space="preserve">anthropic </w:t>
+      </w:r>
+      <w:r>
+        <w:rPr>
+          <w:rFonts w:hint="eastAsia" w:eastAsia="新細明體"/>
+          <w:lang w:val="en-US" w:eastAsia="zh-TW"/>
+        </w:rPr>
+        <w:t>的</w:t>
+      </w:r>
+      <w:r>
+        <w:rPr>
+          <w:rFonts w:hint="default" w:eastAsia="新細明體"/>
+          <w:lang w:val="en-US" w:eastAsia="zh-TW"/>
+        </w:rPr>
+        <w:t xml:space="preserve"> SDK </w:t>
+      </w:r>
+      <w:r>
+        <w:rPr>
+          <w:rFonts w:hint="eastAsia" w:eastAsia="新細明體"/>
+          <w:lang w:val="en-US" w:eastAsia="zh-TW"/>
+        </w:rPr>
+        <w:t>研究</w:t>
       </w:r>
     </w:p>
     <w:p>
@@ -269,13 +1205,13 @@
         <w:widowControl w:val="0"/>
         <w:numPr>
           <w:ilvl w:val="1"/>
-          <w:numId w:val="2"/>
+          <w:numId w:val="6"/>
         </w:numPr>
         <w:spacing w:after="160" w:line="278" w:lineRule="auto"/>
         <w:ind w:left="840" w:leftChars="0" w:hanging="420" w:firstLineChars="0"/>
         <w:contextualSpacing/>
         <w:rPr>
-          <w:rFonts w:hint="default"/>
+          <w:rFonts w:hint="default" w:eastAsia="新細明體"/>
           <w:lang w:val="en-US"/>
         </w:rPr>
       </w:pPr>
@@ -284,21 +1220,21 @@
           <w:rFonts w:hint="eastAsia" w:eastAsia="新細明體"/>
           <w:lang w:val="en-US" w:eastAsia="zh-TW"/>
         </w:rPr>
-        <w:t xml:space="preserve">開始寫讀取 </w:t>
+        <w:t xml:space="preserve">做完 </w:t>
       </w:r>
       <w:r>
         <w:rPr>
           <w:rFonts w:hint="default" w:eastAsia="新細明體"/>
           <w:lang w:val="en-US" w:eastAsia="zh-TW"/>
         </w:rPr>
-        <w:t xml:space="preserve">pdf </w:t>
-      </w:r>
-      <w:r>
-        <w:rPr>
-          <w:rFonts w:hint="eastAsia" w:eastAsia="新細明體"/>
-          <w:lang w:val="en-US" w:eastAsia="zh-TW"/>
-        </w:rPr>
-        <w:t>文字內容的功能</w:t>
+        <w:t>utils/ai.ts</w:t>
+      </w:r>
+      <w:r>
+        <w:rPr>
+          <w:rFonts w:hint="eastAsia" w:eastAsia="新細明體"/>
+          <w:lang w:val="en-US" w:eastAsia="zh-TW"/>
+        </w:rPr>
+        <w:t>後，還寫了一個簡單的測試腳本去看是否能做文章總結</w:t>
       </w:r>
     </w:p>
     <w:p>
@@ -307,13 +1243,13 @@
         <w:widowControl w:val="0"/>
         <w:numPr>
           <w:ilvl w:val="1"/>
-          <w:numId w:val="2"/>
+          <w:numId w:val="6"/>
         </w:numPr>
         <w:spacing w:after="160" w:line="278" w:lineRule="auto"/>
         <w:ind w:left="840" w:leftChars="0" w:hanging="420" w:firstLineChars="0"/>
         <w:contextualSpacing/>
         <w:rPr>
-          <w:rFonts w:hint="default"/>
+          <w:rFonts w:hint="default" w:eastAsia="新細明體"/>
           <w:lang w:val="en-US"/>
         </w:rPr>
       </w:pPr>
@@ -322,14 +1258,63 @@
           <w:rFonts w:hint="eastAsia" w:eastAsia="新細明體"/>
           <w:lang w:val="en-US" w:eastAsia="zh-TW"/>
         </w:rPr>
-        <w:t xml:space="preserve">優化目前的 </w:t>
+        <w:t>寫完</w:t>
       </w:r>
       <w:r>
         <w:rPr>
           <w:rFonts w:hint="default" w:eastAsia="新細明體"/>
           <w:lang w:val="en-US" w:eastAsia="zh-TW"/>
         </w:rPr>
-        <w:t>UI</w:t>
+        <w:t>pdf</w:t>
+      </w:r>
+      <w:r>
+        <w:rPr>
+          <w:rFonts w:hint="eastAsia" w:eastAsia="新細明體"/>
+          <w:lang w:val="en-US" w:eastAsia="zh-TW"/>
+        </w:rPr>
+        <w:t xml:space="preserve"> </w:t>
+      </w:r>
+      <w:r>
+        <w:rPr>
+          <w:rFonts w:hint="default" w:eastAsia="新細明體"/>
+          <w:lang w:val="en-US" w:eastAsia="zh-TW"/>
+        </w:rPr>
+        <w:t xml:space="preserve">summary </w:t>
+      </w:r>
+      <w:r>
+        <w:rPr>
+          <w:rFonts w:hint="eastAsia" w:eastAsia="新細明體"/>
+          <w:lang w:val="en-US" w:eastAsia="zh-TW"/>
+        </w:rPr>
+        <w:t xml:space="preserve">的 </w:t>
+      </w:r>
+      <w:r>
+        <w:rPr>
+          <w:rFonts w:hint="default" w:eastAsia="新細明體"/>
+          <w:lang w:val="en-US" w:eastAsia="zh-TW"/>
+        </w:rPr>
+        <w:t>API</w:t>
+      </w:r>
+      <w:r>
+        <w:rPr>
+          <w:rFonts w:hint="eastAsia" w:eastAsia="新細明體"/>
+          <w:lang w:val="en-US" w:eastAsia="zh-TW"/>
+        </w:rPr>
+        <w:t xml:space="preserve"> 後，也有用 </w:t>
+      </w:r>
+      <w:r>
+        <w:rPr>
+          <w:rFonts w:hint="default" w:eastAsia="新細明體"/>
+          <w:lang w:val="en-US" w:eastAsia="zh-TW"/>
+        </w:rPr>
+        <w:t xml:space="preserve">curl </w:t>
+      </w:r>
+      <w:r>
+        <w:rPr>
+          <w:rFonts w:hint="eastAsia" w:eastAsia="新細明體"/>
+          <w:lang w:val="en-US" w:eastAsia="zh-TW"/>
+        </w:rPr>
+        <w:t>去測試</w:t>
       </w:r>
     </w:p>
     <w:p>
@@ -338,13 +1323,13 @@
         <w:widowControl w:val="0"/>
         <w:numPr>
           <w:ilvl w:val="0"/>
-          <w:numId w:val="2"/>
+          <w:numId w:val="6"/>
         </w:numPr>
         <w:spacing w:after="160" w:line="278" w:lineRule="auto"/>
         <w:ind w:left="420" w:leftChars="0" w:hanging="420" w:firstLineChars="0"/>
         <w:contextualSpacing/>
         <w:rPr>
-          <w:rFonts w:hint="default"/>
+          <w:rFonts w:hint="default" w:eastAsia="新細明體"/>
           <w:lang w:val="en-US"/>
         </w:rPr>
       </w:pPr>
@@ -353,63 +1338,7 @@
           <w:rFonts w:hint="eastAsia" w:eastAsia="新細明體"/>
           <w:lang w:val="en-US" w:eastAsia="zh-TW"/>
         </w:rPr>
-        <w:t>心得：</w:t>
-      </w:r>
-      <w:r>
-        <w:rPr>
-          <w:rFonts w:hint="default" w:eastAsia="新細明體"/>
-          <w:lang w:val="en-US" w:eastAsia="zh-TW"/>
-        </w:rPr>
-        <w:t xml:space="preserve">params </w:t>
-      </w:r>
-      <w:r>
-        <w:rPr>
-          <w:rFonts w:hint="eastAsia" w:eastAsia="新細明體"/>
-          <w:lang w:val="en-US" w:eastAsia="zh-TW"/>
-        </w:rPr>
-        <w:t xml:space="preserve">在新版 </w:t>
-      </w:r>
-      <w:r>
-        <w:rPr>
-          <w:rFonts w:hint="default" w:eastAsia="新細明體"/>
-          <w:lang w:val="en-US" w:eastAsia="zh-TW"/>
-        </w:rPr>
-        <w:t xml:space="preserve">ts </w:t>
-      </w:r>
-      <w:r>
-        <w:rPr>
-          <w:rFonts w:hint="eastAsia" w:eastAsia="新細明體"/>
-          <w:lang w:val="en-US" w:eastAsia="zh-TW"/>
-        </w:rPr>
-        <w:t xml:space="preserve">都改成 </w:t>
-      </w:r>
-      <w:r>
-        <w:rPr>
-          <w:rFonts w:hint="default" w:eastAsia="新細明體"/>
-          <w:lang w:val="en-US" w:eastAsia="zh-TW"/>
-        </w:rPr>
-        <w:t>promise</w:t>
-      </w:r>
-      <w:r>
-        <w:rPr>
-          <w:rFonts w:hint="eastAsia" w:eastAsia="新細明體"/>
-          <w:lang w:val="en-US" w:eastAsia="zh-TW"/>
-        </w:rPr>
-        <w:t xml:space="preserve">，所以需要 </w:t>
-      </w:r>
-      <w:r>
-        <w:rPr>
-          <w:rFonts w:hint="default" w:eastAsia="新細明體"/>
-          <w:lang w:val="en-US" w:eastAsia="zh-TW"/>
-        </w:rPr>
-        <w:t xml:space="preserve">await </w:t>
-      </w:r>
-      <w:r>
-        <w:rPr>
-          <w:rFonts w:hint="eastAsia" w:eastAsia="新細明體"/>
-          <w:lang w:val="en-US" w:eastAsia="zh-TW"/>
-        </w:rPr>
-        <w:t>才能呼叫</w:t>
+        <w:t>下次進度</w:t>
       </w:r>
     </w:p>
     <w:p>
@@ -417,83 +1346,14 @@
         <w:pStyle w:val="28"/>
         <w:widowControl w:val="0"/>
         <w:numPr>
-          <w:ilvl w:val="0"/>
-          <w:numId w:val="0"/>
-        </w:numPr>
-        <w:tabs>
-          <w:tab w:val="left" w:pos="420"/>
-        </w:tabs>
-        <w:spacing w:after="160" w:line="278" w:lineRule="auto"/>
-        <w:contextualSpacing/>
-        <w:rPr>
-          <w:rFonts w:hint="eastAsia" w:eastAsia="新細明體"/>
-          <w:lang w:val="en-US" w:eastAsia="zh-TW"/>
-        </w:rPr>
-      </w:pPr>
-    </w:p>
-    <w:p>
-      <w:pPr>
-        <w:pStyle w:val="28"/>
-        <w:widowControl w:val="0"/>
-        <w:numPr>
-          <w:ilvl w:val="0"/>
-          <w:numId w:val="0"/>
-        </w:numPr>
-        <w:tabs>
-          <w:tab w:val="left" w:pos="420"/>
-        </w:tabs>
-        <w:spacing w:after="160" w:line="278" w:lineRule="auto"/>
-        <w:contextualSpacing/>
-        <w:rPr>
-          <w:rFonts w:hint="default" w:eastAsia="新細明體"/>
-          <w:lang w:val="en-US" w:eastAsia="zh-TW"/>
-        </w:rPr>
-      </w:pPr>
-      <w:r>
-        <w:rPr>
-          <w:rFonts w:hint="default" w:eastAsia="新細明體"/>
-          <w:lang w:val="en-US" w:eastAsia="zh-TW"/>
-        </w:rPr>
-        <w:t>5/13</w:t>
-      </w:r>
-    </w:p>
-    <w:p>
-      <w:pPr>
-        <w:pStyle w:val="28"/>
-        <w:widowControl w:val="0"/>
-        <w:numPr>
-          <w:ilvl w:val="0"/>
-          <w:numId w:val="3"/>
-        </w:numPr>
-        <w:spacing w:after="160" w:line="278" w:lineRule="auto"/>
-        <w:ind w:left="420" w:leftChars="0" w:hanging="420" w:firstLineChars="0"/>
-        <w:contextualSpacing/>
-        <w:rPr>
-          <w:rFonts w:hint="default" w:eastAsia="新細明體"/>
-          <w:lang w:val="en-US" w:eastAsia="zh-TW"/>
-        </w:rPr>
-      </w:pPr>
-      <w:r>
-        <w:rPr>
-          <w:rFonts w:hint="eastAsia" w:eastAsia="新細明體"/>
-          <w:lang w:val="en-US" w:eastAsia="zh-TW"/>
-        </w:rPr>
-        <w:t>進度：</w:t>
-      </w:r>
-    </w:p>
-    <w:p>
-      <w:pPr>
-        <w:pStyle w:val="28"/>
-        <w:widowControl w:val="0"/>
-        <w:numPr>
           <w:ilvl w:val="1"/>
-          <w:numId w:val="2"/>
+          <w:numId w:val="6"/>
         </w:numPr>
         <w:spacing w:after="160" w:line="278" w:lineRule="auto"/>
         <w:ind w:left="840" w:leftChars="0" w:hanging="420" w:firstLineChars="0"/>
         <w:contextualSpacing/>
         <w:rPr>
-          <w:rFonts w:hint="default"/>
+          <w:rFonts w:hint="default" w:eastAsia="新細明體"/>
           <w:lang w:val="en-US"/>
         </w:rPr>
       </w:pPr>
@@ -502,21 +1362,21 @@
           <w:rFonts w:hint="eastAsia" w:eastAsia="新細明體"/>
           <w:lang w:val="en-US" w:eastAsia="zh-TW"/>
         </w:rPr>
-        <w:t xml:space="preserve">加上 </w:t>
+        <w:t xml:space="preserve">把 </w:t>
       </w:r>
       <w:r>
         <w:rPr>
           <w:rFonts w:hint="default" w:eastAsia="新細明體"/>
           <w:lang w:val="en-US" w:eastAsia="zh-TW"/>
         </w:rPr>
-        <w:t xml:space="preserve">navigate </w:t>
-      </w:r>
-      <w:r>
-        <w:rPr>
-          <w:rFonts w:hint="eastAsia" w:eastAsia="新細明體"/>
-          <w:lang w:val="en-US" w:eastAsia="zh-TW"/>
-        </w:rPr>
-        <w:t>的功能自動跳轉頁面</w:t>
+        <w:t xml:space="preserve">ai </w:t>
+      </w:r>
+      <w:r>
+        <w:rPr>
+          <w:rFonts w:hint="eastAsia" w:eastAsia="新細明體"/>
+          <w:lang w:val="en-US" w:eastAsia="zh-TW"/>
+        </w:rPr>
+        <w:t>摘要的前端呈現出來</w:t>
       </w:r>
     </w:p>
     <w:p>
@@ -525,36 +1385,43 @@
         <w:widowControl w:val="0"/>
         <w:numPr>
           <w:ilvl w:val="1"/>
-          <w:numId w:val="3"/>
+          <w:numId w:val="6"/>
         </w:numPr>
         <w:spacing w:after="160" w:line="278" w:lineRule="auto"/>
         <w:ind w:left="840" w:leftChars="0" w:hanging="420" w:firstLineChars="0"/>
         <w:contextualSpacing/>
         <w:rPr>
           <w:rFonts w:hint="default" w:eastAsia="新細明體"/>
-          <w:lang w:val="en-US" w:eastAsia="zh-TW"/>
-        </w:rPr>
-      </w:pPr>
-      <w:r>
-        <w:rPr>
-          <w:rFonts w:hint="eastAsia" w:eastAsia="新細明體"/>
-          <w:lang w:val="en-US" w:eastAsia="zh-TW"/>
-        </w:rPr>
-        <w:t xml:space="preserve">可以呈現 </w:t>
+          <w:lang w:val="en-US"/>
+        </w:rPr>
+      </w:pPr>
+      <w:r>
+        <w:rPr>
+          <w:rFonts w:hint="eastAsia" w:eastAsia="新細明體"/>
+          <w:lang w:val="en-US" w:eastAsia="zh-TW"/>
+        </w:rPr>
+        <w:t xml:space="preserve">修改 </w:t>
       </w:r>
       <w:r>
         <w:rPr>
           <w:rFonts w:hint="default" w:eastAsia="新細明體"/>
           <w:lang w:val="en-US" w:eastAsia="zh-TW"/>
         </w:rPr>
-        <w:t xml:space="preserve">pdf </w:t>
-      </w:r>
-      <w:r>
-        <w:rPr>
-          <w:rFonts w:hint="eastAsia" w:eastAsia="新細明體"/>
-          <w:lang w:val="en-US" w:eastAsia="zh-TW"/>
-        </w:rPr>
-        <w:t>的內容</w:t>
+        <w:t xml:space="preserve">ai </w:t>
+      </w:r>
+      <w:r>
+        <w:rPr>
+          <w:rFonts w:hint="eastAsia" w:eastAsia="新細明體"/>
+          <w:lang w:val="en-US" w:eastAsia="zh-TW"/>
+        </w:rPr>
+        <w:t xml:space="preserve">摘要的 </w:t>
+      </w:r>
+      <w:r>
+        <w:rPr>
+          <w:rFonts w:hint="default" w:eastAsia="新細明體"/>
+          <w:lang w:val="en-US" w:eastAsia="zh-TW"/>
+        </w:rPr>
+        <w:t>system prompt</w:t>
       </w:r>
     </w:p>
     <w:p>
@@ -562,423 +1429,68 @@
         <w:pStyle w:val="28"/>
         <w:widowControl w:val="0"/>
         <w:numPr>
-          <w:ilvl w:val="0"/>
-          <w:numId w:val="3"/>
-        </w:numPr>
-        <w:spacing w:after="160" w:line="278" w:lineRule="auto"/>
-        <w:ind w:left="420" w:leftChars="0" w:hanging="420" w:firstLineChars="0"/>
-        <w:contextualSpacing/>
-        <w:rPr>
-          <w:rFonts w:hint="default" w:eastAsia="新細明體"/>
-          <w:lang w:val="en-US" w:eastAsia="zh-TW"/>
-        </w:rPr>
-      </w:pPr>
-      <w:r>
-        <w:rPr>
-          <w:rFonts w:hint="eastAsia" w:eastAsia="新細明體"/>
-          <w:lang w:val="en-US" w:eastAsia="zh-TW"/>
-        </w:rPr>
-        <w:t>下次規劃：</w:t>
-      </w:r>
-    </w:p>
-    <w:p>
-      <w:pPr>
-        <w:pStyle w:val="28"/>
-        <w:widowControl w:val="0"/>
-        <w:numPr>
           <w:ilvl w:val="1"/>
-          <w:numId w:val="3"/>
+          <w:numId w:val="6"/>
         </w:numPr>
         <w:spacing w:after="160" w:line="278" w:lineRule="auto"/>
         <w:ind w:left="840" w:leftChars="0" w:hanging="420" w:firstLineChars="0"/>
         <w:contextualSpacing/>
         <w:rPr>
           <w:rFonts w:hint="default" w:eastAsia="新細明體"/>
-          <w:lang w:val="en-US" w:eastAsia="zh-TW"/>
-        </w:rPr>
-      </w:pPr>
-      <w:r>
-        <w:rPr>
-          <w:rFonts w:hint="eastAsia" w:eastAsia="新細明體"/>
-          <w:lang w:val="en-US" w:eastAsia="zh-TW"/>
-        </w:rPr>
-        <w:t xml:space="preserve">優化首頁 </w:t>
+          <w:lang w:val="en-US"/>
+        </w:rPr>
+      </w:pPr>
+      <w:r>
+        <w:rPr>
+          <w:rFonts w:hint="eastAsia" w:eastAsia="新細明體"/>
+          <w:lang w:val="en-US" w:eastAsia="zh-TW"/>
+        </w:rPr>
+        <w:t xml:space="preserve">整個 </w:t>
       </w:r>
       <w:r>
         <w:rPr>
           <w:rFonts w:hint="default" w:eastAsia="新細明體"/>
           <w:lang w:val="en-US" w:eastAsia="zh-TW"/>
         </w:rPr>
-        <w:t>UI</w:t>
-      </w:r>
-    </w:p>
-    <w:p>
-      <w:pPr>
-        <w:pStyle w:val="28"/>
-        <w:widowControl w:val="0"/>
-        <w:numPr>
-          <w:ilvl w:val="1"/>
-          <w:numId w:val="3"/>
-        </w:numPr>
-        <w:spacing w:after="160" w:line="278" w:lineRule="auto"/>
-        <w:ind w:left="840" w:leftChars="0" w:hanging="420" w:firstLineChars="0"/>
-        <w:contextualSpacing/>
+        <w:t xml:space="preserve">UI/UX </w:t>
+      </w:r>
+      <w:r>
+        <w:rPr>
+          <w:rFonts w:hint="eastAsia" w:eastAsia="新細明體"/>
+          <w:lang w:val="en-US" w:eastAsia="zh-TW"/>
+        </w:rPr>
+        <w:t>要大改，例如上傳檔案時不用等所有</w:t>
+      </w:r>
+      <w:r>
         <w:rPr>
           <w:rFonts w:hint="default" w:eastAsia="新細明體"/>
           <w:lang w:val="en-US" w:eastAsia="zh-TW"/>
         </w:rPr>
-      </w:pPr>
-      <w:r>
-        <w:rPr>
-          <w:rFonts w:hint="eastAsia" w:eastAsia="新細明體"/>
-          <w:lang w:val="en-US" w:eastAsia="zh-TW"/>
-        </w:rPr>
-        <w:t xml:space="preserve">讀取 </w:t>
+        <w:t xml:space="preserve">summary </w:t>
+      </w:r>
+      <w:r>
+        <w:rPr>
+          <w:rFonts w:hint="eastAsia" w:eastAsia="新細明體"/>
+          <w:lang w:val="en-US" w:eastAsia="zh-TW"/>
+        </w:rPr>
+        <w:t xml:space="preserve">做完再跳轉頁面、上傳檔案的 </w:t>
       </w:r>
       <w:r>
         <w:rPr>
           <w:rFonts w:hint="default" w:eastAsia="新細明體"/>
           <w:lang w:val="en-US" w:eastAsia="zh-TW"/>
         </w:rPr>
-        <w:t xml:space="preserve">pdf </w:t>
-      </w:r>
-      <w:r>
-        <w:rPr>
-          <w:rFonts w:hint="eastAsia" w:eastAsia="新細明體"/>
-          <w:lang w:val="en-US" w:eastAsia="zh-TW"/>
-        </w:rPr>
-        <w:t>文字</w:t>
-      </w:r>
-    </w:p>
-    <w:p>
-      <w:pPr>
-        <w:pStyle w:val="28"/>
-        <w:widowControl w:val="0"/>
-        <w:numPr>
-          <w:ilvl w:val="1"/>
-          <w:numId w:val="3"/>
-        </w:numPr>
-        <w:spacing w:after="160" w:line="278" w:lineRule="auto"/>
-        <w:ind w:left="840" w:leftChars="0" w:hanging="420" w:firstLineChars="0"/>
-        <w:contextualSpacing/>
-        <w:rPr>
-          <w:rFonts w:hint="default" w:eastAsia="新細明體"/>
-          <w:lang w:val="en-US" w:eastAsia="zh-TW"/>
-        </w:rPr>
-      </w:pPr>
-      <w:r>
-        <w:rPr>
-          <w:rFonts w:hint="eastAsia" w:eastAsia="新細明體"/>
-          <w:lang w:val="en-US" w:eastAsia="zh-TW"/>
-        </w:rPr>
-        <w:t xml:space="preserve">導入 </w:t>
-      </w:r>
-      <w:r>
-        <w:rPr>
-          <w:rFonts w:hint="default" w:eastAsia="新細明體"/>
-          <w:lang w:val="en-US" w:eastAsia="zh-TW"/>
-        </w:rPr>
-        <w:t xml:space="preserve">AI </w:t>
-      </w:r>
-    </w:p>
-    <w:p>
-      <w:pPr>
-        <w:pStyle w:val="28"/>
-        <w:widowControl w:val="0"/>
-        <w:numPr>
-          <w:ilvl w:val="1"/>
-          <w:numId w:val="3"/>
-        </w:numPr>
-        <w:spacing w:after="160" w:line="278" w:lineRule="auto"/>
-        <w:ind w:left="840" w:leftChars="0" w:hanging="420" w:firstLineChars="0"/>
-        <w:contextualSpacing/>
-        <w:rPr>
-          <w:rFonts w:hint="default" w:eastAsia="新細明體"/>
-          <w:lang w:val="en-US" w:eastAsia="zh-TW"/>
-        </w:rPr>
-      </w:pPr>
-      <w:r>
-        <w:rPr>
-          <w:rFonts w:hint="eastAsia" w:eastAsia="新細明體"/>
-          <w:lang w:val="en-US" w:eastAsia="zh-TW"/>
-        </w:rPr>
-        <w:t xml:space="preserve">問題：這些 </w:t>
-      </w:r>
-      <w:r>
-        <w:rPr>
-          <w:rFonts w:hint="default" w:eastAsia="新細明體"/>
-          <w:lang w:val="en-US" w:eastAsia="zh-TW"/>
-        </w:rPr>
-        <w:t xml:space="preserve">pdf </w:t>
-      </w:r>
-      <w:r>
-        <w:rPr>
-          <w:rFonts w:hint="eastAsia" w:eastAsia="新細明體"/>
-          <w:lang w:val="en-US" w:eastAsia="zh-TW"/>
-        </w:rPr>
-        <w:t>有辦法存雲端嗎？目前是存本地</w:t>
-      </w:r>
-    </w:p>
-    <w:p>
-      <w:pPr>
-        <w:pStyle w:val="28"/>
-        <w:widowControl w:val="0"/>
-        <w:numPr>
-          <w:ilvl w:val="0"/>
-          <w:numId w:val="3"/>
-        </w:numPr>
-        <w:spacing w:after="160" w:line="278" w:lineRule="auto"/>
-        <w:ind w:left="420" w:leftChars="0" w:hanging="420" w:firstLineChars="0"/>
-        <w:contextualSpacing/>
-        <w:rPr>
-          <w:rFonts w:hint="default" w:eastAsia="新細明體"/>
-          <w:lang w:val="en-US" w:eastAsia="zh-TW"/>
-        </w:rPr>
-      </w:pPr>
-      <w:r>
-        <w:rPr>
-          <w:rFonts w:hint="eastAsia" w:eastAsia="新細明體"/>
-          <w:lang w:val="en-US" w:eastAsia="zh-TW"/>
-        </w:rPr>
-        <w:t xml:space="preserve">心得：今天把讀取 </w:t>
-      </w:r>
-      <w:r>
-        <w:rPr>
-          <w:rFonts w:hint="default" w:eastAsia="新細明體"/>
-          <w:lang w:val="en-US" w:eastAsia="zh-TW"/>
-        </w:rPr>
-        <w:t xml:space="preserve">pdf </w:t>
-      </w:r>
-      <w:r>
-        <w:rPr>
-          <w:rFonts w:hint="eastAsia" w:eastAsia="新細明體"/>
-          <w:lang w:val="en-US" w:eastAsia="zh-TW"/>
-        </w:rPr>
-        <w:t xml:space="preserve">並呈現出來的功能包成一個 </w:t>
-      </w:r>
-      <w:r>
-        <w:rPr>
-          <w:rFonts w:hint="default" w:eastAsia="新細明體"/>
-          <w:lang w:val="en-US" w:eastAsia="zh-TW"/>
-        </w:rPr>
-        <w:t>api</w:t>
-      </w:r>
-      <w:r>
-        <w:rPr>
-          <w:rFonts w:hint="eastAsia" w:eastAsia="新細明體"/>
-          <w:lang w:val="en-US" w:eastAsia="zh-TW"/>
-        </w:rPr>
-        <w:t>，然後在</w:t>
-      </w:r>
-      <w:r>
-        <w:rPr>
-          <w:rFonts w:hint="default" w:eastAsia="新細明體"/>
-          <w:lang w:val="en-US" w:eastAsia="zh-TW"/>
-        </w:rPr>
-        <w:t xml:space="preserve">component </w:t>
-      </w:r>
-      <w:r>
-        <w:rPr>
-          <w:rFonts w:hint="eastAsia" w:eastAsia="新細明體"/>
-          <w:lang w:val="en-US" w:eastAsia="zh-TW"/>
-        </w:rPr>
-        <w:t>中設計一個</w:t>
-      </w:r>
-      <w:r>
-        <w:rPr>
-          <w:rFonts w:hint="default" w:eastAsia="新細明體"/>
-          <w:lang w:val="en-US" w:eastAsia="zh-TW"/>
-        </w:rPr>
-        <w:t>function</w:t>
-      </w:r>
-      <w:r>
-        <w:rPr>
-          <w:rFonts w:hint="eastAsia" w:eastAsia="新細明體"/>
-          <w:lang w:val="en-US" w:eastAsia="zh-TW"/>
-        </w:rPr>
-        <w:t xml:space="preserve"> 把 </w:t>
-      </w:r>
-      <w:r>
-        <w:rPr>
-          <w:rFonts w:hint="default" w:eastAsia="新細明體"/>
-          <w:lang w:val="en-US" w:eastAsia="zh-TW"/>
-        </w:rPr>
-        <w:t>params</w:t>
-      </w:r>
-      <w:r>
-        <w:rPr>
-          <w:rFonts w:hint="eastAsia" w:eastAsia="新細明體"/>
-          <w:lang w:val="en-US" w:eastAsia="zh-TW"/>
-        </w:rPr>
-        <w:t xml:space="preserve"> 設計成呼叫此 </w:t>
-      </w:r>
-      <w:r>
-        <w:rPr>
-          <w:rFonts w:hint="default" w:eastAsia="新細明體"/>
-          <w:lang w:val="en-US" w:eastAsia="zh-TW"/>
-        </w:rPr>
-        <w:t xml:space="preserve">api </w:t>
-      </w:r>
-      <w:r>
-        <w:rPr>
-          <w:rFonts w:hint="eastAsia" w:eastAsia="新細明體"/>
-          <w:lang w:val="en-US" w:eastAsia="zh-TW"/>
-        </w:rPr>
-        <w:t xml:space="preserve">的 </w:t>
-      </w:r>
-      <w:r>
-        <w:rPr>
-          <w:rFonts w:hint="default" w:eastAsia="新細明體"/>
-          <w:lang w:val="en-US" w:eastAsia="zh-TW"/>
-        </w:rPr>
-        <w:t>url</w:t>
-      </w:r>
-      <w:r>
-        <w:rPr>
-          <w:rFonts w:hint="eastAsia" w:eastAsia="新細明體"/>
-          <w:lang w:val="en-US" w:eastAsia="zh-TW"/>
-        </w:rPr>
-        <w:t xml:space="preserve">，並且在 </w:t>
-      </w:r>
-      <w:r>
-        <w:rPr>
-          <w:rFonts w:hint="default" w:eastAsia="新細明體"/>
-          <w:lang w:val="en-US" w:eastAsia="zh-TW"/>
-        </w:rPr>
-        <w:t>page.tsx</w:t>
-      </w:r>
-      <w:r>
-        <w:rPr>
-          <w:rFonts w:hint="eastAsia" w:eastAsia="新細明體"/>
-          <w:lang w:val="en-US" w:eastAsia="zh-TW"/>
-        </w:rPr>
-        <w:t xml:space="preserve"> 中加上此 </w:t>
-      </w:r>
-      <w:r>
-        <w:rPr>
-          <w:rFonts w:hint="default" w:eastAsia="新細明體"/>
-          <w:lang w:val="en-US" w:eastAsia="zh-TW"/>
-        </w:rPr>
-        <w:t xml:space="preserve">component </w:t>
-      </w:r>
-      <w:r>
-        <w:rPr>
-          <w:rFonts w:hint="eastAsia" w:eastAsia="新細明體"/>
-          <w:lang w:val="en-US" w:eastAsia="zh-TW"/>
-        </w:rPr>
-        <w:t xml:space="preserve">的 </w:t>
-      </w:r>
-      <w:r>
-        <w:rPr>
-          <w:rFonts w:hint="default" w:eastAsia="新細明體"/>
-          <w:lang w:val="en-US" w:eastAsia="zh-TW"/>
-        </w:rPr>
-        <w:t>tag</w:t>
-      </w:r>
-      <w:r>
-        <w:rPr>
-          <w:rFonts w:hint="eastAsia" w:eastAsia="新細明體"/>
-          <w:lang w:val="en-US" w:eastAsia="zh-TW"/>
-        </w:rPr>
-        <w:t>，整體流程讓我更熟悉撰寫流程了</w:t>
-      </w:r>
-    </w:p>
-    <w:p>
-      <w:pPr>
-        <w:pStyle w:val="28"/>
-        <w:widowControl w:val="0"/>
-        <w:numPr>
-          <w:numId w:val="0"/>
-        </w:numPr>
-        <w:tabs>
-          <w:tab w:val="left" w:pos="420"/>
-        </w:tabs>
-        <w:spacing w:after="160" w:line="278" w:lineRule="auto"/>
-        <w:contextualSpacing/>
-        <w:rPr>
-          <w:rFonts w:hint="eastAsia" w:eastAsia="新細明體"/>
-          <w:lang w:val="en-US" w:eastAsia="zh-TW"/>
-        </w:rPr>
-      </w:pPr>
-    </w:p>
-    <w:p>
-      <w:pPr>
-        <w:pStyle w:val="28"/>
-        <w:widowControl w:val="0"/>
-        <w:numPr>
-          <w:numId w:val="0"/>
-        </w:numPr>
-        <w:tabs>
-          <w:tab w:val="left" w:pos="420"/>
-        </w:tabs>
-        <w:spacing w:after="160" w:line="278" w:lineRule="auto"/>
-        <w:contextualSpacing/>
-        <w:rPr>
-          <w:rFonts w:hint="default" w:eastAsia="新細明體"/>
-          <w:lang w:val="en-US" w:eastAsia="zh-TW"/>
-        </w:rPr>
-      </w:pPr>
-      <w:r>
-        <w:rPr>
-          <w:rFonts w:hint="default" w:eastAsia="新細明體"/>
-          <w:lang w:val="en-US" w:eastAsia="zh-TW"/>
-        </w:rPr>
-        <w:t>5/18</w:t>
+        <w:t xml:space="preserve">UI </w:t>
+      </w:r>
+      <w:r>
+        <w:rPr>
+          <w:rFonts w:hint="eastAsia" w:eastAsia="新細明體"/>
+          <w:lang w:val="en-US" w:eastAsia="zh-TW"/>
+        </w:rPr>
+        <w:t>要修</w:t>
       </w:r>
       <w:bookmarkStart w:id="0" w:name="_GoBack"/>
       <w:bookmarkEnd w:id="0"/>
-    </w:p>
-    <w:p>
-      <w:pPr>
-        <w:pStyle w:val="28"/>
-        <w:widowControl w:val="0"/>
-        <w:numPr>
-          <w:ilvl w:val="0"/>
-          <w:numId w:val="4"/>
-        </w:numPr>
-        <w:spacing w:after="160" w:line="278" w:lineRule="auto"/>
-        <w:ind w:left="420" w:leftChars="0" w:hanging="420" w:firstLineChars="0"/>
-        <w:contextualSpacing/>
-        <w:rPr>
-          <w:rFonts w:hint="default" w:eastAsia="新細明體"/>
-          <w:lang w:val="en-US" w:eastAsia="zh-TW"/>
-        </w:rPr>
-      </w:pPr>
-      <w:r>
-        <w:rPr>
-          <w:rFonts w:hint="eastAsia" w:eastAsia="新細明體"/>
-          <w:lang w:val="en-US" w:eastAsia="zh-TW"/>
-        </w:rPr>
-        <w:t xml:space="preserve">上傳 </w:t>
-      </w:r>
-      <w:r>
-        <w:rPr>
-          <w:rFonts w:hint="default" w:eastAsia="新細明體"/>
-          <w:lang w:val="en-US" w:eastAsia="zh-TW"/>
-        </w:rPr>
-        <w:t xml:space="preserve">pdf </w:t>
-      </w:r>
-      <w:r>
-        <w:rPr>
-          <w:rFonts w:hint="eastAsia" w:eastAsia="新細明體"/>
-          <w:lang w:val="en-US" w:eastAsia="zh-TW"/>
-        </w:rPr>
-        <w:t xml:space="preserve">後可以把文字存到 </w:t>
-      </w:r>
-      <w:r>
-        <w:rPr>
-          <w:rFonts w:hint="default" w:eastAsia="新細明體"/>
-          <w:lang w:val="en-US" w:eastAsia="zh-TW"/>
-        </w:rPr>
-        <w:t>DB</w:t>
-      </w:r>
-      <w:r>
-        <w:rPr>
-          <w:rFonts w:hint="eastAsia" w:eastAsia="新細明體"/>
-          <w:lang w:val="en-US" w:eastAsia="zh-TW"/>
-        </w:rPr>
-        <w:t xml:space="preserve"> 裏</w:t>
-      </w:r>
     </w:p>
     <w:sectPr>
       <w:pgSz w:w="11906" w:h="16838"/>
@@ -1055,7 +1567,7 @@
         <w:tabs>
           <w:tab w:val="left" w:pos="420"/>
         </w:tabs>
-        <w:ind w:left="420" w:leftChars="0" w:hanging="420" w:firstLineChars="0"/>
+        <w:ind w:left="420" w:hanging="420"/>
       </w:pPr>
       <w:rPr>
         <w:rFonts w:hint="default" w:ascii="Wingdings" w:hAnsi="Wingdings"/>
@@ -1070,7 +1582,7 @@
         <w:tabs>
           <w:tab w:val="left" w:pos="840"/>
         </w:tabs>
-        <w:ind w:left="840" w:leftChars="0" w:hanging="420" w:firstLineChars="0"/>
+        <w:ind w:left="840" w:hanging="420"/>
       </w:pPr>
       <w:rPr>
         <w:rFonts w:hint="default" w:ascii="Wingdings" w:hAnsi="Wingdings"/>
@@ -1085,7 +1597,7 @@
         <w:tabs>
           <w:tab w:val="left" w:pos="1260"/>
         </w:tabs>
-        <w:ind w:left="1260" w:leftChars="0" w:hanging="420" w:firstLineChars="0"/>
+        <w:ind w:left="1260" w:hanging="420"/>
       </w:pPr>
       <w:rPr>
         <w:rFonts w:hint="default" w:ascii="Wingdings" w:hAnsi="Wingdings"/>
@@ -1100,7 +1612,7 @@
         <w:tabs>
           <w:tab w:val="left" w:pos="1680"/>
         </w:tabs>
-        <w:ind w:left="1680" w:leftChars="0" w:hanging="420" w:firstLineChars="0"/>
+        <w:ind w:left="1680" w:hanging="420"/>
       </w:pPr>
       <w:rPr>
         <w:rFonts w:hint="default" w:ascii="Wingdings" w:hAnsi="Wingdings"/>
@@ -1115,7 +1627,7 @@
         <w:tabs>
           <w:tab w:val="left" w:pos="2100"/>
         </w:tabs>
-        <w:ind w:left="2100" w:leftChars="0" w:hanging="420" w:firstLineChars="0"/>
+        <w:ind w:left="2100" w:hanging="420"/>
       </w:pPr>
       <w:rPr>
         <w:rFonts w:hint="default" w:ascii="Wingdings" w:hAnsi="Wingdings"/>
@@ -1130,7 +1642,7 @@
         <w:tabs>
           <w:tab w:val="left" w:pos="2520"/>
         </w:tabs>
-        <w:ind w:left="2520" w:leftChars="0" w:hanging="420" w:firstLineChars="0"/>
+        <w:ind w:left="2520" w:hanging="420"/>
       </w:pPr>
       <w:rPr>
         <w:rFonts w:hint="default" w:ascii="Wingdings" w:hAnsi="Wingdings"/>
@@ -1145,7 +1657,7 @@
         <w:tabs>
           <w:tab w:val="left" w:pos="2940"/>
         </w:tabs>
-        <w:ind w:left="2940" w:leftChars="0" w:hanging="420" w:firstLineChars="0"/>
+        <w:ind w:left="2940" w:hanging="420"/>
       </w:pPr>
       <w:rPr>
         <w:rFonts w:hint="default" w:ascii="Wingdings" w:hAnsi="Wingdings"/>
@@ -1160,7 +1672,7 @@
         <w:tabs>
           <w:tab w:val="left" w:pos="3360"/>
         </w:tabs>
-        <w:ind w:left="3360" w:leftChars="0" w:hanging="420" w:firstLineChars="0"/>
+        <w:ind w:left="3360" w:hanging="420"/>
       </w:pPr>
       <w:rPr>
         <w:rFonts w:hint="default" w:ascii="Wingdings" w:hAnsi="Wingdings"/>
@@ -1175,7 +1687,7 @@
         <w:tabs>
           <w:tab w:val="left" w:pos="3780"/>
         </w:tabs>
-        <w:ind w:left="3780" w:leftChars="0" w:hanging="420" w:firstLineChars="0"/>
+        <w:ind w:left="3780" w:hanging="420"/>
       </w:pPr>
       <w:rPr>
         <w:rFonts w:hint="default" w:ascii="Wingdings" w:hAnsi="Wingdings"/>
@@ -1195,7 +1707,7 @@
         <w:tabs>
           <w:tab w:val="left" w:pos="420"/>
         </w:tabs>
-        <w:ind w:left="420" w:leftChars="0" w:hanging="420" w:firstLineChars="0"/>
+        <w:ind w:left="420" w:hanging="420"/>
       </w:pPr>
       <w:rPr>
         <w:rFonts w:hint="default" w:ascii="Wingdings" w:hAnsi="Wingdings"/>
@@ -1215,7 +1727,7 @@
         <w:tabs>
           <w:tab w:val="left" w:pos="420"/>
         </w:tabs>
-        <w:ind w:left="420" w:leftChars="0" w:hanging="420" w:firstLineChars="0"/>
+        <w:ind w:left="420" w:hanging="420"/>
       </w:pPr>
       <w:rPr>
         <w:rFonts w:hint="default" w:ascii="Wingdings" w:hAnsi="Wingdings"/>
@@ -1230,7 +1742,7 @@
         <w:tabs>
           <w:tab w:val="left" w:pos="840"/>
         </w:tabs>
-        <w:ind w:left="840" w:leftChars="0" w:hanging="420" w:firstLineChars="0"/>
+        <w:ind w:left="840" w:hanging="420"/>
       </w:pPr>
       <w:rPr>
         <w:rFonts w:hint="default" w:ascii="Wingdings" w:hAnsi="Wingdings"/>
@@ -1245,7 +1757,7 @@
         <w:tabs>
           <w:tab w:val="left" w:pos="1260"/>
         </w:tabs>
-        <w:ind w:left="1260" w:leftChars="0" w:hanging="420" w:firstLineChars="0"/>
+        <w:ind w:left="1260" w:hanging="420"/>
       </w:pPr>
       <w:rPr>
         <w:rFonts w:hint="default" w:ascii="Wingdings" w:hAnsi="Wingdings"/>
@@ -1260,7 +1772,7 @@
         <w:tabs>
           <w:tab w:val="left" w:pos="1680"/>
         </w:tabs>
-        <w:ind w:left="1680" w:leftChars="0" w:hanging="420" w:firstLineChars="0"/>
+        <w:ind w:left="1680" w:hanging="420"/>
       </w:pPr>
       <w:rPr>
         <w:rFonts w:hint="default" w:ascii="Wingdings" w:hAnsi="Wingdings"/>
@@ -1275,7 +1787,7 @@
         <w:tabs>
           <w:tab w:val="left" w:pos="2100"/>
         </w:tabs>
-        <w:ind w:left="2100" w:leftChars="0" w:hanging="420" w:firstLineChars="0"/>
+        <w:ind w:left="2100" w:hanging="420"/>
       </w:pPr>
       <w:rPr>
         <w:rFonts w:hint="default" w:ascii="Wingdings" w:hAnsi="Wingdings"/>
@@ -1290,7 +1802,7 @@
         <w:tabs>
           <w:tab w:val="left" w:pos="2520"/>
         </w:tabs>
-        <w:ind w:left="2520" w:leftChars="0" w:hanging="420" w:firstLineChars="0"/>
+        <w:ind w:left="2520" w:hanging="420"/>
       </w:pPr>
       <w:rPr>
         <w:rFonts w:hint="default" w:ascii="Wingdings" w:hAnsi="Wingdings"/>
@@ -1305,7 +1817,7 @@
         <w:tabs>
           <w:tab w:val="left" w:pos="2940"/>
         </w:tabs>
-        <w:ind w:left="2940" w:leftChars="0" w:hanging="420" w:firstLineChars="0"/>
+        <w:ind w:left="2940" w:hanging="420"/>
       </w:pPr>
       <w:rPr>
         <w:rFonts w:hint="default" w:ascii="Wingdings" w:hAnsi="Wingdings"/>
@@ -1320,7 +1832,7 @@
         <w:tabs>
           <w:tab w:val="left" w:pos="3360"/>
         </w:tabs>
-        <w:ind w:left="3360" w:leftChars="0" w:hanging="420" w:firstLineChars="0"/>
+        <w:ind w:left="3360" w:hanging="420"/>
       </w:pPr>
       <w:rPr>
         <w:rFonts w:hint="default" w:ascii="Wingdings" w:hAnsi="Wingdings"/>
@@ -1335,7 +1847,7 @@
         <w:tabs>
           <w:tab w:val="left" w:pos="3780"/>
         </w:tabs>
-        <w:ind w:left="3780" w:leftChars="0" w:hanging="420" w:firstLineChars="0"/>
+        <w:ind w:left="3780" w:hanging="420"/>
       </w:pPr>
       <w:rPr>
         <w:rFonts w:hint="default" w:ascii="Wingdings" w:hAnsi="Wingdings"/>
@@ -1449,6 +1961,259 @@
       <w:lvlJc w:val="left"/>
       <w:pPr>
         <w:ind w:left="4320" w:hanging="480"/>
+      </w:pPr>
+      <w:rPr>
+        <w:rFonts w:hint="default" w:ascii="Wingdings" w:hAnsi="Wingdings"/>
+      </w:rPr>
+    </w:lvl>
+  </w:abstractNum>
+  <w:abstractNum w:abstractNumId="4">
+    <w:nsid w:val="2D821E64"/>
+    <w:multiLevelType w:val="multilevel"/>
+    <w:tmpl w:val="2D821E64"/>
+    <w:lvl w:ilvl="0" w:tentative="0">
+      <w:start w:val="1"/>
+      <w:numFmt w:val="bullet"/>
+      <w:lvlText w:val=""/>
+      <w:lvlJc w:val="left"/>
+      <w:pPr>
+        <w:ind w:left="480" w:hanging="480"/>
+      </w:pPr>
+      <w:rPr>
+        <w:rFonts w:hint="default" w:ascii="Wingdings" w:hAnsi="Wingdings"/>
+      </w:rPr>
+    </w:lvl>
+    <w:lvl w:ilvl="1" w:tentative="0">
+      <w:start w:val="1"/>
+      <w:numFmt w:val="bullet"/>
+      <w:lvlText w:val=""/>
+      <w:lvlJc w:val="left"/>
+      <w:pPr>
+        <w:ind w:left="960" w:hanging="480"/>
+      </w:pPr>
+      <w:rPr>
+        <w:rFonts w:hint="default" w:ascii="Wingdings" w:hAnsi="Wingdings"/>
+      </w:rPr>
+    </w:lvl>
+    <w:lvl w:ilvl="2" w:tentative="0">
+      <w:start w:val="1"/>
+      <w:numFmt w:val="bullet"/>
+      <w:lvlText w:val=""/>
+      <w:lvlJc w:val="left"/>
+      <w:pPr>
+        <w:ind w:left="1440" w:hanging="480"/>
+      </w:pPr>
+      <w:rPr>
+        <w:rFonts w:hint="default" w:ascii="Wingdings" w:hAnsi="Wingdings"/>
+      </w:rPr>
+    </w:lvl>
+    <w:lvl w:ilvl="3" w:tentative="0">
+      <w:start w:val="1"/>
+      <w:numFmt w:val="bullet"/>
+      <w:lvlText w:val=""/>
+      <w:lvlJc w:val="left"/>
+      <w:pPr>
+        <w:ind w:left="1920" w:hanging="480"/>
+      </w:pPr>
+      <w:rPr>
+        <w:rFonts w:hint="default" w:ascii="Wingdings" w:hAnsi="Wingdings"/>
+      </w:rPr>
+    </w:lvl>
+    <w:lvl w:ilvl="4" w:tentative="0">
+      <w:start w:val="1"/>
+      <w:numFmt w:val="bullet"/>
+      <w:lvlText w:val=""/>
+      <w:lvlJc w:val="left"/>
+      <w:pPr>
+        <w:ind w:left="2400" w:hanging="480"/>
+      </w:pPr>
+      <w:rPr>
+        <w:rFonts w:hint="default" w:ascii="Wingdings" w:hAnsi="Wingdings"/>
+      </w:rPr>
+    </w:lvl>
+    <w:lvl w:ilvl="5" w:tentative="0">
+      <w:start w:val="1"/>
+      <w:numFmt w:val="bullet"/>
+      <w:lvlText w:val=""/>
+      <w:lvlJc w:val="left"/>
+      <w:pPr>
+        <w:ind w:left="2880" w:hanging="480"/>
+      </w:pPr>
+      <w:rPr>
+        <w:rFonts w:hint="default" w:ascii="Wingdings" w:hAnsi="Wingdings"/>
+      </w:rPr>
+    </w:lvl>
+    <w:lvl w:ilvl="6" w:tentative="0">
+      <w:start w:val="1"/>
+      <w:numFmt w:val="bullet"/>
+      <w:lvlText w:val=""/>
+      <w:lvlJc w:val="left"/>
+      <w:pPr>
+        <w:ind w:left="3360" w:hanging="480"/>
+      </w:pPr>
+      <w:rPr>
+        <w:rFonts w:hint="default" w:ascii="Wingdings" w:hAnsi="Wingdings"/>
+      </w:rPr>
+    </w:lvl>
+    <w:lvl w:ilvl="7" w:tentative="0">
+      <w:start w:val="1"/>
+      <w:numFmt w:val="bullet"/>
+      <w:lvlText w:val=""/>
+      <w:lvlJc w:val="left"/>
+      <w:pPr>
+        <w:ind w:left="3840" w:hanging="480"/>
+      </w:pPr>
+      <w:rPr>
+        <w:rFonts w:hint="default" w:ascii="Wingdings" w:hAnsi="Wingdings"/>
+      </w:rPr>
+    </w:lvl>
+    <w:lvl w:ilvl="8" w:tentative="0">
+      <w:start w:val="1"/>
+      <w:numFmt w:val="bullet"/>
+      <w:lvlText w:val=""/>
+      <w:lvlJc w:val="left"/>
+      <w:pPr>
+        <w:ind w:left="4320" w:hanging="480"/>
+      </w:pPr>
+      <w:rPr>
+        <w:rFonts w:hint="default" w:ascii="Wingdings" w:hAnsi="Wingdings"/>
+      </w:rPr>
+    </w:lvl>
+  </w:abstractNum>
+  <w:abstractNum w:abstractNumId="5">
+    <w:nsid w:val="378FFA6E"/>
+    <w:multiLevelType w:val="multilevel"/>
+    <w:tmpl w:val="378FFA6E"/>
+    <w:lvl w:ilvl="0" w:tentative="0">
+      <w:start w:val="1"/>
+      <w:numFmt w:val="bullet"/>
+      <w:lvlText w:val=""/>
+      <w:lvlJc w:val="left"/>
+      <w:pPr>
+        <w:tabs>
+          <w:tab w:val="left" w:pos="420"/>
+        </w:tabs>
+        <w:ind w:left="420" w:leftChars="0" w:hanging="420" w:firstLineChars="0"/>
+      </w:pPr>
+      <w:rPr>
+        <w:rFonts w:hint="default" w:ascii="Wingdings" w:hAnsi="Wingdings"/>
+      </w:rPr>
+    </w:lvl>
+    <w:lvl w:ilvl="1" w:tentative="0">
+      <w:start w:val="1"/>
+      <w:numFmt w:val="bullet"/>
+      <w:lvlText w:val=""/>
+      <w:lvlJc w:val="left"/>
+      <w:pPr>
+        <w:tabs>
+          <w:tab w:val="left" w:pos="840"/>
+        </w:tabs>
+        <w:ind w:left="840" w:leftChars="0" w:hanging="420" w:firstLineChars="0"/>
+      </w:pPr>
+      <w:rPr>
+        <w:rFonts w:hint="default" w:ascii="Wingdings" w:hAnsi="Wingdings"/>
+      </w:rPr>
+    </w:lvl>
+    <w:lvl w:ilvl="2" w:tentative="0">
+      <w:start w:val="1"/>
+      <w:numFmt w:val="bullet"/>
+      <w:lvlText w:val=""/>
+      <w:lvlJc w:val="left"/>
+      <w:pPr>
+        <w:tabs>
+          <w:tab w:val="left" w:pos="1260"/>
+        </w:tabs>
+        <w:ind w:left="1260" w:leftChars="0" w:hanging="420" w:firstLineChars="0"/>
+      </w:pPr>
+      <w:rPr>
+        <w:rFonts w:hint="default" w:ascii="Wingdings" w:hAnsi="Wingdings"/>
+      </w:rPr>
+    </w:lvl>
+    <w:lvl w:ilvl="3" w:tentative="0">
+      <w:start w:val="1"/>
+      <w:numFmt w:val="bullet"/>
+      <w:lvlText w:val=""/>
+      <w:lvlJc w:val="left"/>
+      <w:pPr>
+        <w:tabs>
+          <w:tab w:val="left" w:pos="1680"/>
+        </w:tabs>
+        <w:ind w:left="1680" w:leftChars="0" w:hanging="420" w:firstLineChars="0"/>
+      </w:pPr>
+      <w:rPr>
+        <w:rFonts w:hint="default" w:ascii="Wingdings" w:hAnsi="Wingdings"/>
+      </w:rPr>
+    </w:lvl>
+    <w:lvl w:ilvl="4" w:tentative="0">
+      <w:start w:val="1"/>
+      <w:numFmt w:val="bullet"/>
+      <w:lvlText w:val=""/>
+      <w:lvlJc w:val="left"/>
+      <w:pPr>
+        <w:tabs>
+          <w:tab w:val="left" w:pos="2100"/>
+        </w:tabs>
+        <w:ind w:left="2100" w:leftChars="0" w:hanging="420" w:firstLineChars="0"/>
+      </w:pPr>
+      <w:rPr>
+        <w:rFonts w:hint="default" w:ascii="Wingdings" w:hAnsi="Wingdings"/>
+      </w:rPr>
+    </w:lvl>
+    <w:lvl w:ilvl="5" w:tentative="0">
+      <w:start w:val="1"/>
+      <w:numFmt w:val="bullet"/>
+      <w:lvlText w:val=""/>
+      <w:lvlJc w:val="left"/>
+      <w:pPr>
+        <w:tabs>
+          <w:tab w:val="left" w:pos="2520"/>
+        </w:tabs>
+        <w:ind w:left="2520" w:leftChars="0" w:hanging="420" w:firstLineChars="0"/>
+      </w:pPr>
+      <w:rPr>
+        <w:rFonts w:hint="default" w:ascii="Wingdings" w:hAnsi="Wingdings"/>
+      </w:rPr>
+    </w:lvl>
+    <w:lvl w:ilvl="6" w:tentative="0">
+      <w:start w:val="1"/>
+      <w:numFmt w:val="bullet"/>
+      <w:lvlText w:val=""/>
+      <w:lvlJc w:val="left"/>
+      <w:pPr>
+        <w:tabs>
+          <w:tab w:val="left" w:pos="2940"/>
+        </w:tabs>
+        <w:ind w:left="2940" w:leftChars="0" w:hanging="420" w:firstLineChars="0"/>
+      </w:pPr>
+      <w:rPr>
+        <w:rFonts w:hint="default" w:ascii="Wingdings" w:hAnsi="Wingdings"/>
+      </w:rPr>
+    </w:lvl>
+    <w:lvl w:ilvl="7" w:tentative="0">
+      <w:start w:val="1"/>
+      <w:numFmt w:val="bullet"/>
+      <w:lvlText w:val=""/>
+      <w:lvlJc w:val="left"/>
+      <w:pPr>
+        <w:tabs>
+          <w:tab w:val="left" w:pos="3360"/>
+        </w:tabs>
+        <w:ind w:left="3360" w:leftChars="0" w:hanging="420" w:firstLineChars="0"/>
+      </w:pPr>
+      <w:rPr>
+        <w:rFonts w:hint="default" w:ascii="Wingdings" w:hAnsi="Wingdings"/>
+      </w:rPr>
+    </w:lvl>
+    <w:lvl w:ilvl="8" w:tentative="0">
+      <w:start w:val="1"/>
+      <w:numFmt w:val="bullet"/>
+      <w:lvlText w:val=""/>
+      <w:lvlJc w:val="left"/>
+      <w:pPr>
+        <w:tabs>
+          <w:tab w:val="left" w:pos="3780"/>
+        </w:tabs>
+        <w:ind w:left="3780" w:leftChars="0" w:hanging="420" w:firstLineChars="0"/>
       </w:pPr>
       <w:rPr>
         <w:rFonts w:hint="default" w:ascii="Wingdings" w:hAnsi="Wingdings"/>
@@ -1466,6 +2231,12 @@
   </w:num>
   <w:num w:numId="4">
     <w:abstractNumId w:val="1"/>
+  </w:num>
+  <w:num w:numId="5">
+    <w:abstractNumId w:val="4"/>
+  </w:num>
+  <w:num w:numId="6">
+    <w:abstractNumId w:val="5"/>
   </w:num>
 </w:numbering>
 </file>
@@ -2264,7 +3035,7 @@
     </w:pPr>
   </w:style>
   <w:style w:type="character" w:customStyle="1" w:styleId="29">
-    <w:name w:val="Intense Emphasis"/>
+    <w:name w:val="鮮明強調1"/>
     <w:basedOn w:val="11"/>
     <w:qFormat/>
     <w:uiPriority w:val="21"/>
@@ -2308,7 +3079,7 @@
     </w:rPr>
   </w:style>
   <w:style w:type="character" w:customStyle="1" w:styleId="32">
-    <w:name w:val="Intense Reference"/>
+    <w:name w:val="鮮明參考1"/>
     <w:basedOn w:val="11"/>
     <w:qFormat/>
     <w:uiPriority w:val="32"/>

</xml_diff>

<commit_message>
feat: add page summary function
</commit_message>
<xml_diff>
--- a/日記.docx
+++ b/日記.docx
@@ -970,6 +970,7 @@
         <w:pStyle w:val="28"/>
         <w:widowControl w:val="0"/>
         <w:numPr>
+          <w:ilvl w:val="0"/>
           <w:numId w:val="0"/>
         </w:numPr>
         <w:spacing w:after="160" w:line="278" w:lineRule="auto"/>
@@ -984,6 +985,7 @@
         <w:pStyle w:val="28"/>
         <w:widowControl w:val="0"/>
         <w:numPr>
+          <w:ilvl w:val="0"/>
           <w:numId w:val="0"/>
         </w:numPr>
         <w:spacing w:after="160" w:line="278" w:lineRule="auto"/>
@@ -1489,8 +1491,453 @@
         </w:rPr>
         <w:t>要修</w:t>
       </w:r>
+    </w:p>
+    <w:p>
+      <w:pPr>
+        <w:pStyle w:val="28"/>
+        <w:widowControl w:val="0"/>
+        <w:numPr>
+          <w:ilvl w:val="1"/>
+          <w:numId w:val="6"/>
+        </w:numPr>
+        <w:spacing w:after="160" w:line="278" w:lineRule="auto"/>
+        <w:ind w:left="840" w:leftChars="0" w:hanging="420" w:firstLineChars="0"/>
+        <w:contextualSpacing/>
+        <w:rPr>
+          <w:rFonts w:hint="default" w:eastAsia="新細明體"/>
+          <w:lang w:val="en-US"/>
+        </w:rPr>
+      </w:pPr>
+      <w:r>
+        <w:rPr>
+          <w:rFonts w:hint="eastAsia" w:eastAsia="新細明體"/>
+          <w:lang w:val="en-US" w:eastAsia="zh-TW"/>
+        </w:rPr>
+        <w:t>疑問：為何每次上傳檔案後，本地都會存該</w:t>
+      </w:r>
+      <w:r>
+        <w:rPr>
+          <w:rFonts w:hint="default" w:eastAsia="新細明體"/>
+          <w:lang w:val="en-US" w:eastAsia="zh-TW"/>
+        </w:rPr>
+        <w:t xml:space="preserve"> pdf </w:t>
+      </w:r>
+      <w:r>
+        <w:rPr>
+          <w:rFonts w:hint="eastAsia" w:eastAsia="新細明體"/>
+          <w:lang w:val="en-US" w:eastAsia="zh-TW"/>
+        </w:rPr>
+        <w:t>檔案？不是存在資料庫了？</w:t>
+      </w:r>
+    </w:p>
+    <w:p>
+      <w:pPr>
+        <w:pStyle w:val="28"/>
+        <w:widowControl w:val="0"/>
+        <w:numPr>
+          <w:ilvl w:val="1"/>
+          <w:numId w:val="6"/>
+        </w:numPr>
+        <w:spacing w:after="160" w:line="278" w:lineRule="auto"/>
+        <w:ind w:left="840" w:leftChars="0" w:hanging="420" w:firstLineChars="0"/>
+        <w:contextualSpacing/>
+        <w:rPr>
+          <w:rFonts w:hint="default" w:eastAsia="新細明體"/>
+          <w:lang w:val="en-US"/>
+        </w:rPr>
+      </w:pPr>
+      <w:r>
+        <w:drawing>
+          <wp:inline distT="0" distB="0" distL="114300" distR="114300">
+            <wp:extent cx="5268595" cy="1836420"/>
+            <wp:effectExtent l="0" t="0" r="14605" b="17780"/>
+            <wp:docPr id="1" name="圖片 1"/>
+            <wp:cNvGraphicFramePr>
+              <a:graphicFrameLocks xmlns:a="http://schemas.openxmlformats.org/drawingml/2006/main" noChangeAspect="1"/>
+            </wp:cNvGraphicFramePr>
+            <a:graphic xmlns:a="http://schemas.openxmlformats.org/drawingml/2006/main">
+              <a:graphicData uri="http://schemas.openxmlformats.org/drawingml/2006/picture">
+                <pic:pic xmlns:pic="http://schemas.openxmlformats.org/drawingml/2006/picture">
+                  <pic:nvPicPr>
+                    <pic:cNvPr id="1" name="圖片 1"/>
+                    <pic:cNvPicPr>
+                      <a:picLocks noChangeAspect="1"/>
+                    </pic:cNvPicPr>
+                  </pic:nvPicPr>
+                  <pic:blipFill>
+                    <a:blip r:embed="rId6"/>
+                    <a:stretch>
+                      <a:fillRect/>
+                    </a:stretch>
+                  </pic:blipFill>
+                  <pic:spPr>
+                    <a:xfrm>
+                      <a:off x="0" y="0"/>
+                      <a:ext cx="5268595" cy="1836420"/>
+                    </a:xfrm>
+                    <a:prstGeom prst="rect">
+                      <a:avLst/>
+                    </a:prstGeom>
+                    <a:noFill/>
+                    <a:ln>
+                      <a:noFill/>
+                    </a:ln>
+                  </pic:spPr>
+                </pic:pic>
+              </a:graphicData>
+            </a:graphic>
+          </wp:inline>
+        </w:drawing>
+      </w:r>
+    </w:p>
+    <w:p>
+      <w:pPr>
+        <w:pStyle w:val="28"/>
+        <w:widowControl w:val="0"/>
+        <w:numPr>
+          <w:numId w:val="0"/>
+        </w:numPr>
+        <w:spacing w:after="160" w:line="278" w:lineRule="auto"/>
+        <w:contextualSpacing/>
+        <w:rPr>
+          <w:rFonts w:hint="default" w:eastAsia="新細明體"/>
+          <w:lang w:val="en-US" w:eastAsia="zh-TW"/>
+        </w:rPr>
+      </w:pPr>
+      <w:r>
+        <w:rPr>
+          <w:rFonts w:hint="default" w:eastAsia="新細明體"/>
+          <w:lang w:val="en-US" w:eastAsia="zh-TW"/>
+        </w:rPr>
+        <w:t>6/2</w:t>
+      </w:r>
+    </w:p>
+    <w:p>
+      <w:pPr>
+        <w:pStyle w:val="28"/>
+        <w:widowControl w:val="0"/>
+        <w:numPr>
+          <w:ilvl w:val="0"/>
+          <w:numId w:val="7"/>
+        </w:numPr>
+        <w:spacing w:after="160" w:line="278" w:lineRule="auto"/>
+        <w:ind w:left="420" w:leftChars="0" w:hanging="420" w:firstLineChars="0"/>
+        <w:contextualSpacing/>
+        <w:rPr>
+          <w:rFonts w:hint="default" w:eastAsia="新細明體"/>
+          <w:lang w:val="en-US" w:eastAsia="zh-TW"/>
+        </w:rPr>
+      </w:pPr>
+      <w:r>
+        <w:rPr>
+          <w:rFonts w:hint="eastAsia" w:eastAsia="新細明體"/>
+          <w:lang w:val="en-US" w:eastAsia="zh-TW"/>
+        </w:rPr>
+        <w:t>進度：把</w:t>
+      </w:r>
+      <w:r>
+        <w:rPr>
+          <w:rFonts w:hint="default" w:eastAsia="新細明體"/>
+          <w:lang w:val="en-US" w:eastAsia="zh-TW"/>
+        </w:rPr>
+        <w:t xml:space="preserve">ai </w:t>
+      </w:r>
+      <w:r>
+        <w:rPr>
+          <w:rFonts w:hint="eastAsia" w:eastAsia="新細明體"/>
+          <w:lang w:val="en-US" w:eastAsia="zh-TW"/>
+        </w:rPr>
+        <w:t>摘要的前端呈現出來</w:t>
+      </w:r>
+    </w:p>
+    <w:p>
+      <w:pPr>
+        <w:pStyle w:val="28"/>
+        <w:widowControl w:val="0"/>
+        <w:numPr>
+          <w:numId w:val="0"/>
+        </w:numPr>
+        <w:spacing w:after="160" w:line="278" w:lineRule="auto"/>
+        <w:ind w:leftChars="0" w:firstLine="480" w:firstLineChars="0"/>
+        <w:contextualSpacing/>
+      </w:pPr>
+      <w:r>
+        <w:drawing>
+          <wp:inline distT="0" distB="0" distL="114300" distR="114300">
+            <wp:extent cx="5273675" cy="3321685"/>
+            <wp:effectExtent l="0" t="0" r="9525" b="5715"/>
+            <wp:docPr id="2" name="圖片 1"/>
+            <wp:cNvGraphicFramePr>
+              <a:graphicFrameLocks xmlns:a="http://schemas.openxmlformats.org/drawingml/2006/main" noChangeAspect="1"/>
+            </wp:cNvGraphicFramePr>
+            <a:graphic xmlns:a="http://schemas.openxmlformats.org/drawingml/2006/main">
+              <a:graphicData uri="http://schemas.openxmlformats.org/drawingml/2006/picture">
+                <pic:pic xmlns:pic="http://schemas.openxmlformats.org/drawingml/2006/picture">
+                  <pic:nvPicPr>
+                    <pic:cNvPr id="2" name="圖片 1"/>
+                    <pic:cNvPicPr>
+                      <a:picLocks noChangeAspect="1"/>
+                    </pic:cNvPicPr>
+                  </pic:nvPicPr>
+                  <pic:blipFill>
+                    <a:blip r:embed="rId7"/>
+                    <a:stretch>
+                      <a:fillRect/>
+                    </a:stretch>
+                  </pic:blipFill>
+                  <pic:spPr>
+                    <a:xfrm>
+                      <a:off x="0" y="0"/>
+                      <a:ext cx="5273675" cy="3321685"/>
+                    </a:xfrm>
+                    <a:prstGeom prst="rect">
+                      <a:avLst/>
+                    </a:prstGeom>
+                    <a:noFill/>
+                    <a:ln>
+                      <a:noFill/>
+                    </a:ln>
+                  </pic:spPr>
+                </pic:pic>
+              </a:graphicData>
+            </a:graphic>
+          </wp:inline>
+        </w:drawing>
+      </w:r>
+    </w:p>
+    <w:p>
+      <w:pPr>
+        <w:pStyle w:val="28"/>
+        <w:widowControl w:val="0"/>
+        <w:numPr>
+          <w:ilvl w:val="0"/>
+          <w:numId w:val="6"/>
+        </w:numPr>
+        <w:spacing w:after="160" w:line="278" w:lineRule="auto"/>
+        <w:ind w:left="420" w:leftChars="0" w:hanging="420" w:firstLineChars="0"/>
+        <w:contextualSpacing/>
+        <w:rPr>
+          <w:rFonts w:hint="default" w:eastAsia="新細明體"/>
+          <w:lang w:val="en-US"/>
+        </w:rPr>
+      </w:pPr>
+      <w:r>
+        <w:rPr>
+          <w:rFonts w:hint="eastAsia" w:eastAsia="新細明體"/>
+          <w:lang w:val="en-US" w:eastAsia="zh-TW"/>
+        </w:rPr>
+        <w:t>下次進度</w:t>
+      </w:r>
+    </w:p>
+    <w:p>
+      <w:pPr>
+        <w:pStyle w:val="28"/>
+        <w:widowControl w:val="0"/>
+        <w:numPr>
+          <w:ilvl w:val="1"/>
+          <w:numId w:val="6"/>
+        </w:numPr>
+        <w:spacing w:after="160" w:line="278" w:lineRule="auto"/>
+        <w:ind w:left="840" w:leftChars="0" w:hanging="420" w:firstLineChars="0"/>
+        <w:contextualSpacing/>
+        <w:rPr>
+          <w:rFonts w:hint="default" w:eastAsia="新細明體"/>
+          <w:lang w:val="en-US"/>
+        </w:rPr>
+      </w:pPr>
+      <w:r>
+        <w:rPr>
+          <w:rFonts w:hint="eastAsia" w:eastAsia="新細明體"/>
+          <w:lang w:val="en-US" w:eastAsia="zh-TW"/>
+        </w:rPr>
+        <w:t xml:space="preserve">修改 </w:t>
+      </w:r>
+      <w:r>
+        <w:rPr>
+          <w:rFonts w:hint="default" w:eastAsia="新細明體"/>
+          <w:lang w:val="en-US" w:eastAsia="zh-TW"/>
+        </w:rPr>
+        <w:t>AI</w:t>
+      </w:r>
       <w:bookmarkStart w:id="0" w:name="_GoBack"/>
       <w:bookmarkEnd w:id="0"/>
+      <w:r>
+        <w:rPr>
+          <w:rFonts w:hint="default" w:eastAsia="新細明體"/>
+          <w:lang w:val="en-US" w:eastAsia="zh-TW"/>
+        </w:rPr>
+        <w:t xml:space="preserve"> </w:t>
+      </w:r>
+      <w:r>
+        <w:rPr>
+          <w:rFonts w:hint="eastAsia" w:eastAsia="新細明體"/>
+          <w:lang w:val="en-US" w:eastAsia="zh-TW"/>
+        </w:rPr>
+        <w:t xml:space="preserve">摘要的 </w:t>
+      </w:r>
+      <w:r>
+        <w:rPr>
+          <w:rFonts w:hint="default" w:eastAsia="新細明體"/>
+          <w:lang w:val="en-US" w:eastAsia="zh-TW"/>
+        </w:rPr>
+        <w:t>system prompt</w:t>
+      </w:r>
+      <w:r>
+        <w:rPr>
+          <w:rFonts w:hint="eastAsia" w:eastAsia="新細明體"/>
+          <w:lang w:val="en-US" w:eastAsia="zh-TW"/>
+        </w:rPr>
+        <w:t>：例如要加上前後頁數</w:t>
+      </w:r>
+    </w:p>
+    <w:p>
+      <w:pPr>
+        <w:pStyle w:val="28"/>
+        <w:widowControl w:val="0"/>
+        <w:numPr>
+          <w:ilvl w:val="1"/>
+          <w:numId w:val="6"/>
+        </w:numPr>
+        <w:spacing w:after="160" w:line="278" w:lineRule="auto"/>
+        <w:ind w:left="840" w:leftChars="0" w:hanging="420" w:firstLineChars="0"/>
+        <w:contextualSpacing/>
+        <w:rPr>
+          <w:rFonts w:hint="default" w:eastAsia="新細明體"/>
+          <w:lang w:val="en-US"/>
+        </w:rPr>
+      </w:pPr>
+      <w:r>
+        <w:rPr>
+          <w:rFonts w:hint="eastAsia" w:eastAsia="新細明體"/>
+          <w:lang w:val="en-US" w:eastAsia="zh-TW"/>
+        </w:rPr>
+        <w:t xml:space="preserve">根據滑動頁面去出發 </w:t>
+      </w:r>
+      <w:r>
+        <w:rPr>
+          <w:rFonts w:hint="default" w:eastAsia="新細明體"/>
+          <w:lang w:val="en-US" w:eastAsia="zh-TW"/>
+        </w:rPr>
+        <w:t>summary api</w:t>
+      </w:r>
+      <w:r>
+        <w:rPr>
+          <w:rFonts w:hint="eastAsia" w:eastAsia="新細明體"/>
+          <w:lang w:val="en-US" w:eastAsia="zh-TW"/>
+        </w:rPr>
+        <w:t xml:space="preserve">，不要一次把所有頁數都打 </w:t>
+      </w:r>
+      <w:r>
+        <w:rPr>
+          <w:rFonts w:hint="default" w:eastAsia="新細明體"/>
+          <w:lang w:val="en-US" w:eastAsia="zh-TW"/>
+        </w:rPr>
+        <w:t>request</w:t>
+      </w:r>
+    </w:p>
+    <w:p>
+      <w:pPr>
+        <w:pStyle w:val="28"/>
+        <w:widowControl w:val="0"/>
+        <w:numPr>
+          <w:ilvl w:val="1"/>
+          <w:numId w:val="6"/>
+        </w:numPr>
+        <w:spacing w:after="160" w:line="278" w:lineRule="auto"/>
+        <w:ind w:left="840" w:leftChars="0" w:hanging="420" w:firstLineChars="0"/>
+        <w:contextualSpacing/>
+        <w:rPr>
+          <w:rFonts w:hint="default" w:eastAsia="新細明體"/>
+          <w:lang w:val="en-US"/>
+        </w:rPr>
+      </w:pPr>
+      <w:r>
+        <w:rPr>
+          <w:rFonts w:hint="eastAsia" w:eastAsia="新細明體"/>
+          <w:lang w:val="en-US" w:eastAsia="zh-TW"/>
+        </w:rPr>
+        <w:t xml:space="preserve">整個 </w:t>
+      </w:r>
+      <w:r>
+        <w:rPr>
+          <w:rFonts w:hint="default" w:eastAsia="新細明體"/>
+          <w:lang w:val="en-US" w:eastAsia="zh-TW"/>
+        </w:rPr>
+        <w:t xml:space="preserve">UI/UX </w:t>
+      </w:r>
+      <w:r>
+        <w:rPr>
+          <w:rFonts w:hint="eastAsia" w:eastAsia="新細明體"/>
+          <w:lang w:val="en-US" w:eastAsia="zh-TW"/>
+        </w:rPr>
+        <w:t>要大改，例如上傳檔案時不用等所有</w:t>
+      </w:r>
+      <w:r>
+        <w:rPr>
+          <w:rFonts w:hint="default" w:eastAsia="新細明體"/>
+          <w:lang w:val="en-US" w:eastAsia="zh-TW"/>
+        </w:rPr>
+        <w:t xml:space="preserve">summary </w:t>
+      </w:r>
+      <w:r>
+        <w:rPr>
+          <w:rFonts w:hint="eastAsia" w:eastAsia="新細明體"/>
+          <w:lang w:val="en-US" w:eastAsia="zh-TW"/>
+        </w:rPr>
+        <w:t xml:space="preserve">做完再跳轉頁面、上傳檔案的 </w:t>
+      </w:r>
+      <w:r>
+        <w:rPr>
+          <w:rFonts w:hint="default" w:eastAsia="新細明體"/>
+          <w:lang w:val="en-US" w:eastAsia="zh-TW"/>
+        </w:rPr>
+        <w:t xml:space="preserve">UI </w:t>
+      </w:r>
+      <w:r>
+        <w:rPr>
+          <w:rFonts w:hint="eastAsia" w:eastAsia="新細明體"/>
+          <w:lang w:val="en-US" w:eastAsia="zh-TW"/>
+        </w:rPr>
+        <w:t>要修</w:t>
+      </w:r>
+    </w:p>
+    <w:p>
+      <w:pPr>
+        <w:pStyle w:val="28"/>
+        <w:widowControl w:val="0"/>
+        <w:numPr>
+          <w:ilvl w:val="1"/>
+          <w:numId w:val="6"/>
+        </w:numPr>
+        <w:spacing w:after="160" w:line="278" w:lineRule="auto"/>
+        <w:ind w:left="840" w:leftChars="0" w:hanging="420" w:firstLineChars="0"/>
+        <w:contextualSpacing/>
+        <w:rPr>
+          <w:rFonts w:hint="default"/>
+          <w:lang w:val="en-US" w:eastAsia="zh-TW"/>
+        </w:rPr>
+      </w:pPr>
+      <w:r>
+        <w:rPr>
+          <w:rFonts w:hint="eastAsia" w:eastAsia="新細明體"/>
+          <w:lang w:val="en-US" w:eastAsia="zh-TW"/>
+        </w:rPr>
+        <w:t>疑問：為何每次上傳檔案後，本地都會存該</w:t>
+      </w:r>
+      <w:r>
+        <w:rPr>
+          <w:rFonts w:hint="default" w:eastAsia="新細明體"/>
+          <w:lang w:val="en-US" w:eastAsia="zh-TW"/>
+        </w:rPr>
+        <w:t xml:space="preserve"> pdf </w:t>
+      </w:r>
+      <w:r>
+        <w:rPr>
+          <w:rFonts w:hint="eastAsia" w:eastAsia="新細明體"/>
+          <w:lang w:val="en-US" w:eastAsia="zh-TW"/>
+        </w:rPr>
+        <w:t>檔案？不是存在資料庫了？</w:t>
+      </w:r>
     </w:p>
     <w:sectPr>
       <w:pgSz w:w="11906" w:h="16838"/>
@@ -2214,6 +2661,26 @@
           <w:tab w:val="left" w:pos="3780"/>
         </w:tabs>
         <w:ind w:left="3780" w:leftChars="0" w:hanging="420" w:firstLineChars="0"/>
+      </w:pPr>
+      <w:rPr>
+        <w:rFonts w:hint="default" w:ascii="Wingdings" w:hAnsi="Wingdings"/>
+      </w:rPr>
+    </w:lvl>
+  </w:abstractNum>
+  <w:abstractNum w:abstractNumId="6">
+    <w:nsid w:val="7FFBCA86"/>
+    <w:multiLevelType w:val="singleLevel"/>
+    <w:tmpl w:val="7FFBCA86"/>
+    <w:lvl w:ilvl="0" w:tentative="0">
+      <w:start w:val="1"/>
+      <w:numFmt w:val="bullet"/>
+      <w:lvlText w:val=""/>
+      <w:lvlJc w:val="left"/>
+      <w:pPr>
+        <w:tabs>
+          <w:tab w:val="left" w:pos="420"/>
+        </w:tabs>
+        <w:ind w:left="420" w:leftChars="0" w:hanging="420" w:firstLineChars="0"/>
       </w:pPr>
       <w:rPr>
         <w:rFonts w:hint="default" w:ascii="Wingdings" w:hAnsi="Wingdings"/>
@@ -2237,6 +2704,9 @@
   </w:num>
   <w:num w:numId="6">
     <w:abstractNumId w:val="5"/>
+  </w:num>
+  <w:num w:numId="7">
+    <w:abstractNumId w:val="6"/>
   </w:num>
 </w:numbering>
 </file>

</xml_diff>

<commit_message>
feat: add QAEntry model, API for question answering, and integrate Q&A feature in PDF viewer
</commit_message>
<xml_diff>
--- a/日記.docx
+++ b/日記.docx
@@ -1595,6 +1595,7 @@
         <w:pStyle w:val="28"/>
         <w:widowControl w:val="0"/>
         <w:numPr>
+          <w:ilvl w:val="0"/>
           <w:numId w:val="0"/>
         </w:numPr>
         <w:spacing w:after="160" w:line="278" w:lineRule="auto"/>
@@ -1655,6 +1656,7 @@
         <w:pStyle w:val="28"/>
         <w:widowControl w:val="0"/>
         <w:numPr>
+          <w:ilvl w:val="0"/>
           <w:numId w:val="0"/>
         </w:numPr>
         <w:spacing w:after="160" w:line="278" w:lineRule="auto"/>
@@ -1757,16 +1759,7 @@
           <w:rFonts w:hint="default" w:eastAsia="新細明體"/>
           <w:lang w:val="en-US" w:eastAsia="zh-TW"/>
         </w:rPr>
-        <w:t>AI</w:t>
-      </w:r>
-      <w:bookmarkStart w:id="0" w:name="_GoBack"/>
-      <w:bookmarkEnd w:id="0"/>
-      <w:r>
-        <w:rPr>
-          <w:rFonts w:hint="default" w:eastAsia="新細明體"/>
-          <w:lang w:val="en-US" w:eastAsia="zh-TW"/>
-        </w:rPr>
-        <w:t xml:space="preserve"> </w:t>
+        <w:t xml:space="preserve">AI </w:t>
       </w:r>
       <w:r>
         <w:rPr>
@@ -1811,7 +1804,7 @@
           <w:rFonts w:hint="eastAsia" w:eastAsia="新細明體"/>
           <w:lang w:val="en-US" w:eastAsia="zh-TW"/>
         </w:rPr>
-        <w:t xml:space="preserve">根據滑動頁面去出發 </w:t>
+        <w:t xml:space="preserve">根據滑動頁面去觸發 </w:t>
       </w:r>
       <w:r>
         <w:rPr>
@@ -1938,6 +1931,8 @@
         </w:rPr>
         <w:t>檔案？不是存在資料庫了？</w:t>
       </w:r>
+      <w:bookmarkStart w:id="0" w:name="_GoBack"/>
+      <w:bookmarkEnd w:id="0"/>
     </w:p>
     <w:sectPr>
       <w:pgSz w:w="11906" w:h="16838"/>

</xml_diff>

<commit_message>
feat: implement Q&A history retrieval and enhance PDF viewer interaction
</commit_message>
<xml_diff>
--- a/日記.docx
+++ b/日記.docx
@@ -1931,8 +1931,725 @@
         </w:rPr>
         <w:t>檔案？不是存在資料庫了？</w:t>
       </w:r>
+    </w:p>
+    <w:p>
+      <w:pPr>
+        <w:pStyle w:val="28"/>
+        <w:widowControl w:val="0"/>
+        <w:numPr>
+          <w:ilvl w:val="0"/>
+          <w:numId w:val="0"/>
+        </w:numPr>
+        <w:spacing w:after="160" w:line="278" w:lineRule="auto"/>
+        <w:ind w:leftChars="0"/>
+        <w:contextualSpacing/>
+        <w:rPr>
+          <w:rFonts w:hint="default" w:eastAsia="新細明體"/>
+          <w:lang w:val="en-US" w:eastAsia="zh-TW"/>
+        </w:rPr>
+      </w:pPr>
+      <w:r>
+        <w:rPr>
+          <w:rFonts w:hint="default" w:eastAsia="新細明體"/>
+          <w:lang w:val="en-US" w:eastAsia="zh-TW"/>
+        </w:rPr>
+        <w:t>6/14</w:t>
+      </w:r>
+    </w:p>
+    <w:p>
+      <w:pPr>
+        <w:pStyle w:val="28"/>
+        <w:widowControl w:val="0"/>
+        <w:numPr>
+          <w:ilvl w:val="0"/>
+          <w:numId w:val="8"/>
+        </w:numPr>
+        <w:spacing w:after="160" w:line="278" w:lineRule="auto"/>
+        <w:ind w:left="420" w:leftChars="0" w:hanging="420" w:firstLineChars="0"/>
+        <w:contextualSpacing/>
+        <w:rPr>
+          <w:rFonts w:hint="default" w:eastAsia="新細明體"/>
+          <w:lang w:val="en-US" w:eastAsia="zh-TW"/>
+        </w:rPr>
+      </w:pPr>
+      <w:r>
+        <w:rPr>
+          <w:rFonts w:hint="eastAsia" w:eastAsia="新細明體"/>
+          <w:lang w:val="en-US" w:eastAsia="zh-TW"/>
+        </w:rPr>
+        <w:t>進度：</w:t>
+      </w:r>
+    </w:p>
+    <w:p>
+      <w:pPr>
+        <w:pStyle w:val="28"/>
+        <w:widowControl w:val="0"/>
+        <w:numPr>
+          <w:ilvl w:val="1"/>
+          <w:numId w:val="8"/>
+        </w:numPr>
+        <w:spacing w:after="160" w:line="278" w:lineRule="auto"/>
+        <w:ind w:left="840" w:leftChars="0" w:hanging="420" w:firstLineChars="0"/>
+        <w:contextualSpacing/>
+        <w:rPr>
+          <w:rFonts w:hint="default" w:eastAsia="新細明體"/>
+          <w:lang w:val="en-US" w:eastAsia="zh-TW"/>
+        </w:rPr>
+      </w:pPr>
+      <w:r>
+        <w:rPr>
+          <w:rFonts w:hint="eastAsia" w:eastAsia="新細明體"/>
+          <w:lang w:val="en-US" w:eastAsia="zh-TW"/>
+        </w:rPr>
+        <w:t xml:space="preserve">修改 </w:t>
+      </w:r>
+      <w:r>
+        <w:rPr>
+          <w:rFonts w:hint="default" w:eastAsia="新細明體"/>
+          <w:lang w:val="en-US" w:eastAsia="zh-TW"/>
+        </w:rPr>
+        <w:t xml:space="preserve">AI </w:t>
+      </w:r>
+      <w:r>
+        <w:rPr>
+          <w:rFonts w:hint="eastAsia" w:eastAsia="新細明體"/>
+          <w:lang w:val="en-US" w:eastAsia="zh-TW"/>
+        </w:rPr>
+        <w:t xml:space="preserve">摘要的 </w:t>
+      </w:r>
+      <w:r>
+        <w:rPr>
+          <w:rFonts w:hint="default" w:eastAsia="新細明體"/>
+          <w:lang w:val="en-US" w:eastAsia="zh-TW"/>
+        </w:rPr>
+        <w:t>system prompt</w:t>
+      </w:r>
+    </w:p>
+    <w:p>
+      <w:pPr>
+        <w:pStyle w:val="28"/>
+        <w:widowControl w:val="0"/>
+        <w:numPr>
+          <w:ilvl w:val="1"/>
+          <w:numId w:val="8"/>
+        </w:numPr>
+        <w:spacing w:after="160" w:line="278" w:lineRule="auto"/>
+        <w:ind w:left="840" w:leftChars="0" w:hanging="420" w:firstLineChars="0"/>
+        <w:contextualSpacing/>
+        <w:rPr>
+          <w:rFonts w:hint="default" w:eastAsia="新細明體"/>
+          <w:lang w:val="en-US" w:eastAsia="zh-TW"/>
+        </w:rPr>
+      </w:pPr>
+      <w:r>
+        <w:rPr>
+          <w:rFonts w:hint="eastAsia" w:eastAsia="新細明體"/>
+          <w:lang w:val="en-US" w:eastAsia="zh-TW"/>
+        </w:rPr>
+        <w:t xml:space="preserve">修改整個 </w:t>
+      </w:r>
+      <w:r>
+        <w:rPr>
+          <w:rFonts w:hint="default" w:eastAsia="新細明體"/>
+          <w:lang w:val="en-US" w:eastAsia="zh-TW"/>
+        </w:rPr>
+        <w:t xml:space="preserve">UI/UX </w:t>
+      </w:r>
+    </w:p>
+    <w:p>
+      <w:pPr>
+        <w:pStyle w:val="28"/>
+        <w:widowControl w:val="0"/>
+        <w:numPr>
+          <w:ilvl w:val="1"/>
+          <w:numId w:val="8"/>
+        </w:numPr>
+        <w:spacing w:after="160" w:line="278" w:lineRule="auto"/>
+        <w:ind w:left="840" w:leftChars="0" w:hanging="420" w:firstLineChars="0"/>
+        <w:contextualSpacing/>
+        <w:rPr>
+          <w:rFonts w:hint="default" w:eastAsia="新細明體"/>
+          <w:lang w:val="en-US" w:eastAsia="zh-TW"/>
+        </w:rPr>
+      </w:pPr>
+      <w:r>
+        <w:rPr>
+          <w:rFonts w:hint="eastAsia" w:eastAsia="新細明體"/>
+          <w:lang w:val="en-US" w:eastAsia="zh-TW"/>
+        </w:rPr>
+        <w:t xml:space="preserve">新增 </w:t>
+      </w:r>
+      <w:r>
+        <w:rPr>
+          <w:rFonts w:hint="default" w:eastAsia="新細明體"/>
+          <w:lang w:val="en-US" w:eastAsia="zh-TW"/>
+        </w:rPr>
+        <w:t>QA API</w:t>
+      </w:r>
+      <w:r>
+        <w:rPr>
+          <w:rFonts w:hint="eastAsia" w:eastAsia="新細明體"/>
+          <w:lang w:val="en-US" w:eastAsia="zh-TW"/>
+        </w:rPr>
+        <w:t>、</w:t>
+      </w:r>
+      <w:r>
+        <w:rPr>
+          <w:rFonts w:hint="default" w:eastAsia="新細明體"/>
+          <w:lang w:val="en-US" w:eastAsia="zh-TW"/>
+        </w:rPr>
+        <w:t>components</w:t>
+      </w:r>
+      <w:r>
+        <w:rPr>
+          <w:rFonts w:hint="eastAsia" w:eastAsia="新細明體"/>
+          <w:lang w:val="en-US" w:eastAsia="zh-TW"/>
+        </w:rPr>
+        <w:t>，讓使用者可以針對特定文字去做追問</w:t>
+      </w:r>
+    </w:p>
+    <w:p>
+      <w:pPr>
+        <w:pStyle w:val="28"/>
+        <w:widowControl w:val="0"/>
+        <w:numPr>
+          <w:ilvl w:val="0"/>
+          <w:numId w:val="8"/>
+        </w:numPr>
+        <w:spacing w:after="160" w:line="278" w:lineRule="auto"/>
+        <w:ind w:left="420" w:leftChars="0" w:hanging="420" w:firstLineChars="0"/>
+        <w:contextualSpacing/>
+        <w:rPr>
+          <w:rFonts w:hint="default" w:eastAsia="新細明體"/>
+          <w:lang w:val="en-US" w:eastAsia="zh-TW"/>
+        </w:rPr>
+      </w:pPr>
+      <w:r>
+        <w:rPr>
+          <w:rFonts w:hint="eastAsia" w:eastAsia="新細明體"/>
+          <w:lang w:val="en-US" w:eastAsia="zh-TW"/>
+        </w:rPr>
+        <w:t>新想法：</w:t>
+      </w:r>
+    </w:p>
+    <w:p>
+      <w:pPr>
+        <w:pStyle w:val="28"/>
+        <w:widowControl w:val="0"/>
+        <w:numPr>
+          <w:ilvl w:val="1"/>
+          <w:numId w:val="8"/>
+        </w:numPr>
+        <w:spacing w:after="160" w:line="278" w:lineRule="auto"/>
+        <w:ind w:left="840" w:leftChars="0" w:hanging="420" w:firstLineChars="0"/>
+        <w:contextualSpacing/>
+        <w:rPr>
+          <w:rFonts w:hint="default" w:eastAsia="新細明體"/>
+          <w:lang w:val="en-US" w:eastAsia="zh-TW"/>
+        </w:rPr>
+      </w:pPr>
+      <w:r>
+        <w:rPr>
+          <w:rFonts w:hint="eastAsia" w:eastAsia="新細明體"/>
+          <w:lang w:val="en-US" w:eastAsia="zh-TW"/>
+        </w:rPr>
+        <w:t xml:space="preserve">可以給使用者設定客製化的 </w:t>
+      </w:r>
+      <w:r>
+        <w:rPr>
+          <w:rFonts w:hint="default" w:eastAsia="新細明體"/>
+          <w:lang w:val="en-US" w:eastAsia="zh-TW"/>
+        </w:rPr>
+        <w:t>system prompt</w:t>
+      </w:r>
+    </w:p>
+    <w:p>
+      <w:pPr>
+        <w:pStyle w:val="28"/>
+        <w:widowControl w:val="0"/>
+        <w:numPr>
+          <w:ilvl w:val="1"/>
+          <w:numId w:val="8"/>
+        </w:numPr>
+        <w:spacing w:after="160" w:line="278" w:lineRule="auto"/>
+        <w:ind w:left="840" w:leftChars="0" w:hanging="420" w:firstLineChars="0"/>
+        <w:contextualSpacing/>
+        <w:rPr>
+          <w:rFonts w:hint="default" w:eastAsia="新細明體"/>
+          <w:lang w:val="en-US" w:eastAsia="zh-TW"/>
+        </w:rPr>
+      </w:pPr>
+      <w:r>
+        <w:rPr>
+          <w:rFonts w:hint="eastAsia" w:eastAsia="新細明體"/>
+          <w:lang w:val="en-US" w:eastAsia="zh-TW"/>
+        </w:rPr>
+        <w:t>可以提供檔案管理功能，之前上傳的檔案要留存在主頁面</w:t>
+      </w:r>
+    </w:p>
+    <w:p>
+      <w:pPr>
+        <w:pStyle w:val="28"/>
+        <w:widowControl w:val="0"/>
+        <w:numPr>
+          <w:ilvl w:val="0"/>
+          <w:numId w:val="0"/>
+        </w:numPr>
+        <w:spacing w:after="160" w:line="278" w:lineRule="auto"/>
+        <w:contextualSpacing/>
+        <w:rPr>
+          <w:rFonts w:hint="eastAsia" w:eastAsia="新細明體"/>
+          <w:lang w:val="en-US" w:eastAsia="zh-TW"/>
+        </w:rPr>
+      </w:pPr>
+    </w:p>
+    <w:p>
+      <w:pPr>
+        <w:pStyle w:val="28"/>
+        <w:widowControl w:val="0"/>
+        <w:numPr>
+          <w:ilvl w:val="0"/>
+          <w:numId w:val="0"/>
+        </w:numPr>
+        <w:spacing w:after="160" w:line="278" w:lineRule="auto"/>
+        <w:contextualSpacing/>
+        <w:rPr>
+          <w:rFonts w:hint="default" w:eastAsia="新細明體"/>
+          <w:lang w:val="en-US" w:eastAsia="zh-TW"/>
+        </w:rPr>
+      </w:pPr>
+      <w:r>
+        <w:rPr>
+          <w:rFonts w:hint="default" w:eastAsia="新細明體"/>
+          <w:lang w:val="en-US" w:eastAsia="zh-TW"/>
+        </w:rPr>
+        <w:t>6/15</w:t>
+      </w:r>
+    </w:p>
+    <w:p>
+      <w:pPr>
+        <w:pStyle w:val="28"/>
+        <w:widowControl w:val="0"/>
+        <w:numPr>
+          <w:ilvl w:val="0"/>
+          <w:numId w:val="9"/>
+        </w:numPr>
+        <w:spacing w:after="160" w:line="278" w:lineRule="auto"/>
+        <w:ind w:left="420" w:leftChars="0" w:hanging="420" w:firstLineChars="0"/>
+        <w:contextualSpacing/>
+        <w:rPr>
+          <w:rFonts w:hint="default" w:eastAsia="新細明體"/>
+          <w:lang w:val="en-US" w:eastAsia="zh-TW"/>
+        </w:rPr>
+      </w:pPr>
+      <w:r>
+        <w:rPr>
+          <w:rFonts w:hint="eastAsia" w:eastAsia="新細明體"/>
+          <w:lang w:val="en-US" w:eastAsia="zh-TW"/>
+        </w:rPr>
+        <w:t xml:space="preserve">進度：修改 </w:t>
+      </w:r>
+      <w:r>
+        <w:rPr>
+          <w:rFonts w:hint="default" w:eastAsia="新細明體"/>
+          <w:lang w:val="en-US" w:eastAsia="zh-TW"/>
+        </w:rPr>
+        <w:t xml:space="preserve">QA </w:t>
+      </w:r>
+      <w:r>
+        <w:rPr>
+          <w:rFonts w:hint="eastAsia" w:eastAsia="新細明體"/>
+          <w:lang w:val="en-US" w:eastAsia="zh-TW"/>
+        </w:rPr>
+        <w:t xml:space="preserve">的 </w:t>
+      </w:r>
+      <w:r>
+        <w:rPr>
+          <w:rFonts w:hint="default" w:eastAsia="新細明體"/>
+          <w:lang w:val="en-US" w:eastAsia="zh-TW"/>
+        </w:rPr>
+        <w:t>bug</w:t>
+      </w:r>
+      <w:r>
+        <w:rPr>
+          <w:rFonts w:hint="eastAsia" w:eastAsia="新細明體"/>
+          <w:lang w:val="en-US" w:eastAsia="zh-TW"/>
+        </w:rPr>
+        <w:t xml:space="preserve">，換頁時會重新刷新 </w:t>
+      </w:r>
+      <w:r>
+        <w:rPr>
+          <w:rFonts w:hint="default" w:eastAsia="新細明體"/>
+          <w:lang w:val="en-US" w:eastAsia="zh-TW"/>
+        </w:rPr>
+        <w:t xml:space="preserve">QA state </w:t>
+      </w:r>
+    </w:p>
+    <w:p>
+      <w:pPr>
+        <w:pStyle w:val="28"/>
+        <w:widowControl w:val="0"/>
+        <w:numPr>
+          <w:ilvl w:val="0"/>
+          <w:numId w:val="9"/>
+        </w:numPr>
+        <w:spacing w:after="160" w:line="278" w:lineRule="auto"/>
+        <w:ind w:left="420" w:leftChars="0" w:hanging="420" w:firstLineChars="0"/>
+        <w:contextualSpacing/>
+        <w:rPr>
+          <w:rFonts w:hint="default" w:eastAsia="新細明體"/>
+          <w:lang w:val="en-US" w:eastAsia="zh-TW"/>
+        </w:rPr>
+      </w:pPr>
+      <w:r>
+        <w:rPr>
+          <w:rFonts w:hint="eastAsia" w:eastAsia="新細明體"/>
+          <w:lang w:val="en-US" w:eastAsia="zh-TW"/>
+        </w:rPr>
+        <w:t>規劃：</w:t>
+      </w:r>
+    </w:p>
+    <w:p>
+      <w:pPr>
+        <w:pStyle w:val="28"/>
+        <w:widowControl w:val="0"/>
+        <w:numPr>
+          <w:ilvl w:val="1"/>
+          <w:numId w:val="8"/>
+        </w:numPr>
+        <w:spacing w:after="160" w:line="278" w:lineRule="auto"/>
+        <w:ind w:left="840" w:leftChars="0" w:hanging="420" w:firstLineChars="0"/>
+        <w:contextualSpacing/>
+        <w:rPr>
+          <w:rFonts w:hint="default" w:eastAsia="新細明體"/>
+          <w:lang w:val="en-US" w:eastAsia="zh-TW"/>
+        </w:rPr>
+      </w:pPr>
+      <w:r>
+        <w:rPr>
+          <w:rFonts w:hint="eastAsia" w:eastAsia="新細明體"/>
+          <w:lang w:val="en-US" w:eastAsia="zh-TW"/>
+        </w:rPr>
+        <w:t xml:space="preserve">給使用者設定客製化的 </w:t>
+      </w:r>
+      <w:r>
+        <w:rPr>
+          <w:rFonts w:hint="default" w:eastAsia="新細明體"/>
+          <w:lang w:val="en-US" w:eastAsia="zh-TW"/>
+        </w:rPr>
+        <w:t>system prompt</w:t>
+      </w:r>
+      <w:r>
+        <w:rPr>
+          <w:rFonts w:hint="eastAsia" w:eastAsia="新細明體"/>
+          <w:lang w:val="en-US" w:eastAsia="zh-TW"/>
+        </w:rPr>
+        <w:t xml:space="preserve"> </w:t>
+      </w:r>
+      <w:r>
+        <w:rPr>
+          <w:rFonts w:hint="default" w:eastAsia="新細明體"/>
+          <w:lang w:val="en-US" w:eastAsia="zh-TW"/>
+        </w:rPr>
+        <w:t xml:space="preserve">-&gt; </w:t>
+      </w:r>
+      <w:r>
+        <w:rPr>
+          <w:rFonts w:hint="eastAsia" w:eastAsia="新細明體"/>
+          <w:lang w:val="en-US" w:eastAsia="zh-TW"/>
+        </w:rPr>
+        <w:t xml:space="preserve">甚至可以先讀完整份 </w:t>
+      </w:r>
+      <w:r>
+        <w:rPr>
+          <w:rFonts w:hint="default" w:eastAsia="新細明體"/>
+          <w:lang w:val="en-US" w:eastAsia="zh-TW"/>
+        </w:rPr>
+        <w:t xml:space="preserve">pdf </w:t>
+      </w:r>
+      <w:r>
+        <w:rPr>
+          <w:rFonts w:hint="eastAsia" w:eastAsia="新細明體"/>
+          <w:lang w:val="en-US" w:eastAsia="zh-TW"/>
+        </w:rPr>
+        <w:t xml:space="preserve">後給推薦的 </w:t>
+      </w:r>
+      <w:r>
+        <w:rPr>
+          <w:rFonts w:hint="default" w:eastAsia="新細明體"/>
+          <w:lang w:val="en-US" w:eastAsia="zh-TW"/>
+        </w:rPr>
+        <w:t>prompt</w:t>
+      </w:r>
+    </w:p>
+    <w:p>
+      <w:pPr>
+        <w:pStyle w:val="28"/>
+        <w:widowControl w:val="0"/>
+        <w:numPr>
+          <w:ilvl w:val="1"/>
+          <w:numId w:val="9"/>
+        </w:numPr>
+        <w:spacing w:after="160" w:line="278" w:lineRule="auto"/>
+        <w:ind w:left="840" w:leftChars="0" w:hanging="420" w:firstLineChars="0"/>
+        <w:contextualSpacing/>
+        <w:rPr>
+          <w:rFonts w:hint="default" w:eastAsia="新細明體"/>
+          <w:lang w:val="en-US" w:eastAsia="zh-TW"/>
+        </w:rPr>
+      </w:pPr>
+      <w:r>
+        <w:rPr>
+          <w:rFonts w:hint="eastAsia" w:eastAsia="新細明體"/>
+          <w:lang w:val="en-US" w:eastAsia="zh-TW"/>
+        </w:rPr>
+        <w:t>把</w:t>
+      </w:r>
+      <w:r>
+        <w:rPr>
+          <w:rFonts w:hint="default" w:eastAsia="新細明體"/>
+          <w:lang w:val="en-US" w:eastAsia="zh-TW"/>
+        </w:rPr>
+        <w:t xml:space="preserve">QA </w:t>
+      </w:r>
+      <w:r>
+        <w:rPr>
+          <w:rFonts w:hint="eastAsia" w:eastAsia="新細明體"/>
+          <w:lang w:val="en-US" w:eastAsia="zh-TW"/>
+        </w:rPr>
+        <w:t>功能改放在</w:t>
+      </w:r>
+      <w:r>
+        <w:rPr>
+          <w:rFonts w:hint="default" w:eastAsia="新細明體"/>
+          <w:lang w:val="en-US" w:eastAsia="zh-TW"/>
+        </w:rPr>
+        <w:t>summary</w:t>
+      </w:r>
+      <w:r>
+        <w:rPr>
+          <w:rFonts w:hint="eastAsia" w:eastAsia="新細明體"/>
+          <w:lang w:val="en-US" w:eastAsia="zh-TW"/>
+        </w:rPr>
+        <w:t>下面，加入一個對話匡，讓使用者選取後可以自動變成</w:t>
+      </w:r>
+      <w:r>
+        <w:rPr>
+          <w:rFonts w:hint="default" w:eastAsia="新細明體"/>
+          <w:lang w:val="en-US" w:eastAsia="zh-TW"/>
+        </w:rPr>
+        <w:t>prompt</w:t>
+      </w:r>
+      <w:r>
+        <w:rPr>
+          <w:rFonts w:hint="eastAsia" w:eastAsia="新細明體"/>
+          <w:lang w:val="en-US" w:eastAsia="zh-TW"/>
+        </w:rPr>
+        <w:t xml:space="preserve">（匡選該句子後會跳出一個按鈕問 </w:t>
+      </w:r>
+      <w:r>
+        <w:rPr>
+          <w:rFonts w:hint="default" w:eastAsia="新細明體"/>
+          <w:lang w:val="en-US" w:eastAsia="zh-TW"/>
+        </w:rPr>
+        <w:t>ask AI</w:t>
+      </w:r>
+      <w:r>
+        <w:rPr>
+          <w:rFonts w:hint="eastAsia" w:eastAsia="新細明體"/>
+          <w:lang w:val="en-US" w:eastAsia="zh-TW"/>
+        </w:rPr>
+        <w:t xml:space="preserve">），然後內部包 </w:t>
+      </w:r>
+      <w:r>
+        <w:rPr>
+          <w:rFonts w:hint="default" w:eastAsia="新細明體"/>
+          <w:lang w:val="en-US" w:eastAsia="zh-TW"/>
+        </w:rPr>
+        <w:t xml:space="preserve">system prompt </w:t>
+      </w:r>
+      <w:r>
+        <w:rPr>
+          <w:rFonts w:hint="eastAsia" w:eastAsia="新細明體"/>
+          <w:lang w:val="en-US" w:eastAsia="zh-TW"/>
+        </w:rPr>
+        <w:t xml:space="preserve">說解釋這段話，這樣 </w:t>
+      </w:r>
+      <w:r>
+        <w:rPr>
+          <w:rFonts w:hint="default" w:eastAsia="新細明體"/>
+          <w:lang w:val="en-US" w:eastAsia="zh-TW"/>
+        </w:rPr>
+        <w:t xml:space="preserve">summary </w:t>
+      </w:r>
+      <w:r>
+        <w:rPr>
+          <w:rFonts w:hint="eastAsia" w:eastAsia="新細明體"/>
+          <w:lang w:val="en-US" w:eastAsia="zh-TW"/>
+        </w:rPr>
+        <w:t>就會變成對話匡了，也可以讓使用者彈性新增想問的問題</w:t>
+      </w:r>
+    </w:p>
+    <w:p>
+      <w:pPr>
+        <w:pStyle w:val="28"/>
+        <w:widowControl w:val="0"/>
+        <w:numPr>
+          <w:ilvl w:val="1"/>
+          <w:numId w:val="9"/>
+        </w:numPr>
+        <w:spacing w:after="160" w:line="278" w:lineRule="auto"/>
+        <w:ind w:left="840" w:leftChars="0" w:hanging="420" w:firstLineChars="0"/>
+        <w:contextualSpacing/>
+        <w:rPr>
+          <w:rFonts w:hint="default" w:eastAsia="新細明體"/>
+          <w:lang w:val="en-US" w:eastAsia="zh-TW"/>
+        </w:rPr>
+      </w:pPr>
+      <w:r>
+        <w:rPr>
+          <w:rFonts w:hint="eastAsia" w:eastAsia="新細明體"/>
+          <w:lang w:val="en-US" w:eastAsia="zh-TW"/>
+        </w:rPr>
+        <w:t xml:space="preserve">筆記功能可以新增在 </w:t>
+      </w:r>
+      <w:r>
+        <w:rPr>
+          <w:rFonts w:hint="default" w:eastAsia="新細明體"/>
+          <w:lang w:val="en-US" w:eastAsia="zh-TW"/>
+        </w:rPr>
+        <w:t xml:space="preserve">Summary </w:t>
+      </w:r>
+      <w:r>
+        <w:rPr>
+          <w:rFonts w:hint="eastAsia" w:eastAsia="新細明體"/>
+          <w:lang w:val="en-US" w:eastAsia="zh-TW"/>
+        </w:rPr>
+        <w:t xml:space="preserve">按鈕旁邊或是直接加上文字編輯器編輯到 </w:t>
+      </w:r>
+      <w:r>
+        <w:rPr>
+          <w:rFonts w:hint="default" w:eastAsia="新細明體"/>
+          <w:lang w:val="en-US" w:eastAsia="zh-TW"/>
+        </w:rPr>
+        <w:t xml:space="preserve">pdf </w:t>
+      </w:r>
+      <w:r>
+        <w:rPr>
+          <w:rFonts w:hint="eastAsia" w:eastAsia="新細明體"/>
+          <w:lang w:val="en-US" w:eastAsia="zh-TW"/>
+        </w:rPr>
+        <w:t xml:space="preserve">中 </w:t>
+      </w:r>
+      <w:r>
+        <w:rPr>
+          <w:rFonts w:hint="default" w:eastAsia="新細明體"/>
+          <w:lang w:val="en-US" w:eastAsia="zh-TW"/>
+        </w:rPr>
+        <w:t xml:space="preserve">-&gt; </w:t>
+      </w:r>
+      <w:r>
+        <w:rPr>
+          <w:rFonts w:hint="eastAsia" w:eastAsia="新細明體"/>
+          <w:lang w:val="en-US" w:eastAsia="zh-TW"/>
+        </w:rPr>
+        <w:t>兩個功能都提供</w:t>
+      </w:r>
+    </w:p>
+    <w:p>
+      <w:pPr>
+        <w:pStyle w:val="28"/>
+        <w:widowControl w:val="0"/>
+        <w:numPr>
+          <w:ilvl w:val="1"/>
+          <w:numId w:val="9"/>
+        </w:numPr>
+        <w:spacing w:after="160" w:line="278" w:lineRule="auto"/>
+        <w:ind w:left="840" w:leftChars="0" w:hanging="420" w:firstLineChars="0"/>
+        <w:contextualSpacing/>
+        <w:rPr>
+          <w:rFonts w:hint="default" w:eastAsia="新細明體"/>
+          <w:lang w:val="en-US" w:eastAsia="zh-TW"/>
+        </w:rPr>
+      </w:pPr>
+      <w:r>
+        <w:rPr>
+          <w:rFonts w:hint="eastAsia" w:eastAsia="新細明體"/>
+          <w:lang w:val="en-US" w:eastAsia="zh-TW"/>
+        </w:rPr>
+        <w:t xml:space="preserve">要能在首頁放之前上傳過的 </w:t>
+      </w:r>
+      <w:r>
+        <w:rPr>
+          <w:rFonts w:hint="default" w:eastAsia="新細明體"/>
+          <w:lang w:val="en-US" w:eastAsia="zh-TW"/>
+        </w:rPr>
+        <w:t>pdf</w:t>
+      </w:r>
       <w:bookmarkStart w:id="0" w:name="_GoBack"/>
       <w:bookmarkEnd w:id="0"/>
+    </w:p>
+    <w:p>
+      <w:pPr>
+        <w:pStyle w:val="28"/>
+        <w:widowControl w:val="0"/>
+        <w:numPr>
+          <w:ilvl w:val="1"/>
+          <w:numId w:val="9"/>
+        </w:numPr>
+        <w:spacing w:after="160" w:line="278" w:lineRule="auto"/>
+        <w:ind w:left="840" w:leftChars="0" w:hanging="420" w:firstLineChars="0"/>
+        <w:contextualSpacing/>
+        <w:rPr>
+          <w:rFonts w:hint="default" w:eastAsia="新細明體"/>
+          <w:lang w:val="en-US" w:eastAsia="zh-TW"/>
+        </w:rPr>
+      </w:pPr>
+      <w:r>
+        <w:rPr>
+          <w:rFonts w:hint="eastAsia" w:eastAsia="新細明體"/>
+          <w:lang w:val="en-US" w:eastAsia="zh-TW"/>
+        </w:rPr>
+        <w:t xml:space="preserve">要做讀取圖片做 </w:t>
+      </w:r>
+      <w:r>
+        <w:rPr>
+          <w:rFonts w:hint="default" w:eastAsia="新細明體"/>
+          <w:lang w:val="en-US" w:eastAsia="zh-TW"/>
+        </w:rPr>
+        <w:t xml:space="preserve">QA </w:t>
+      </w:r>
+      <w:r>
+        <w:rPr>
+          <w:rFonts w:hint="eastAsia" w:eastAsia="新細明體"/>
+          <w:lang w:val="en-US" w:eastAsia="zh-TW"/>
+        </w:rPr>
+        <w:t>的功能</w:t>
+      </w:r>
+    </w:p>
+    <w:p>
+      <w:pPr>
+        <w:pStyle w:val="28"/>
+        <w:widowControl w:val="0"/>
+        <w:numPr>
+          <w:ilvl w:val="1"/>
+          <w:numId w:val="9"/>
+        </w:numPr>
+        <w:spacing w:after="160" w:line="278" w:lineRule="auto"/>
+        <w:ind w:left="840" w:leftChars="0" w:hanging="420" w:firstLineChars="0"/>
+        <w:contextualSpacing/>
+        <w:rPr>
+          <w:rFonts w:hint="default" w:eastAsia="新細明體"/>
+          <w:lang w:val="en-US" w:eastAsia="zh-TW"/>
+        </w:rPr>
+      </w:pPr>
+      <w:r>
+        <w:rPr>
+          <w:rFonts w:hint="eastAsia" w:eastAsia="新細明體"/>
+          <w:lang w:val="en-US" w:eastAsia="zh-TW"/>
+        </w:rPr>
+        <w:t>優化整體使用者體驗跟流程</w:t>
+      </w:r>
     </w:p>
     <w:sectPr>
       <w:pgSz w:w="11906" w:h="16838"/>
@@ -2157,6 +2874,286 @@
     </w:lvl>
   </w:abstractNum>
   <w:abstractNum w:abstractNumId="2">
+    <w:nsid w:val="DAF3D3C8"/>
+    <w:multiLevelType w:val="multilevel"/>
+    <w:tmpl w:val="DAF3D3C8"/>
+    <w:lvl w:ilvl="0" w:tentative="0">
+      <w:start w:val="1"/>
+      <w:numFmt w:val="bullet"/>
+      <w:lvlText w:val=""/>
+      <w:lvlJc w:val="left"/>
+      <w:pPr>
+        <w:tabs>
+          <w:tab w:val="left" w:pos="420"/>
+        </w:tabs>
+        <w:ind w:left="420" w:leftChars="0" w:hanging="420" w:firstLineChars="0"/>
+      </w:pPr>
+      <w:rPr>
+        <w:rFonts w:hint="default" w:ascii="Wingdings" w:hAnsi="Wingdings"/>
+      </w:rPr>
+    </w:lvl>
+    <w:lvl w:ilvl="1" w:tentative="0">
+      <w:start w:val="1"/>
+      <w:numFmt w:val="bullet"/>
+      <w:lvlText w:val=""/>
+      <w:lvlJc w:val="left"/>
+      <w:pPr>
+        <w:tabs>
+          <w:tab w:val="left" w:pos="840"/>
+        </w:tabs>
+        <w:ind w:left="840" w:leftChars="0" w:hanging="420" w:firstLineChars="0"/>
+      </w:pPr>
+      <w:rPr>
+        <w:rFonts w:hint="default" w:ascii="Wingdings" w:hAnsi="Wingdings"/>
+      </w:rPr>
+    </w:lvl>
+    <w:lvl w:ilvl="2" w:tentative="0">
+      <w:start w:val="1"/>
+      <w:numFmt w:val="bullet"/>
+      <w:lvlText w:val=""/>
+      <w:lvlJc w:val="left"/>
+      <w:pPr>
+        <w:tabs>
+          <w:tab w:val="left" w:pos="1260"/>
+        </w:tabs>
+        <w:ind w:left="1260" w:leftChars="0" w:hanging="420" w:firstLineChars="0"/>
+      </w:pPr>
+      <w:rPr>
+        <w:rFonts w:hint="default" w:ascii="Wingdings" w:hAnsi="Wingdings"/>
+      </w:rPr>
+    </w:lvl>
+    <w:lvl w:ilvl="3" w:tentative="0">
+      <w:start w:val="1"/>
+      <w:numFmt w:val="bullet"/>
+      <w:lvlText w:val=""/>
+      <w:lvlJc w:val="left"/>
+      <w:pPr>
+        <w:tabs>
+          <w:tab w:val="left" w:pos="1680"/>
+        </w:tabs>
+        <w:ind w:left="1680" w:leftChars="0" w:hanging="420" w:firstLineChars="0"/>
+      </w:pPr>
+      <w:rPr>
+        <w:rFonts w:hint="default" w:ascii="Wingdings" w:hAnsi="Wingdings"/>
+      </w:rPr>
+    </w:lvl>
+    <w:lvl w:ilvl="4" w:tentative="0">
+      <w:start w:val="1"/>
+      <w:numFmt w:val="bullet"/>
+      <w:lvlText w:val=""/>
+      <w:lvlJc w:val="left"/>
+      <w:pPr>
+        <w:tabs>
+          <w:tab w:val="left" w:pos="2100"/>
+        </w:tabs>
+        <w:ind w:left="2100" w:leftChars="0" w:hanging="420" w:firstLineChars="0"/>
+      </w:pPr>
+      <w:rPr>
+        <w:rFonts w:hint="default" w:ascii="Wingdings" w:hAnsi="Wingdings"/>
+      </w:rPr>
+    </w:lvl>
+    <w:lvl w:ilvl="5" w:tentative="0">
+      <w:start w:val="1"/>
+      <w:numFmt w:val="bullet"/>
+      <w:lvlText w:val=""/>
+      <w:lvlJc w:val="left"/>
+      <w:pPr>
+        <w:tabs>
+          <w:tab w:val="left" w:pos="2520"/>
+        </w:tabs>
+        <w:ind w:left="2520" w:leftChars="0" w:hanging="420" w:firstLineChars="0"/>
+      </w:pPr>
+      <w:rPr>
+        <w:rFonts w:hint="default" w:ascii="Wingdings" w:hAnsi="Wingdings"/>
+      </w:rPr>
+    </w:lvl>
+    <w:lvl w:ilvl="6" w:tentative="0">
+      <w:start w:val="1"/>
+      <w:numFmt w:val="bullet"/>
+      <w:lvlText w:val=""/>
+      <w:lvlJc w:val="left"/>
+      <w:pPr>
+        <w:tabs>
+          <w:tab w:val="left" w:pos="2940"/>
+        </w:tabs>
+        <w:ind w:left="2940" w:leftChars="0" w:hanging="420" w:firstLineChars="0"/>
+      </w:pPr>
+      <w:rPr>
+        <w:rFonts w:hint="default" w:ascii="Wingdings" w:hAnsi="Wingdings"/>
+      </w:rPr>
+    </w:lvl>
+    <w:lvl w:ilvl="7" w:tentative="0">
+      <w:start w:val="1"/>
+      <w:numFmt w:val="bullet"/>
+      <w:lvlText w:val=""/>
+      <w:lvlJc w:val="left"/>
+      <w:pPr>
+        <w:tabs>
+          <w:tab w:val="left" w:pos="3360"/>
+        </w:tabs>
+        <w:ind w:left="3360" w:leftChars="0" w:hanging="420" w:firstLineChars="0"/>
+      </w:pPr>
+      <w:rPr>
+        <w:rFonts w:hint="default" w:ascii="Wingdings" w:hAnsi="Wingdings"/>
+      </w:rPr>
+    </w:lvl>
+    <w:lvl w:ilvl="8" w:tentative="0">
+      <w:start w:val="1"/>
+      <w:numFmt w:val="bullet"/>
+      <w:lvlText w:val=""/>
+      <w:lvlJc w:val="left"/>
+      <w:pPr>
+        <w:tabs>
+          <w:tab w:val="left" w:pos="3780"/>
+        </w:tabs>
+        <w:ind w:left="3780" w:leftChars="0" w:hanging="420" w:firstLineChars="0"/>
+      </w:pPr>
+      <w:rPr>
+        <w:rFonts w:hint="default" w:ascii="Wingdings" w:hAnsi="Wingdings"/>
+      </w:rPr>
+    </w:lvl>
+  </w:abstractNum>
+  <w:abstractNum w:abstractNumId="3">
+    <w:nsid w:val="DFEB8A7E"/>
+    <w:multiLevelType w:val="multilevel"/>
+    <w:tmpl w:val="DFEB8A7E"/>
+    <w:lvl w:ilvl="0" w:tentative="0">
+      <w:start w:val="1"/>
+      <w:numFmt w:val="bullet"/>
+      <w:lvlText w:val=""/>
+      <w:lvlJc w:val="left"/>
+      <w:pPr>
+        <w:tabs>
+          <w:tab w:val="left" w:pos="420"/>
+        </w:tabs>
+        <w:ind w:left="420" w:leftChars="0" w:hanging="420" w:firstLineChars="0"/>
+      </w:pPr>
+      <w:rPr>
+        <w:rFonts w:hint="default" w:ascii="Wingdings" w:hAnsi="Wingdings"/>
+      </w:rPr>
+    </w:lvl>
+    <w:lvl w:ilvl="1" w:tentative="0">
+      <w:start w:val="1"/>
+      <w:numFmt w:val="bullet"/>
+      <w:lvlText w:val=""/>
+      <w:lvlJc w:val="left"/>
+      <w:pPr>
+        <w:tabs>
+          <w:tab w:val="left" w:pos="840"/>
+        </w:tabs>
+        <w:ind w:left="840" w:leftChars="0" w:hanging="420" w:firstLineChars="0"/>
+      </w:pPr>
+      <w:rPr>
+        <w:rFonts w:hint="default" w:ascii="Wingdings" w:hAnsi="Wingdings"/>
+      </w:rPr>
+    </w:lvl>
+    <w:lvl w:ilvl="2" w:tentative="0">
+      <w:start w:val="1"/>
+      <w:numFmt w:val="bullet"/>
+      <w:lvlText w:val=""/>
+      <w:lvlJc w:val="left"/>
+      <w:pPr>
+        <w:tabs>
+          <w:tab w:val="left" w:pos="1260"/>
+        </w:tabs>
+        <w:ind w:left="1260" w:leftChars="0" w:hanging="420" w:firstLineChars="0"/>
+      </w:pPr>
+      <w:rPr>
+        <w:rFonts w:hint="default" w:ascii="Wingdings" w:hAnsi="Wingdings"/>
+      </w:rPr>
+    </w:lvl>
+    <w:lvl w:ilvl="3" w:tentative="0">
+      <w:start w:val="1"/>
+      <w:numFmt w:val="bullet"/>
+      <w:lvlText w:val=""/>
+      <w:lvlJc w:val="left"/>
+      <w:pPr>
+        <w:tabs>
+          <w:tab w:val="left" w:pos="1680"/>
+        </w:tabs>
+        <w:ind w:left="1680" w:leftChars="0" w:hanging="420" w:firstLineChars="0"/>
+      </w:pPr>
+      <w:rPr>
+        <w:rFonts w:hint="default" w:ascii="Wingdings" w:hAnsi="Wingdings"/>
+      </w:rPr>
+    </w:lvl>
+    <w:lvl w:ilvl="4" w:tentative="0">
+      <w:start w:val="1"/>
+      <w:numFmt w:val="bullet"/>
+      <w:lvlText w:val=""/>
+      <w:lvlJc w:val="left"/>
+      <w:pPr>
+        <w:tabs>
+          <w:tab w:val="left" w:pos="2100"/>
+        </w:tabs>
+        <w:ind w:left="2100" w:leftChars="0" w:hanging="420" w:firstLineChars="0"/>
+      </w:pPr>
+      <w:rPr>
+        <w:rFonts w:hint="default" w:ascii="Wingdings" w:hAnsi="Wingdings"/>
+      </w:rPr>
+    </w:lvl>
+    <w:lvl w:ilvl="5" w:tentative="0">
+      <w:start w:val="1"/>
+      <w:numFmt w:val="bullet"/>
+      <w:lvlText w:val=""/>
+      <w:lvlJc w:val="left"/>
+      <w:pPr>
+        <w:tabs>
+          <w:tab w:val="left" w:pos="2520"/>
+        </w:tabs>
+        <w:ind w:left="2520" w:leftChars="0" w:hanging="420" w:firstLineChars="0"/>
+      </w:pPr>
+      <w:rPr>
+        <w:rFonts w:hint="default" w:ascii="Wingdings" w:hAnsi="Wingdings"/>
+      </w:rPr>
+    </w:lvl>
+    <w:lvl w:ilvl="6" w:tentative="0">
+      <w:start w:val="1"/>
+      <w:numFmt w:val="bullet"/>
+      <w:lvlText w:val=""/>
+      <w:lvlJc w:val="left"/>
+      <w:pPr>
+        <w:tabs>
+          <w:tab w:val="left" w:pos="2940"/>
+        </w:tabs>
+        <w:ind w:left="2940" w:leftChars="0" w:hanging="420" w:firstLineChars="0"/>
+      </w:pPr>
+      <w:rPr>
+        <w:rFonts w:hint="default" w:ascii="Wingdings" w:hAnsi="Wingdings"/>
+      </w:rPr>
+    </w:lvl>
+    <w:lvl w:ilvl="7" w:tentative="0">
+      <w:start w:val="1"/>
+      <w:numFmt w:val="bullet"/>
+      <w:lvlText w:val=""/>
+      <w:lvlJc w:val="left"/>
+      <w:pPr>
+        <w:tabs>
+          <w:tab w:val="left" w:pos="3360"/>
+        </w:tabs>
+        <w:ind w:left="3360" w:leftChars="0" w:hanging="420" w:firstLineChars="0"/>
+      </w:pPr>
+      <w:rPr>
+        <w:rFonts w:hint="default" w:ascii="Wingdings" w:hAnsi="Wingdings"/>
+      </w:rPr>
+    </w:lvl>
+    <w:lvl w:ilvl="8" w:tentative="0">
+      <w:start w:val="1"/>
+      <w:numFmt w:val="bullet"/>
+      <w:lvlText w:val=""/>
+      <w:lvlJc w:val="left"/>
+      <w:pPr>
+        <w:tabs>
+          <w:tab w:val="left" w:pos="3780"/>
+        </w:tabs>
+        <w:ind w:left="3780" w:leftChars="0" w:hanging="420" w:firstLineChars="0"/>
+      </w:pPr>
+      <w:rPr>
+        <w:rFonts w:hint="default" w:ascii="Wingdings" w:hAnsi="Wingdings"/>
+      </w:rPr>
+    </w:lvl>
+  </w:abstractNum>
+  <w:abstractNum w:abstractNumId="4">
     <w:nsid w:val="FFFBD9F0"/>
     <w:multiLevelType w:val="multilevel"/>
     <w:tmpl w:val="FFFBD9F0"/>
@@ -2296,7 +3293,7 @@
       </w:rPr>
     </w:lvl>
   </w:abstractNum>
-  <w:abstractNum w:abstractNumId="3">
+  <w:abstractNum w:abstractNumId="5">
     <w:nsid w:val="0B3C2EF0"/>
     <w:multiLevelType w:val="multilevel"/>
     <w:tmpl w:val="0B3C2EF0"/>
@@ -2409,7 +3406,7 @@
       </w:rPr>
     </w:lvl>
   </w:abstractNum>
-  <w:abstractNum w:abstractNumId="4">
+  <w:abstractNum w:abstractNumId="6">
     <w:nsid w:val="2D821E64"/>
     <w:multiLevelType w:val="multilevel"/>
     <w:tmpl w:val="2D821E64"/>
@@ -2522,7 +3519,7 @@
       </w:rPr>
     </w:lvl>
   </w:abstractNum>
-  <w:abstractNum w:abstractNumId="5">
+  <w:abstractNum w:abstractNumId="7">
     <w:nsid w:val="378FFA6E"/>
     <w:multiLevelType w:val="multilevel"/>
     <w:tmpl w:val="378FFA6E"/>
@@ -2662,7 +3659,7 @@
       </w:rPr>
     </w:lvl>
   </w:abstractNum>
-  <w:abstractNum w:abstractNumId="6">
+  <w:abstractNum w:abstractNumId="8">
     <w:nsid w:val="7FFBCA86"/>
     <w:multiLevelType w:val="singleLevel"/>
     <w:tmpl w:val="7FFBCA86"/>
@@ -2683,25 +3680,31 @@
     </w:lvl>
   </w:abstractNum>
   <w:num w:numId="1">
-    <w:abstractNumId w:val="3"/>
+    <w:abstractNumId w:val="5"/>
   </w:num>
   <w:num w:numId="2">
     <w:abstractNumId w:val="0"/>
   </w:num>
   <w:num w:numId="3">
-    <w:abstractNumId w:val="2"/>
+    <w:abstractNumId w:val="4"/>
   </w:num>
   <w:num w:numId="4">
     <w:abstractNumId w:val="1"/>
   </w:num>
   <w:num w:numId="5">
-    <w:abstractNumId w:val="4"/>
+    <w:abstractNumId w:val="6"/>
   </w:num>
   <w:num w:numId="6">
-    <w:abstractNumId w:val="5"/>
+    <w:abstractNumId w:val="7"/>
   </w:num>
   <w:num w:numId="7">
-    <w:abstractNumId w:val="6"/>
+    <w:abstractNumId w:val="8"/>
+  </w:num>
+  <w:num w:numId="8">
+    <w:abstractNumId w:val="2"/>
+  </w:num>
+  <w:num w:numId="9">
+    <w:abstractNumId w:val="3"/>
   </w:num>
 </w:numbering>
 </file>

</xml_diff>

<commit_message>
feat: add note-taking functionality with BlockNote integration
- Updated package.json to include BlockNote and Mantine dependencies.
- Created Note model in Prisma schema with unique constraint for documentId and pageNumber.
- Implemented API routes for creating, updating, and fetching notes.
- Added NoteEditor component for rich text editing of notes using BlockNote.
- Developed PageNotes component to manage note state and persistence.
- Integrated notes into the PDF viewer with a new tab for notes.
- Refactored PdfViewer to support dynamic loading of components.
- Updated page component to use new PdfViewerClient for client-side rendering.
- Added copy functionality for answers in the PageQA component.
</commit_message>
<xml_diff>
--- a/日記.docx
+++ b/日記.docx
@@ -2586,8 +2586,6 @@
         </w:rPr>
         <w:t>pdf</w:t>
       </w:r>
-      <w:bookmarkStart w:id="0" w:name="_GoBack"/>
-      <w:bookmarkEnd w:id="0"/>
     </w:p>
     <w:p>
       <w:pPr>
@@ -2650,6 +2648,248 @@
         </w:rPr>
         <w:t>優化整體使用者體驗跟流程</w:t>
       </w:r>
+    </w:p>
+    <w:p>
+      <w:pPr>
+        <w:pStyle w:val="28"/>
+        <w:widowControl w:val="0"/>
+        <w:numPr>
+          <w:ilvl w:val="0"/>
+          <w:numId w:val="9"/>
+        </w:numPr>
+        <w:spacing w:after="160" w:line="278" w:lineRule="auto"/>
+        <w:ind w:left="420" w:leftChars="0" w:hanging="420" w:firstLineChars="0"/>
+        <w:contextualSpacing/>
+        <w:rPr>
+          <w:rFonts w:hint="default" w:eastAsia="新細明體"/>
+          <w:lang w:val="en-US" w:eastAsia="zh-TW"/>
+        </w:rPr>
+      </w:pPr>
+      <w:r>
+        <w:rPr>
+          <w:rFonts w:hint="eastAsia" w:eastAsia="新細明體"/>
+          <w:lang w:val="en-US" w:eastAsia="zh-TW"/>
+        </w:rPr>
+        <w:t xml:space="preserve">非 </w:t>
+      </w:r>
+      <w:r>
+        <w:rPr>
+          <w:rFonts w:hint="default" w:eastAsia="新細明體"/>
+          <w:lang w:val="en-US" w:eastAsia="zh-TW"/>
+        </w:rPr>
+        <w:t>MVP</w:t>
+      </w:r>
+      <w:r>
+        <w:rPr>
+          <w:rFonts w:hint="eastAsia" w:eastAsia="新細明體"/>
+          <w:lang w:val="en-US" w:eastAsia="zh-TW"/>
+        </w:rPr>
+        <w:t>：</w:t>
+      </w:r>
+    </w:p>
+    <w:p>
+      <w:pPr>
+        <w:pStyle w:val="28"/>
+        <w:widowControl w:val="0"/>
+        <w:numPr>
+          <w:ilvl w:val="1"/>
+          <w:numId w:val="9"/>
+        </w:numPr>
+        <w:spacing w:after="160" w:line="278" w:lineRule="auto"/>
+        <w:ind w:left="840" w:leftChars="0" w:hanging="420" w:firstLineChars="0"/>
+        <w:contextualSpacing/>
+        <w:rPr>
+          <w:rFonts w:hint="default" w:eastAsia="新細明體"/>
+          <w:lang w:val="en-US" w:eastAsia="zh-TW"/>
+        </w:rPr>
+      </w:pPr>
+      <w:r>
+        <w:rPr>
+          <w:rFonts w:hint="eastAsia" w:eastAsia="新細明體"/>
+          <w:lang w:val="en-US" w:eastAsia="zh-TW"/>
+        </w:rPr>
+        <w:t>資料庫要存在線上還是本地？</w:t>
+      </w:r>
+    </w:p>
+    <w:p>
+      <w:pPr>
+        <w:pStyle w:val="28"/>
+        <w:widowControl w:val="0"/>
+        <w:numPr>
+          <w:ilvl w:val="1"/>
+          <w:numId w:val="9"/>
+        </w:numPr>
+        <w:spacing w:after="160" w:line="278" w:lineRule="auto"/>
+        <w:ind w:left="840" w:leftChars="0" w:hanging="420" w:firstLineChars="0"/>
+        <w:contextualSpacing/>
+        <w:rPr>
+          <w:rFonts w:hint="default" w:eastAsia="新細明體"/>
+          <w:lang w:val="en-US" w:eastAsia="zh-TW"/>
+        </w:rPr>
+      </w:pPr>
+      <w:r>
+        <w:rPr>
+          <w:rFonts w:hint="eastAsia" w:eastAsia="新細明體"/>
+          <w:lang w:val="en-US" w:eastAsia="zh-TW"/>
+        </w:rPr>
+        <w:t>登入介面、可存取每個使用者上傳的</w:t>
+      </w:r>
+      <w:r>
+        <w:rPr>
+          <w:rFonts w:hint="default" w:eastAsia="新細明體"/>
+          <w:lang w:val="en-US" w:eastAsia="zh-TW"/>
+        </w:rPr>
+        <w:t>pdf</w:t>
+      </w:r>
+    </w:p>
+    <w:p>
+      <w:pPr>
+        <w:pStyle w:val="28"/>
+        <w:widowControl w:val="0"/>
+        <w:numPr>
+          <w:ilvl w:val="1"/>
+          <w:numId w:val="9"/>
+        </w:numPr>
+        <w:spacing w:after="160" w:line="278" w:lineRule="auto"/>
+        <w:ind w:left="840" w:leftChars="0" w:hanging="420" w:firstLineChars="0"/>
+        <w:contextualSpacing/>
+        <w:rPr>
+          <w:rFonts w:hint="default" w:eastAsia="新細明體"/>
+          <w:lang w:val="en-US" w:eastAsia="zh-TW"/>
+        </w:rPr>
+      </w:pPr>
+      <w:r>
+        <w:rPr>
+          <w:rFonts w:hint="default" w:eastAsia="新細明體"/>
+          <w:lang w:val="en-US" w:eastAsia="zh-TW"/>
+        </w:rPr>
+        <w:t>deploy</w:t>
+      </w:r>
+    </w:p>
+    <w:p>
+      <w:pPr>
+        <w:pStyle w:val="28"/>
+        <w:widowControl w:val="0"/>
+        <w:numPr>
+          <w:numId w:val="0"/>
+        </w:numPr>
+        <w:spacing w:after="160" w:line="278" w:lineRule="auto"/>
+        <w:contextualSpacing/>
+        <w:rPr>
+          <w:rFonts w:hint="default" w:eastAsia="新細明體"/>
+          <w:lang w:val="en-US" w:eastAsia="zh-TW"/>
+        </w:rPr>
+      </w:pPr>
+    </w:p>
+    <w:p>
+      <w:pPr>
+        <w:pStyle w:val="28"/>
+        <w:widowControl w:val="0"/>
+        <w:numPr>
+          <w:numId w:val="0"/>
+        </w:numPr>
+        <w:spacing w:after="160" w:line="278" w:lineRule="auto"/>
+        <w:contextualSpacing/>
+        <w:rPr>
+          <w:rFonts w:hint="default" w:eastAsia="新細明體"/>
+          <w:lang w:val="en-US" w:eastAsia="zh-TW"/>
+        </w:rPr>
+      </w:pPr>
+      <w:r>
+        <w:rPr>
+          <w:rFonts w:hint="default" w:eastAsia="新細明體"/>
+          <w:lang w:val="en-US" w:eastAsia="zh-TW"/>
+        </w:rPr>
+        <w:t>6/16</w:t>
+      </w:r>
+    </w:p>
+    <w:p>
+      <w:pPr>
+        <w:pStyle w:val="28"/>
+        <w:widowControl w:val="0"/>
+        <w:numPr>
+          <w:ilvl w:val="0"/>
+          <w:numId w:val="10"/>
+        </w:numPr>
+        <w:spacing w:after="160" w:line="278" w:lineRule="auto"/>
+        <w:ind w:left="420" w:leftChars="0" w:hanging="420" w:firstLineChars="0"/>
+        <w:contextualSpacing/>
+        <w:rPr>
+          <w:rFonts w:hint="default" w:eastAsia="新細明體"/>
+          <w:lang w:val="en-US" w:eastAsia="zh-TW"/>
+        </w:rPr>
+      </w:pPr>
+      <w:r>
+        <w:rPr>
+          <w:rFonts w:hint="eastAsia" w:eastAsia="新細明體"/>
+          <w:lang w:val="en-US" w:eastAsia="zh-TW"/>
+        </w:rPr>
+        <w:t>進度：</w:t>
+      </w:r>
+      <w:r>
+        <w:rPr>
+          <w:rFonts w:hint="default" w:eastAsia="新細明體"/>
+          <w:lang w:val="en-US" w:eastAsia="zh-TW"/>
+        </w:rPr>
+        <w:t>Note API (GET &amp; POST) + prisma DB table</w:t>
+      </w:r>
+    </w:p>
+    <w:p>
+      <w:pPr>
+        <w:pStyle w:val="28"/>
+        <w:widowControl w:val="0"/>
+        <w:numPr>
+          <w:ilvl w:val="0"/>
+          <w:numId w:val="10"/>
+        </w:numPr>
+        <w:spacing w:after="160" w:line="278" w:lineRule="auto"/>
+        <w:ind w:left="420" w:leftChars="0" w:hanging="420" w:firstLineChars="0"/>
+        <w:contextualSpacing/>
+        <w:rPr>
+          <w:rFonts w:hint="default" w:eastAsia="新細明體"/>
+          <w:lang w:val="en-US" w:eastAsia="zh-TW"/>
+        </w:rPr>
+      </w:pPr>
+      <w:r>
+        <w:rPr>
+          <w:rFonts w:hint="eastAsia" w:eastAsia="新細明體"/>
+          <w:lang w:val="en-US" w:eastAsia="zh-TW"/>
+        </w:rPr>
+        <w:t>規劃：</w:t>
+      </w:r>
+    </w:p>
+    <w:p>
+      <w:pPr>
+        <w:pStyle w:val="28"/>
+        <w:widowControl w:val="0"/>
+        <w:numPr>
+          <w:ilvl w:val="1"/>
+          <w:numId w:val="10"/>
+        </w:numPr>
+        <w:spacing w:after="160" w:line="278" w:lineRule="auto"/>
+        <w:ind w:left="840" w:leftChars="0" w:hanging="420" w:firstLineChars="0"/>
+        <w:contextualSpacing/>
+        <w:rPr>
+          <w:rFonts w:hint="default" w:eastAsia="新細明體"/>
+          <w:lang w:val="en-US" w:eastAsia="zh-TW"/>
+        </w:rPr>
+      </w:pPr>
+      <w:r>
+        <w:rPr>
+          <w:rFonts w:hint="eastAsia" w:eastAsia="新細明體"/>
+          <w:lang w:val="en-US" w:eastAsia="zh-TW"/>
+        </w:rPr>
+        <w:t>完成</w:t>
+      </w:r>
+      <w:r>
+        <w:rPr>
+          <w:rFonts w:hint="default" w:eastAsia="新細明體"/>
+          <w:lang w:val="en-US" w:eastAsia="zh-TW"/>
+        </w:rPr>
+        <w:t xml:space="preserve"> Note Components &amp; UI</w:t>
+      </w:r>
+      <w:bookmarkStart w:id="0" w:name="_GoBack"/>
+      <w:bookmarkEnd w:id="0"/>
     </w:p>
     <w:sectPr>
       <w:pgSz w:w="11906" w:h="16838"/>
@@ -3014,6 +3254,146 @@
     </w:lvl>
   </w:abstractNum>
   <w:abstractNum w:abstractNumId="3">
+    <w:nsid w:val="DF5FCF7F"/>
+    <w:multiLevelType w:val="multilevel"/>
+    <w:tmpl w:val="DF5FCF7F"/>
+    <w:lvl w:ilvl="0" w:tentative="0">
+      <w:start w:val="1"/>
+      <w:numFmt w:val="bullet"/>
+      <w:lvlText w:val=""/>
+      <w:lvlJc w:val="left"/>
+      <w:pPr>
+        <w:tabs>
+          <w:tab w:val="left" w:pos="420"/>
+        </w:tabs>
+        <w:ind w:left="420" w:leftChars="0" w:hanging="420" w:firstLineChars="0"/>
+      </w:pPr>
+      <w:rPr>
+        <w:rFonts w:hint="default" w:ascii="Wingdings" w:hAnsi="Wingdings"/>
+      </w:rPr>
+    </w:lvl>
+    <w:lvl w:ilvl="1" w:tentative="0">
+      <w:start w:val="1"/>
+      <w:numFmt w:val="bullet"/>
+      <w:lvlText w:val=""/>
+      <w:lvlJc w:val="left"/>
+      <w:pPr>
+        <w:tabs>
+          <w:tab w:val="left" w:pos="840"/>
+        </w:tabs>
+        <w:ind w:left="840" w:leftChars="0" w:hanging="420" w:firstLineChars="0"/>
+      </w:pPr>
+      <w:rPr>
+        <w:rFonts w:hint="default" w:ascii="Wingdings" w:hAnsi="Wingdings"/>
+      </w:rPr>
+    </w:lvl>
+    <w:lvl w:ilvl="2" w:tentative="0">
+      <w:start w:val="1"/>
+      <w:numFmt w:val="bullet"/>
+      <w:lvlText w:val=""/>
+      <w:lvlJc w:val="left"/>
+      <w:pPr>
+        <w:tabs>
+          <w:tab w:val="left" w:pos="1260"/>
+        </w:tabs>
+        <w:ind w:left="1260" w:leftChars="0" w:hanging="420" w:firstLineChars="0"/>
+      </w:pPr>
+      <w:rPr>
+        <w:rFonts w:hint="default" w:ascii="Wingdings" w:hAnsi="Wingdings"/>
+      </w:rPr>
+    </w:lvl>
+    <w:lvl w:ilvl="3" w:tentative="0">
+      <w:start w:val="1"/>
+      <w:numFmt w:val="bullet"/>
+      <w:lvlText w:val=""/>
+      <w:lvlJc w:val="left"/>
+      <w:pPr>
+        <w:tabs>
+          <w:tab w:val="left" w:pos="1680"/>
+        </w:tabs>
+        <w:ind w:left="1680" w:leftChars="0" w:hanging="420" w:firstLineChars="0"/>
+      </w:pPr>
+      <w:rPr>
+        <w:rFonts w:hint="default" w:ascii="Wingdings" w:hAnsi="Wingdings"/>
+      </w:rPr>
+    </w:lvl>
+    <w:lvl w:ilvl="4" w:tentative="0">
+      <w:start w:val="1"/>
+      <w:numFmt w:val="bullet"/>
+      <w:lvlText w:val=""/>
+      <w:lvlJc w:val="left"/>
+      <w:pPr>
+        <w:tabs>
+          <w:tab w:val="left" w:pos="2100"/>
+        </w:tabs>
+        <w:ind w:left="2100" w:leftChars="0" w:hanging="420" w:firstLineChars="0"/>
+      </w:pPr>
+      <w:rPr>
+        <w:rFonts w:hint="default" w:ascii="Wingdings" w:hAnsi="Wingdings"/>
+      </w:rPr>
+    </w:lvl>
+    <w:lvl w:ilvl="5" w:tentative="0">
+      <w:start w:val="1"/>
+      <w:numFmt w:val="bullet"/>
+      <w:lvlText w:val=""/>
+      <w:lvlJc w:val="left"/>
+      <w:pPr>
+        <w:tabs>
+          <w:tab w:val="left" w:pos="2520"/>
+        </w:tabs>
+        <w:ind w:left="2520" w:leftChars="0" w:hanging="420" w:firstLineChars="0"/>
+      </w:pPr>
+      <w:rPr>
+        <w:rFonts w:hint="default" w:ascii="Wingdings" w:hAnsi="Wingdings"/>
+      </w:rPr>
+    </w:lvl>
+    <w:lvl w:ilvl="6" w:tentative="0">
+      <w:start w:val="1"/>
+      <w:numFmt w:val="bullet"/>
+      <w:lvlText w:val=""/>
+      <w:lvlJc w:val="left"/>
+      <w:pPr>
+        <w:tabs>
+          <w:tab w:val="left" w:pos="2940"/>
+        </w:tabs>
+        <w:ind w:left="2940" w:leftChars="0" w:hanging="420" w:firstLineChars="0"/>
+      </w:pPr>
+      <w:rPr>
+        <w:rFonts w:hint="default" w:ascii="Wingdings" w:hAnsi="Wingdings"/>
+      </w:rPr>
+    </w:lvl>
+    <w:lvl w:ilvl="7" w:tentative="0">
+      <w:start w:val="1"/>
+      <w:numFmt w:val="bullet"/>
+      <w:lvlText w:val=""/>
+      <w:lvlJc w:val="left"/>
+      <w:pPr>
+        <w:tabs>
+          <w:tab w:val="left" w:pos="3360"/>
+        </w:tabs>
+        <w:ind w:left="3360" w:leftChars="0" w:hanging="420" w:firstLineChars="0"/>
+      </w:pPr>
+      <w:rPr>
+        <w:rFonts w:hint="default" w:ascii="Wingdings" w:hAnsi="Wingdings"/>
+      </w:rPr>
+    </w:lvl>
+    <w:lvl w:ilvl="8" w:tentative="0">
+      <w:start w:val="1"/>
+      <w:numFmt w:val="bullet"/>
+      <w:lvlText w:val=""/>
+      <w:lvlJc w:val="left"/>
+      <w:pPr>
+        <w:tabs>
+          <w:tab w:val="left" w:pos="3780"/>
+        </w:tabs>
+        <w:ind w:left="3780" w:leftChars="0" w:hanging="420" w:firstLineChars="0"/>
+      </w:pPr>
+      <w:rPr>
+        <w:rFonts w:hint="default" w:ascii="Wingdings" w:hAnsi="Wingdings"/>
+      </w:rPr>
+    </w:lvl>
+  </w:abstractNum>
+  <w:abstractNum w:abstractNumId="4">
     <w:nsid w:val="DFEB8A7E"/>
     <w:multiLevelType w:val="multilevel"/>
     <w:tmpl w:val="DFEB8A7E"/>
@@ -3153,7 +3533,7 @@
       </w:rPr>
     </w:lvl>
   </w:abstractNum>
-  <w:abstractNum w:abstractNumId="4">
+  <w:abstractNum w:abstractNumId="5">
     <w:nsid w:val="FFFBD9F0"/>
     <w:multiLevelType w:val="multilevel"/>
     <w:tmpl w:val="FFFBD9F0"/>
@@ -3293,7 +3673,7 @@
       </w:rPr>
     </w:lvl>
   </w:abstractNum>
-  <w:abstractNum w:abstractNumId="5">
+  <w:abstractNum w:abstractNumId="6">
     <w:nsid w:val="0B3C2EF0"/>
     <w:multiLevelType w:val="multilevel"/>
     <w:tmpl w:val="0B3C2EF0"/>
@@ -3406,7 +3786,7 @@
       </w:rPr>
     </w:lvl>
   </w:abstractNum>
-  <w:abstractNum w:abstractNumId="6">
+  <w:abstractNum w:abstractNumId="7">
     <w:nsid w:val="2D821E64"/>
     <w:multiLevelType w:val="multilevel"/>
     <w:tmpl w:val="2D821E64"/>
@@ -3519,7 +3899,7 @@
       </w:rPr>
     </w:lvl>
   </w:abstractNum>
-  <w:abstractNum w:abstractNumId="7">
+  <w:abstractNum w:abstractNumId="8">
     <w:nsid w:val="378FFA6E"/>
     <w:multiLevelType w:val="multilevel"/>
     <w:tmpl w:val="378FFA6E"/>
@@ -3659,7 +4039,7 @@
       </w:rPr>
     </w:lvl>
   </w:abstractNum>
-  <w:abstractNum w:abstractNumId="8">
+  <w:abstractNum w:abstractNumId="9">
     <w:nsid w:val="7FFBCA86"/>
     <w:multiLevelType w:val="singleLevel"/>
     <w:tmpl w:val="7FFBCA86"/>
@@ -3680,30 +4060,33 @@
     </w:lvl>
   </w:abstractNum>
   <w:num w:numId="1">
-    <w:abstractNumId w:val="5"/>
+    <w:abstractNumId w:val="6"/>
   </w:num>
   <w:num w:numId="2">
     <w:abstractNumId w:val="0"/>
   </w:num>
   <w:num w:numId="3">
-    <w:abstractNumId w:val="4"/>
+    <w:abstractNumId w:val="5"/>
   </w:num>
   <w:num w:numId="4">
     <w:abstractNumId w:val="1"/>
   </w:num>
   <w:num w:numId="5">
-    <w:abstractNumId w:val="6"/>
+    <w:abstractNumId w:val="7"/>
   </w:num>
   <w:num w:numId="6">
-    <w:abstractNumId w:val="7"/>
+    <w:abstractNumId w:val="8"/>
   </w:num>
   <w:num w:numId="7">
-    <w:abstractNumId w:val="8"/>
+    <w:abstractNumId w:val="9"/>
   </w:num>
   <w:num w:numId="8">
     <w:abstractNumId w:val="2"/>
   </w:num>
   <w:num w:numId="9">
+    <w:abstractNumId w:val="4"/>
+  </w:num>
+  <w:num w:numId="10">
     <w:abstractNumId w:val="3"/>
   </w:num>
 </w:numbering>

</xml_diff>

<commit_message>
feat: merge QA and summary session into chat mode
</commit_message>
<xml_diff>
--- a/日記.docx
+++ b/日記.docx
@@ -2771,6 +2771,7 @@
         <w:pStyle w:val="28"/>
         <w:widowControl w:val="0"/>
         <w:numPr>
+          <w:ilvl w:val="0"/>
           <w:numId w:val="0"/>
         </w:numPr>
         <w:spacing w:after="160" w:line="278" w:lineRule="auto"/>
@@ -2786,6 +2787,7 @@
         <w:pStyle w:val="28"/>
         <w:widowControl w:val="0"/>
         <w:numPr>
+          <w:ilvl w:val="0"/>
           <w:numId w:val="0"/>
         </w:numPr>
         <w:spacing w:after="160" w:line="278" w:lineRule="auto"/>
@@ -2888,8 +2890,409 @@
         </w:rPr>
         <w:t xml:space="preserve"> Note Components &amp; UI</w:t>
       </w:r>
+    </w:p>
+    <w:p>
+      <w:pPr>
+        <w:pStyle w:val="28"/>
+        <w:widowControl w:val="0"/>
+        <w:numPr>
+          <w:ilvl w:val="0"/>
+          <w:numId w:val="0"/>
+        </w:numPr>
+        <w:spacing w:after="160" w:line="278" w:lineRule="auto"/>
+        <w:contextualSpacing/>
+        <w:rPr>
+          <w:rFonts w:hint="default" w:eastAsia="新細明體"/>
+          <w:lang w:val="en-US" w:eastAsia="zh-TW"/>
+        </w:rPr>
+      </w:pPr>
+    </w:p>
+    <w:p>
+      <w:pPr>
+        <w:pStyle w:val="28"/>
+        <w:widowControl w:val="0"/>
+        <w:numPr>
+          <w:ilvl w:val="0"/>
+          <w:numId w:val="0"/>
+        </w:numPr>
+        <w:spacing w:after="160" w:line="278" w:lineRule="auto"/>
+        <w:contextualSpacing/>
+        <w:rPr>
+          <w:rFonts w:hint="default" w:eastAsia="新細明體"/>
+          <w:lang w:val="en-US" w:eastAsia="zh-TW"/>
+        </w:rPr>
+      </w:pPr>
+      <w:r>
+        <w:rPr>
+          <w:rFonts w:hint="default" w:eastAsia="新細明體"/>
+          <w:lang w:val="en-US" w:eastAsia="zh-TW"/>
+        </w:rPr>
+        <w:t>6/26</w:t>
+      </w:r>
+    </w:p>
+    <w:p>
+      <w:pPr>
+        <w:pStyle w:val="28"/>
+        <w:widowControl w:val="0"/>
+        <w:numPr>
+          <w:ilvl w:val="0"/>
+          <w:numId w:val="11"/>
+        </w:numPr>
+        <w:spacing w:after="160" w:line="278" w:lineRule="auto"/>
+        <w:ind w:left="420" w:leftChars="0" w:hanging="420" w:firstLineChars="0"/>
+        <w:contextualSpacing/>
+        <w:rPr>
+          <w:rFonts w:hint="default" w:eastAsia="新細明體"/>
+          <w:lang w:val="en-US" w:eastAsia="zh-TW"/>
+        </w:rPr>
+      </w:pPr>
+      <w:r>
+        <w:rPr>
+          <w:rFonts w:hint="eastAsia" w:eastAsia="新細明體"/>
+          <w:lang w:val="en-US" w:eastAsia="zh-TW"/>
+        </w:rPr>
+        <w:t>還需要的功能：</w:t>
+      </w:r>
+    </w:p>
+    <w:p>
+      <w:pPr>
+        <w:pStyle w:val="28"/>
+        <w:widowControl w:val="0"/>
+        <w:numPr>
+          <w:ilvl w:val="1"/>
+          <w:numId w:val="11"/>
+        </w:numPr>
+        <w:spacing w:after="160" w:line="278" w:lineRule="auto"/>
+        <w:ind w:left="840" w:leftChars="0" w:hanging="420" w:firstLineChars="0"/>
+        <w:contextualSpacing/>
+        <w:rPr>
+          <w:rFonts w:hint="default" w:eastAsia="新細明體"/>
+          <w:lang w:val="en-US" w:eastAsia="zh-TW"/>
+        </w:rPr>
+      </w:pPr>
       <w:bookmarkStart w:id="0" w:name="_GoBack"/>
-      <w:bookmarkEnd w:id="0"/>
+      <w:r>
+        <w:rPr>
+          <w:rFonts w:hint="eastAsia" w:eastAsia="新細明體"/>
+          <w:lang w:val="en-US" w:eastAsia="zh-TW"/>
+        </w:rPr>
+        <w:t>把</w:t>
+      </w:r>
+      <w:r>
+        <w:rPr>
+          <w:rFonts w:hint="default" w:eastAsia="新細明體"/>
+          <w:lang w:val="en-US" w:eastAsia="zh-TW"/>
+        </w:rPr>
+        <w:t xml:space="preserve">summary, QA </w:t>
+      </w:r>
+      <w:r>
+        <w:rPr>
+          <w:rFonts w:hint="eastAsia" w:eastAsia="新細明體"/>
+          <w:lang w:val="en-US" w:eastAsia="zh-TW"/>
+        </w:rPr>
+        <w:t>改成一個對話匡，可以複製回覆</w:t>
+      </w:r>
+    </w:p>
+    <w:bookmarkEnd w:id="0"/>
+    <w:p>
+      <w:pPr>
+        <w:pStyle w:val="28"/>
+        <w:widowControl w:val="0"/>
+        <w:numPr>
+          <w:ilvl w:val="1"/>
+          <w:numId w:val="11"/>
+        </w:numPr>
+        <w:spacing w:after="160" w:line="278" w:lineRule="auto"/>
+        <w:ind w:left="840" w:leftChars="0" w:hanging="420" w:firstLineChars="0"/>
+        <w:contextualSpacing/>
+        <w:rPr>
+          <w:rFonts w:hint="default" w:eastAsia="新細明體"/>
+          <w:lang w:val="en-US" w:eastAsia="zh-TW"/>
+        </w:rPr>
+      </w:pPr>
+      <w:r>
+        <w:rPr>
+          <w:rFonts w:hint="eastAsia" w:eastAsia="新細明體"/>
+          <w:lang w:val="en-US" w:eastAsia="zh-TW"/>
+        </w:rPr>
+        <w:t>客製化</w:t>
+      </w:r>
+      <w:r>
+        <w:rPr>
+          <w:rFonts w:hint="default" w:eastAsia="新細明體"/>
+          <w:lang w:val="en-US" w:eastAsia="zh-TW"/>
+        </w:rPr>
+        <w:t xml:space="preserve"> prompt</w:t>
+      </w:r>
+      <w:r>
+        <w:rPr>
+          <w:rFonts w:hint="eastAsia" w:eastAsia="新細明體"/>
+          <w:lang w:val="en-US" w:eastAsia="zh-TW"/>
+        </w:rPr>
+        <w:t>、給推薦的</w:t>
+      </w:r>
+      <w:r>
+        <w:rPr>
+          <w:rFonts w:hint="default" w:eastAsia="新細明體"/>
+          <w:lang w:val="en-US" w:eastAsia="zh-TW"/>
+        </w:rPr>
+        <w:t xml:space="preserve"> prompt</w:t>
+      </w:r>
+    </w:p>
+    <w:p>
+      <w:pPr>
+        <w:pStyle w:val="28"/>
+        <w:widowControl w:val="0"/>
+        <w:numPr>
+          <w:ilvl w:val="1"/>
+          <w:numId w:val="11"/>
+        </w:numPr>
+        <w:spacing w:after="160" w:line="278" w:lineRule="auto"/>
+        <w:ind w:left="840" w:leftChars="0" w:hanging="420" w:firstLineChars="0"/>
+        <w:contextualSpacing/>
+        <w:rPr>
+          <w:rFonts w:hint="default" w:eastAsia="新細明體"/>
+          <w:lang w:val="en-US" w:eastAsia="zh-TW"/>
+        </w:rPr>
+      </w:pPr>
+      <w:r>
+        <w:rPr>
+          <w:rFonts w:hint="eastAsia" w:eastAsia="新細明體"/>
+          <w:lang w:val="en-US" w:eastAsia="zh-TW"/>
+        </w:rPr>
+        <w:t>目前只能針對文字去複製，想要針對一個圖片去詢問</w:t>
+      </w:r>
+    </w:p>
+    <w:p>
+      <w:pPr>
+        <w:pStyle w:val="28"/>
+        <w:widowControl w:val="0"/>
+        <w:numPr>
+          <w:ilvl w:val="1"/>
+          <w:numId w:val="11"/>
+        </w:numPr>
+        <w:spacing w:after="160" w:line="278" w:lineRule="auto"/>
+        <w:ind w:left="840" w:leftChars="0" w:hanging="420" w:firstLineChars="0"/>
+        <w:contextualSpacing/>
+        <w:rPr>
+          <w:rFonts w:hint="default" w:eastAsia="新細明體"/>
+          <w:lang w:val="en-US" w:eastAsia="zh-TW"/>
+        </w:rPr>
+      </w:pPr>
+      <w:r>
+        <w:rPr>
+          <w:rFonts w:hint="eastAsia" w:eastAsia="新細明體"/>
+          <w:lang w:val="en-US" w:eastAsia="zh-TW"/>
+        </w:rPr>
+        <w:t>可以提供完整的筆記</w:t>
+      </w:r>
+    </w:p>
+    <w:p>
+      <w:pPr>
+        <w:pStyle w:val="28"/>
+        <w:widowControl w:val="0"/>
+        <w:numPr>
+          <w:ilvl w:val="1"/>
+          <w:numId w:val="11"/>
+        </w:numPr>
+        <w:spacing w:after="160" w:line="278" w:lineRule="auto"/>
+        <w:ind w:left="840" w:leftChars="0" w:hanging="420" w:firstLineChars="0"/>
+        <w:contextualSpacing/>
+        <w:rPr>
+          <w:rFonts w:hint="default" w:eastAsia="新細明體"/>
+          <w:lang w:val="en-US" w:eastAsia="zh-TW"/>
+        </w:rPr>
+      </w:pPr>
+      <w:r>
+        <w:rPr>
+          <w:rFonts w:hint="default" w:eastAsia="新細明體"/>
+          <w:lang w:val="en-US" w:eastAsia="zh-TW"/>
+        </w:rPr>
+        <w:t xml:space="preserve">note </w:t>
+      </w:r>
+      <w:r>
+        <w:rPr>
+          <w:rFonts w:hint="eastAsia" w:eastAsia="新細明體"/>
+          <w:lang w:val="en-US" w:eastAsia="zh-TW"/>
+        </w:rPr>
+        <w:t>可以</w:t>
+      </w:r>
+      <w:r>
+        <w:rPr>
+          <w:rFonts w:hint="default" w:eastAsia="新細明體"/>
+          <w:lang w:val="en-US" w:eastAsia="zh-TW"/>
+        </w:rPr>
+        <w:t>merge</w:t>
+      </w:r>
+      <w:r>
+        <w:rPr>
+          <w:rFonts w:hint="eastAsia" w:eastAsia="新細明體"/>
+          <w:lang w:val="en-US" w:eastAsia="zh-TW"/>
+        </w:rPr>
+        <w:t>整份檔案並且下載</w:t>
+      </w:r>
+    </w:p>
+    <w:p>
+      <w:pPr>
+        <w:pStyle w:val="28"/>
+        <w:widowControl w:val="0"/>
+        <w:numPr>
+          <w:ilvl w:val="0"/>
+          <w:numId w:val="11"/>
+        </w:numPr>
+        <w:spacing w:after="160" w:line="278" w:lineRule="auto"/>
+        <w:ind w:left="420" w:leftChars="0" w:hanging="420" w:firstLineChars="0"/>
+        <w:contextualSpacing/>
+        <w:rPr>
+          <w:rFonts w:hint="default" w:eastAsia="新細明體"/>
+          <w:lang w:val="en-US" w:eastAsia="zh-TW"/>
+        </w:rPr>
+      </w:pPr>
+      <w:r>
+        <w:rPr>
+          <w:rFonts w:hint="default" w:eastAsia="新細明體"/>
+          <w:lang w:val="en-US" w:eastAsia="zh-TW"/>
+        </w:rPr>
+        <w:t>Non MVP</w:t>
+      </w:r>
+      <w:r>
+        <w:rPr>
+          <w:rFonts w:hint="eastAsia" w:eastAsia="新細明體"/>
+          <w:lang w:val="en-US" w:eastAsia="zh-TW"/>
+        </w:rPr>
+        <w:t>：</w:t>
+      </w:r>
+    </w:p>
+    <w:p>
+      <w:pPr>
+        <w:pStyle w:val="28"/>
+        <w:widowControl w:val="0"/>
+        <w:numPr>
+          <w:ilvl w:val="1"/>
+          <w:numId w:val="11"/>
+        </w:numPr>
+        <w:spacing w:after="160" w:line="278" w:lineRule="auto"/>
+        <w:ind w:left="840" w:leftChars="0" w:hanging="420" w:firstLineChars="0"/>
+        <w:contextualSpacing/>
+        <w:rPr>
+          <w:rFonts w:hint="default" w:eastAsia="新細明體"/>
+          <w:lang w:val="en-US" w:eastAsia="zh-TW"/>
+        </w:rPr>
+      </w:pPr>
+      <w:r>
+        <w:rPr>
+          <w:rFonts w:hint="eastAsia" w:eastAsia="新細明體"/>
+          <w:lang w:val="en-US" w:eastAsia="zh-TW"/>
+        </w:rPr>
+        <w:t>編輯筆記</w:t>
+      </w:r>
+    </w:p>
+    <w:p>
+      <w:pPr>
+        <w:pStyle w:val="28"/>
+        <w:widowControl w:val="0"/>
+        <w:numPr>
+          <w:ilvl w:val="1"/>
+          <w:numId w:val="11"/>
+        </w:numPr>
+        <w:spacing w:after="160" w:line="278" w:lineRule="auto"/>
+        <w:ind w:left="840" w:leftChars="0" w:hanging="420" w:firstLineChars="0"/>
+        <w:contextualSpacing/>
+        <w:rPr>
+          <w:rFonts w:hint="default" w:eastAsia="新細明體"/>
+          <w:lang w:val="en-US" w:eastAsia="zh-TW"/>
+        </w:rPr>
+      </w:pPr>
+      <w:r>
+        <w:rPr>
+          <w:rFonts w:hint="eastAsia" w:eastAsia="新細明體"/>
+          <w:lang w:val="en-US" w:eastAsia="zh-TW"/>
+        </w:rPr>
+        <w:t>優化</w:t>
+      </w:r>
+      <w:r>
+        <w:rPr>
+          <w:rFonts w:hint="default" w:eastAsia="新細明體"/>
+          <w:lang w:val="en-US" w:eastAsia="zh-TW"/>
+        </w:rPr>
+        <w:t>UI</w:t>
+      </w:r>
+      <w:r>
+        <w:rPr>
+          <w:rFonts w:hint="eastAsia" w:eastAsia="新細明體"/>
+          <w:lang w:val="en-US" w:eastAsia="zh-TW"/>
+        </w:rPr>
+        <w:t>：例如可以有黑色</w:t>
+      </w:r>
+      <w:r>
+        <w:rPr>
+          <w:rFonts w:hint="default" w:eastAsia="新細明體"/>
+          <w:lang w:val="en-US" w:eastAsia="zh-TW"/>
+        </w:rPr>
+        <w:t>mode</w:t>
+      </w:r>
+    </w:p>
+    <w:p>
+      <w:pPr>
+        <w:pStyle w:val="28"/>
+        <w:widowControl w:val="0"/>
+        <w:numPr>
+          <w:ilvl w:val="0"/>
+          <w:numId w:val="11"/>
+        </w:numPr>
+        <w:spacing w:after="160" w:line="278" w:lineRule="auto"/>
+        <w:ind w:left="420" w:leftChars="0" w:hanging="420" w:firstLineChars="0"/>
+        <w:contextualSpacing/>
+        <w:rPr>
+          <w:rFonts w:hint="default" w:eastAsia="新細明體"/>
+          <w:lang w:val="en-US" w:eastAsia="zh-TW"/>
+        </w:rPr>
+      </w:pPr>
+      <w:r>
+        <w:rPr>
+          <w:rFonts w:hint="eastAsia" w:eastAsia="新細明體"/>
+          <w:lang w:val="en-US" w:eastAsia="zh-TW"/>
+        </w:rPr>
+        <w:t>上線的話，要讓使用者使用自己的</w:t>
+      </w:r>
+      <w:r>
+        <w:rPr>
+          <w:rFonts w:hint="default" w:eastAsia="新細明體"/>
+          <w:lang w:val="en-US" w:eastAsia="zh-TW"/>
+        </w:rPr>
+        <w:t>api</w:t>
+      </w:r>
+      <w:r>
+        <w:rPr>
+          <w:rFonts w:hint="eastAsia" w:eastAsia="新細明體"/>
+          <w:lang w:val="en-US" w:eastAsia="zh-TW"/>
+        </w:rPr>
+        <w:t>？</w:t>
+      </w:r>
+    </w:p>
+    <w:p>
+      <w:pPr>
+        <w:pStyle w:val="28"/>
+        <w:widowControl w:val="0"/>
+        <w:numPr>
+          <w:ilvl w:val="0"/>
+          <w:numId w:val="11"/>
+        </w:numPr>
+        <w:spacing w:after="160" w:line="278" w:lineRule="auto"/>
+        <w:ind w:left="420" w:leftChars="0" w:hanging="420" w:firstLineChars="0"/>
+        <w:contextualSpacing/>
+        <w:rPr>
+          <w:rFonts w:hint="default" w:eastAsia="新細明體"/>
+          <w:lang w:val="en-US" w:eastAsia="zh-TW"/>
+        </w:rPr>
+      </w:pPr>
+      <w:r>
+        <w:rPr>
+          <w:rFonts w:hint="default" w:eastAsia="新細明體"/>
+          <w:lang w:val="en-US" w:eastAsia="zh-TW"/>
+        </w:rPr>
+        <w:t>local db?</w:t>
+      </w:r>
     </w:p>
     <w:sectPr>
       <w:pgSz w:w="11906" w:h="16838"/>
@@ -3534,6 +3937,146 @@
     </w:lvl>
   </w:abstractNum>
   <w:abstractNum w:abstractNumId="5">
+    <w:nsid w:val="F74CE0E3"/>
+    <w:multiLevelType w:val="multilevel"/>
+    <w:tmpl w:val="F74CE0E3"/>
+    <w:lvl w:ilvl="0" w:tentative="0">
+      <w:start w:val="1"/>
+      <w:numFmt w:val="bullet"/>
+      <w:lvlText w:val=""/>
+      <w:lvlJc w:val="left"/>
+      <w:pPr>
+        <w:tabs>
+          <w:tab w:val="left" w:pos="420"/>
+        </w:tabs>
+        <w:ind w:left="420" w:leftChars="0" w:hanging="420" w:firstLineChars="0"/>
+      </w:pPr>
+      <w:rPr>
+        <w:rFonts w:hint="default" w:ascii="Wingdings" w:hAnsi="Wingdings"/>
+      </w:rPr>
+    </w:lvl>
+    <w:lvl w:ilvl="1" w:tentative="0">
+      <w:start w:val="1"/>
+      <w:numFmt w:val="bullet"/>
+      <w:lvlText w:val=""/>
+      <w:lvlJc w:val="left"/>
+      <w:pPr>
+        <w:tabs>
+          <w:tab w:val="left" w:pos="840"/>
+        </w:tabs>
+        <w:ind w:left="840" w:leftChars="0" w:hanging="420" w:firstLineChars="0"/>
+      </w:pPr>
+      <w:rPr>
+        <w:rFonts w:hint="default" w:ascii="Wingdings" w:hAnsi="Wingdings"/>
+      </w:rPr>
+    </w:lvl>
+    <w:lvl w:ilvl="2" w:tentative="0">
+      <w:start w:val="1"/>
+      <w:numFmt w:val="bullet"/>
+      <w:lvlText w:val=""/>
+      <w:lvlJc w:val="left"/>
+      <w:pPr>
+        <w:tabs>
+          <w:tab w:val="left" w:pos="1260"/>
+        </w:tabs>
+        <w:ind w:left="1260" w:leftChars="0" w:hanging="420" w:firstLineChars="0"/>
+      </w:pPr>
+      <w:rPr>
+        <w:rFonts w:hint="default" w:ascii="Wingdings" w:hAnsi="Wingdings"/>
+      </w:rPr>
+    </w:lvl>
+    <w:lvl w:ilvl="3" w:tentative="0">
+      <w:start w:val="1"/>
+      <w:numFmt w:val="bullet"/>
+      <w:lvlText w:val=""/>
+      <w:lvlJc w:val="left"/>
+      <w:pPr>
+        <w:tabs>
+          <w:tab w:val="left" w:pos="1680"/>
+        </w:tabs>
+        <w:ind w:left="1680" w:leftChars="0" w:hanging="420" w:firstLineChars="0"/>
+      </w:pPr>
+      <w:rPr>
+        <w:rFonts w:hint="default" w:ascii="Wingdings" w:hAnsi="Wingdings"/>
+      </w:rPr>
+    </w:lvl>
+    <w:lvl w:ilvl="4" w:tentative="0">
+      <w:start w:val="1"/>
+      <w:numFmt w:val="bullet"/>
+      <w:lvlText w:val=""/>
+      <w:lvlJc w:val="left"/>
+      <w:pPr>
+        <w:tabs>
+          <w:tab w:val="left" w:pos="2100"/>
+        </w:tabs>
+        <w:ind w:left="2100" w:leftChars="0" w:hanging="420" w:firstLineChars="0"/>
+      </w:pPr>
+      <w:rPr>
+        <w:rFonts w:hint="default" w:ascii="Wingdings" w:hAnsi="Wingdings"/>
+      </w:rPr>
+    </w:lvl>
+    <w:lvl w:ilvl="5" w:tentative="0">
+      <w:start w:val="1"/>
+      <w:numFmt w:val="bullet"/>
+      <w:lvlText w:val=""/>
+      <w:lvlJc w:val="left"/>
+      <w:pPr>
+        <w:tabs>
+          <w:tab w:val="left" w:pos="2520"/>
+        </w:tabs>
+        <w:ind w:left="2520" w:leftChars="0" w:hanging="420" w:firstLineChars="0"/>
+      </w:pPr>
+      <w:rPr>
+        <w:rFonts w:hint="default" w:ascii="Wingdings" w:hAnsi="Wingdings"/>
+      </w:rPr>
+    </w:lvl>
+    <w:lvl w:ilvl="6" w:tentative="0">
+      <w:start w:val="1"/>
+      <w:numFmt w:val="bullet"/>
+      <w:lvlText w:val=""/>
+      <w:lvlJc w:val="left"/>
+      <w:pPr>
+        <w:tabs>
+          <w:tab w:val="left" w:pos="2940"/>
+        </w:tabs>
+        <w:ind w:left="2940" w:leftChars="0" w:hanging="420" w:firstLineChars="0"/>
+      </w:pPr>
+      <w:rPr>
+        <w:rFonts w:hint="default" w:ascii="Wingdings" w:hAnsi="Wingdings"/>
+      </w:rPr>
+    </w:lvl>
+    <w:lvl w:ilvl="7" w:tentative="0">
+      <w:start w:val="1"/>
+      <w:numFmt w:val="bullet"/>
+      <w:lvlText w:val=""/>
+      <w:lvlJc w:val="left"/>
+      <w:pPr>
+        <w:tabs>
+          <w:tab w:val="left" w:pos="3360"/>
+        </w:tabs>
+        <w:ind w:left="3360" w:leftChars="0" w:hanging="420" w:firstLineChars="0"/>
+      </w:pPr>
+      <w:rPr>
+        <w:rFonts w:hint="default" w:ascii="Wingdings" w:hAnsi="Wingdings"/>
+      </w:rPr>
+    </w:lvl>
+    <w:lvl w:ilvl="8" w:tentative="0">
+      <w:start w:val="1"/>
+      <w:numFmt w:val="bullet"/>
+      <w:lvlText w:val=""/>
+      <w:lvlJc w:val="left"/>
+      <w:pPr>
+        <w:tabs>
+          <w:tab w:val="left" w:pos="3780"/>
+        </w:tabs>
+        <w:ind w:left="3780" w:leftChars="0" w:hanging="420" w:firstLineChars="0"/>
+      </w:pPr>
+      <w:rPr>
+        <w:rFonts w:hint="default" w:ascii="Wingdings" w:hAnsi="Wingdings"/>
+      </w:rPr>
+    </w:lvl>
+  </w:abstractNum>
+  <w:abstractNum w:abstractNumId="6">
     <w:nsid w:val="FFFBD9F0"/>
     <w:multiLevelType w:val="multilevel"/>
     <w:tmpl w:val="FFFBD9F0"/>
@@ -3673,7 +4216,7 @@
       </w:rPr>
     </w:lvl>
   </w:abstractNum>
-  <w:abstractNum w:abstractNumId="6">
+  <w:abstractNum w:abstractNumId="7">
     <w:nsid w:val="0B3C2EF0"/>
     <w:multiLevelType w:val="multilevel"/>
     <w:tmpl w:val="0B3C2EF0"/>
@@ -3786,7 +4329,7 @@
       </w:rPr>
     </w:lvl>
   </w:abstractNum>
-  <w:abstractNum w:abstractNumId="7">
+  <w:abstractNum w:abstractNumId="8">
     <w:nsid w:val="2D821E64"/>
     <w:multiLevelType w:val="multilevel"/>
     <w:tmpl w:val="2D821E64"/>
@@ -3899,7 +4442,7 @@
       </w:rPr>
     </w:lvl>
   </w:abstractNum>
-  <w:abstractNum w:abstractNumId="8">
+  <w:abstractNum w:abstractNumId="9">
     <w:nsid w:val="378FFA6E"/>
     <w:multiLevelType w:val="multilevel"/>
     <w:tmpl w:val="378FFA6E"/>
@@ -4039,7 +4582,7 @@
       </w:rPr>
     </w:lvl>
   </w:abstractNum>
-  <w:abstractNum w:abstractNumId="9">
+  <w:abstractNum w:abstractNumId="10">
     <w:nsid w:val="7FFBCA86"/>
     <w:multiLevelType w:val="singleLevel"/>
     <w:tmpl w:val="7FFBCA86"/>
@@ -4060,25 +4603,25 @@
     </w:lvl>
   </w:abstractNum>
   <w:num w:numId="1">
-    <w:abstractNumId w:val="6"/>
+    <w:abstractNumId w:val="7"/>
   </w:num>
   <w:num w:numId="2">
     <w:abstractNumId w:val="0"/>
   </w:num>
   <w:num w:numId="3">
-    <w:abstractNumId w:val="5"/>
+    <w:abstractNumId w:val="6"/>
   </w:num>
   <w:num w:numId="4">
     <w:abstractNumId w:val="1"/>
   </w:num>
   <w:num w:numId="5">
-    <w:abstractNumId w:val="7"/>
+    <w:abstractNumId w:val="8"/>
   </w:num>
   <w:num w:numId="6">
-    <w:abstractNumId w:val="8"/>
+    <w:abstractNumId w:val="9"/>
   </w:num>
   <w:num w:numId="7">
-    <w:abstractNumId w:val="9"/>
+    <w:abstractNumId w:val="10"/>
   </w:num>
   <w:num w:numId="8">
     <w:abstractNumId w:val="2"/>
@@ -4088,6 +4631,9 @@
   </w:num>
   <w:num w:numId="10">
     <w:abstractNumId w:val="3"/>
+  </w:num>
+  <w:num w:numId="11">
+    <w:abstractNumId w:val="5"/>
   </w:num>
 </w:numbering>
 </file>

</xml_diff>

<commit_message>
feat: add AI settings management and prompt customization
- Introduced AISettingsButton component for managing prompt preferences.
- Updated API to accept optional system and user prompts in QA requests.
- Integrated prompt preferences into page chat and summary components.
- Enhanced AI response generation with customizable prompts based on user settings.
- Added functionality to suggest prompt preferences based on document content.
- Improved user experience with a modal for AI settings and prompt adjustments.
</commit_message>
<xml_diff>
--- a/日記.docx
+++ b/日記.docx
@@ -2970,7 +2970,6 @@
           <w:lang w:val="en-US" w:eastAsia="zh-TW"/>
         </w:rPr>
       </w:pPr>
-      <w:bookmarkStart w:id="0" w:name="_GoBack"/>
       <w:r>
         <w:rPr>
           <w:rFonts w:hint="eastAsia" w:eastAsia="新細明體"/>
@@ -2993,7 +2992,6 @@
         <w:t>改成一個對話匡，可以複製回覆</w:t>
       </w:r>
     </w:p>
-    <w:bookmarkEnd w:id="0"/>
     <w:p>
       <w:pPr>
         <w:pStyle w:val="28"/>
@@ -3022,7 +3020,16 @@
           <w:rFonts w:hint="default" w:eastAsia="新細明體"/>
           <w:lang w:val="en-US" w:eastAsia="zh-TW"/>
         </w:rPr>
-        <w:t xml:space="preserve"> prompt</w:t>
+        <w:t xml:space="preserve"> pro</w:t>
+      </w:r>
+      <w:bookmarkStart w:id="0" w:name="_GoBack"/>
+      <w:bookmarkEnd w:id="0"/>
+      <w:r>
+        <w:rPr>
+          <w:rFonts w:hint="default" w:eastAsia="新細明體"/>
+          <w:lang w:val="en-US" w:eastAsia="zh-TW"/>
+        </w:rPr>
+        <w:t>mpt</w:t>
       </w:r>
       <w:r>
         <w:rPr>
@@ -3061,6 +3068,44 @@
           <w:lang w:val="en-US" w:eastAsia="zh-TW"/>
         </w:rPr>
         <w:t>目前只能針對文字去複製，想要針對一個圖片去詢問</w:t>
+      </w:r>
+    </w:p>
+    <w:p>
+      <w:pPr>
+        <w:pStyle w:val="28"/>
+        <w:widowControl w:val="0"/>
+        <w:numPr>
+          <w:ilvl w:val="2"/>
+          <w:numId w:val="11"/>
+        </w:numPr>
+        <w:spacing w:after="160" w:line="278" w:lineRule="auto"/>
+        <w:ind w:left="1260" w:leftChars="0" w:hanging="420" w:firstLineChars="0"/>
+        <w:contextualSpacing/>
+        <w:rPr>
+          <w:rFonts w:hint="default" w:eastAsia="新細明體"/>
+          <w:lang w:val="en-US" w:eastAsia="zh-TW"/>
+        </w:rPr>
+      </w:pPr>
+      <w:r>
+        <w:rPr>
+          <w:rFonts w:hint="eastAsia" w:eastAsia="新細明體"/>
+          <w:lang w:val="en-US" w:eastAsia="zh-TW"/>
+        </w:rPr>
+        <w:t>如果</w:t>
+      </w:r>
+      <w:r>
+        <w:rPr>
+          <w:rFonts w:hint="default" w:eastAsia="新細明體"/>
+          <w:lang w:val="en-US" w:eastAsia="zh-TW"/>
+        </w:rPr>
+        <w:t>pdf</w:t>
+      </w:r>
+      <w:r>
+        <w:rPr>
+          <w:rFonts w:hint="eastAsia" w:eastAsia="新細明體"/>
+          <w:lang w:val="en-US" w:eastAsia="zh-TW"/>
+        </w:rPr>
+        <w:t>是圖片檔，會無法做摘要</w:t>
       </w:r>
     </w:p>
     <w:p>

</xml_diff>

<commit_message>
feat: enhance login page with new layout and Google sign-in functionality; add self-playing demo component
</commit_message>
<xml_diff>
--- a/日記.docx
+++ b/日記.docx
@@ -4125,19 +4125,7 @@
         <w:rPr>
           <w:rFonts w:eastAsia="新細明體" w:hint="eastAsia"/>
         </w:rPr>
-        <w:t>調整模式，例如從</w:t>
-      </w:r>
-      <w:r>
-        <w:rPr>
-          <w:rFonts w:eastAsia="新細明體" w:hint="eastAsia"/>
-        </w:rPr>
-        <w:t>詳細講解</w:t>
-      </w:r>
-      <w:r>
-        <w:rPr>
-          <w:rFonts w:eastAsia="新細明體" w:hint="eastAsia"/>
-        </w:rPr>
-        <w:t>改成條列式，當然這裡也可以調整</w:t>
+        <w:t>調整模式，例如從詳細講解改成條列式，當然這裡也可以調整</w:t>
       </w:r>
       <w:r>
         <w:rPr>
@@ -4315,8 +4303,20 @@
           <w:szCs w:val="21"/>
           <w:shd w:val="clear" w:color="auto" w:fill="FFFFFF"/>
         </w:rPr>
-        <w:t>詳細</w:t>
-      </w:r>
+        <w:t>詳細、完整說明</w:t>
+      </w:r>
+    </w:p>
+    <w:p>
+      <w:pPr>
+        <w:pStyle w:val="a9"/>
+        <w:numPr>
+          <w:ilvl w:val="3"/>
+          <w:numId w:val="14"/>
+        </w:numPr>
+        <w:rPr>
+          <w:rFonts w:eastAsia="新細明體"/>
+        </w:rPr>
+      </w:pPr>
       <w:r>
         <w:rPr>
           <w:rFonts w:ascii="Segoe UI" w:hAnsi="Segoe UI" w:cs="Segoe UI" w:hint="eastAsia"/>
@@ -4324,8 +4324,20 @@
           <w:szCs w:val="21"/>
           <w:shd w:val="clear" w:color="auto" w:fill="FFFFFF"/>
         </w:rPr>
-        <w:t>、</w:t>
-      </w:r>
+        <w:t>簡報：簡潔、條列式</w:t>
+      </w:r>
+    </w:p>
+    <w:p>
+      <w:pPr>
+        <w:pStyle w:val="a9"/>
+        <w:numPr>
+          <w:ilvl w:val="3"/>
+          <w:numId w:val="14"/>
+        </w:numPr>
+        <w:rPr>
+          <w:rFonts w:eastAsia="新細明體"/>
+        </w:rPr>
+      </w:pPr>
       <w:r>
         <w:rPr>
           <w:rFonts w:ascii="Segoe UI" w:hAnsi="Segoe UI" w:cs="Segoe UI" w:hint="eastAsia"/>
@@ -4333,7 +4345,7 @@
           <w:szCs w:val="21"/>
           <w:shd w:val="clear" w:color="auto" w:fill="FFFFFF"/>
         </w:rPr>
-        <w:t>完整說明</w:t>
+        <w:t>課本：教學語氣、完整說明</w:t>
       </w:r>
     </w:p>
     <w:p>
@@ -4354,130 +4366,7 @@
           <w:szCs w:val="21"/>
           <w:shd w:val="clear" w:color="auto" w:fill="FFFFFF"/>
         </w:rPr>
-        <w:t>簡報：</w:t>
-      </w:r>
-      <w:r>
-        <w:rPr>
-          <w:rFonts w:ascii="Segoe UI" w:hAnsi="Segoe UI" w:cs="Segoe UI" w:hint="eastAsia"/>
-          <w:sz w:val="21"/>
-          <w:szCs w:val="21"/>
-          <w:shd w:val="clear" w:color="auto" w:fill="FFFFFF"/>
-        </w:rPr>
-        <w:t>簡潔</w:t>
-      </w:r>
-      <w:r>
-        <w:rPr>
-          <w:rFonts w:ascii="Segoe UI" w:hAnsi="Segoe UI" w:cs="Segoe UI" w:hint="eastAsia"/>
-          <w:sz w:val="21"/>
-          <w:szCs w:val="21"/>
-          <w:shd w:val="clear" w:color="auto" w:fill="FFFFFF"/>
-        </w:rPr>
-        <w:t>、</w:t>
-      </w:r>
-      <w:r>
-        <w:rPr>
-          <w:rFonts w:ascii="Segoe UI" w:hAnsi="Segoe UI" w:cs="Segoe UI" w:hint="eastAsia"/>
-          <w:sz w:val="21"/>
-          <w:szCs w:val="21"/>
-          <w:shd w:val="clear" w:color="auto" w:fill="FFFFFF"/>
-        </w:rPr>
-        <w:t>條列式</w:t>
-      </w:r>
-    </w:p>
-    <w:p>
-      <w:pPr>
-        <w:pStyle w:val="a9"/>
-        <w:numPr>
-          <w:ilvl w:val="3"/>
-          <w:numId w:val="14"/>
-        </w:numPr>
-        <w:rPr>
-          <w:rFonts w:eastAsia="新細明體"/>
-        </w:rPr>
-      </w:pPr>
-      <w:r>
-        <w:rPr>
-          <w:rFonts w:ascii="Segoe UI" w:hAnsi="Segoe UI" w:cs="Segoe UI" w:hint="eastAsia"/>
-          <w:sz w:val="21"/>
-          <w:szCs w:val="21"/>
-          <w:shd w:val="clear" w:color="auto" w:fill="FFFFFF"/>
-        </w:rPr>
-        <w:t>課本：</w:t>
-      </w:r>
-      <w:r>
-        <w:rPr>
-          <w:rFonts w:ascii="Segoe UI" w:hAnsi="Segoe UI" w:cs="Segoe UI" w:hint="eastAsia"/>
-          <w:sz w:val="21"/>
-          <w:szCs w:val="21"/>
-          <w:shd w:val="clear" w:color="auto" w:fill="FFFFFF"/>
-        </w:rPr>
-        <w:t>教學語氣</w:t>
-      </w:r>
-      <w:r>
-        <w:rPr>
-          <w:rFonts w:ascii="Segoe UI" w:hAnsi="Segoe UI" w:cs="Segoe UI" w:hint="eastAsia"/>
-          <w:sz w:val="21"/>
-          <w:szCs w:val="21"/>
-          <w:shd w:val="clear" w:color="auto" w:fill="FFFFFF"/>
-        </w:rPr>
-        <w:t>、</w:t>
-      </w:r>
-      <w:r>
-        <w:rPr>
-          <w:rFonts w:ascii="Segoe UI" w:hAnsi="Segoe UI" w:cs="Segoe UI" w:hint="eastAsia"/>
-          <w:sz w:val="21"/>
-          <w:szCs w:val="21"/>
-          <w:shd w:val="clear" w:color="auto" w:fill="FFFFFF"/>
-        </w:rPr>
-        <w:t>完整說明</w:t>
-      </w:r>
-    </w:p>
-    <w:p>
-      <w:pPr>
-        <w:pStyle w:val="a9"/>
-        <w:numPr>
-          <w:ilvl w:val="3"/>
-          <w:numId w:val="14"/>
-        </w:numPr>
-        <w:rPr>
-          <w:rFonts w:eastAsia="新細明體" w:hint="eastAsia"/>
-        </w:rPr>
-      </w:pPr>
-      <w:r>
-        <w:rPr>
-          <w:rFonts w:ascii="Segoe UI" w:hAnsi="Segoe UI" w:cs="Segoe UI" w:hint="eastAsia"/>
-          <w:sz w:val="21"/>
-          <w:szCs w:val="21"/>
-          <w:shd w:val="clear" w:color="auto" w:fill="FFFFFF"/>
-        </w:rPr>
-        <w:t>考題：</w:t>
-      </w:r>
-      <w:r>
-        <w:rPr>
-          <w:rFonts w:ascii="Segoe UI" w:hAnsi="Segoe UI" w:cs="Segoe UI" w:hint="eastAsia"/>
-          <w:sz w:val="21"/>
-          <w:szCs w:val="21"/>
-          <w:shd w:val="clear" w:color="auto" w:fill="FFFFFF"/>
-        </w:rPr>
-        <w:t>教學語氣</w:t>
-      </w:r>
-      <w:r>
-        <w:rPr>
-          <w:rFonts w:ascii="Segoe UI" w:hAnsi="Segoe UI" w:cs="Segoe UI" w:hint="eastAsia"/>
-          <w:sz w:val="21"/>
-          <w:szCs w:val="21"/>
-          <w:shd w:val="clear" w:color="auto" w:fill="FFFFFF"/>
-        </w:rPr>
-        <w:t>、</w:t>
-      </w:r>
-      <w:r>
-        <w:rPr>
-          <w:rFonts w:ascii="Segoe UI" w:hAnsi="Segoe UI" w:cs="Segoe UI" w:hint="eastAsia"/>
-          <w:sz w:val="21"/>
-          <w:szCs w:val="21"/>
-          <w:shd w:val="clear" w:color="auto" w:fill="FFFFFF"/>
-        </w:rPr>
-        <w:t>考前重點整理</w:t>
+        <w:t>考題：教學語氣、考前重點整理</w:t>
       </w:r>
     </w:p>
     <w:p>
@@ -4488,7 +4377,7 @@
           <w:numId w:val="14"/>
         </w:numPr>
         <w:rPr>
-          <w:rFonts w:eastAsia="新細明體" w:hint="eastAsia"/>
+          <w:rFonts w:eastAsia="新細明體"/>
         </w:rPr>
       </w:pPr>
       <w:r>
@@ -4668,7 +4557,7 @@
     <w:p>
       <w:pPr>
         <w:rPr>
-          <w:rFonts w:eastAsia="新細明體" w:hint="eastAsia"/>
+          <w:rFonts w:eastAsia="新細明體"/>
         </w:rPr>
       </w:pPr>
     </w:p>
@@ -4781,7 +4670,7 @@
     <w:p>
       <w:pPr>
         <w:rPr>
-          <w:rFonts w:eastAsia="新細明體" w:hint="eastAsia"/>
+          <w:rFonts w:eastAsia="新細明體"/>
         </w:rPr>
       </w:pPr>
       <w:r>
@@ -4847,6 +4736,716 @@
         </w:rPr>
         <w:tab/>
       </w:r>
+    </w:p>
+    <w:p>
+      <w:pPr>
+        <w:rPr>
+          <w:rFonts w:eastAsia="新細明體"/>
+        </w:rPr>
+      </w:pPr>
+      <w:r>
+        <w:rPr>
+          <w:rFonts w:eastAsia="新細明體"/>
+        </w:rPr>
+        <w:t>7/7</w:t>
+      </w:r>
+    </w:p>
+    <w:p>
+      <w:pPr>
+        <w:pStyle w:val="a9"/>
+        <w:numPr>
+          <w:ilvl w:val="0"/>
+          <w:numId w:val="15"/>
+        </w:numPr>
+        <w:rPr>
+          <w:rFonts w:eastAsia="新細明體"/>
+        </w:rPr>
+      </w:pPr>
+      <w:r>
+        <w:rPr>
+          <w:rFonts w:eastAsia="新細明體" w:hint="eastAsia"/>
+        </w:rPr>
+        <w:t>進度：</w:t>
+      </w:r>
+    </w:p>
+    <w:p>
+      <w:pPr>
+        <w:pStyle w:val="a9"/>
+        <w:numPr>
+          <w:ilvl w:val="1"/>
+          <w:numId w:val="15"/>
+        </w:numPr>
+        <w:rPr>
+          <w:rFonts w:eastAsia="新細明體"/>
+        </w:rPr>
+      </w:pPr>
+      <w:r>
+        <w:rPr>
+          <w:rFonts w:eastAsia="新細明體" w:hint="eastAsia"/>
+        </w:rPr>
+        <w:t>把資料庫轉成線上：用</w:t>
+      </w:r>
+      <w:r>
+        <w:rPr>
+          <w:rFonts w:eastAsia="新細明體"/>
+        </w:rPr>
+        <w:t>neon</w:t>
+      </w:r>
+      <w:r>
+        <w:rPr>
+          <w:rFonts w:eastAsia="新細明體" w:hint="eastAsia"/>
+        </w:rPr>
+        <w:t>，一個專門幫忙把</w:t>
+      </w:r>
+      <w:proofErr w:type="spellStart"/>
+      <w:r>
+        <w:rPr>
+          <w:rFonts w:eastAsia="新細明體"/>
+        </w:rPr>
+        <w:t>postgres</w:t>
+      </w:r>
+      <w:proofErr w:type="spellEnd"/>
+      <w:r>
+        <w:rPr>
+          <w:rFonts w:eastAsia="新細明體" w:hint="eastAsia"/>
+        </w:rPr>
+        <w:t>存在雲端的服務</w:t>
+      </w:r>
+    </w:p>
+    <w:p>
+      <w:pPr>
+        <w:pStyle w:val="a9"/>
+        <w:numPr>
+          <w:ilvl w:val="2"/>
+          <w:numId w:val="15"/>
+        </w:numPr>
+        <w:rPr>
+          <w:rFonts w:eastAsia="新細明體"/>
+        </w:rPr>
+      </w:pPr>
+      <w:r>
+        <w:rPr>
+          <w:rFonts w:eastAsia="新細明體"/>
+        </w:rPr>
+        <w:t xml:space="preserve">Neon vs. </w:t>
+      </w:r>
+      <w:proofErr w:type="spellStart"/>
+      <w:r>
+        <w:rPr>
+          <w:rFonts w:eastAsia="新細明體"/>
+        </w:rPr>
+        <w:t>Supabase</w:t>
+      </w:r>
+      <w:proofErr w:type="spellEnd"/>
+    </w:p>
+    <w:p>
+      <w:pPr>
+        <w:pStyle w:val="a9"/>
+        <w:numPr>
+          <w:ilvl w:val="3"/>
+          <w:numId w:val="15"/>
+        </w:numPr>
+        <w:rPr>
+          <w:rFonts w:eastAsia="新細明體"/>
+        </w:rPr>
+      </w:pPr>
+      <w:r>
+        <w:rPr>
+          <w:rFonts w:eastAsia="新細明體" w:hint="eastAsia"/>
+        </w:rPr>
+        <w:t>單純是因為成本考量</w:t>
+      </w:r>
+    </w:p>
+    <w:p>
+      <w:pPr>
+        <w:pStyle w:val="a9"/>
+        <w:numPr>
+          <w:ilvl w:val="3"/>
+          <w:numId w:val="15"/>
+        </w:numPr>
+        <w:rPr>
+          <w:rFonts w:eastAsia="新細明體"/>
+        </w:rPr>
+      </w:pPr>
+      <w:proofErr w:type="spellStart"/>
+      <w:r>
+        <w:rPr>
+          <w:rFonts w:eastAsia="新細明體"/>
+        </w:rPr>
+        <w:t>supabase</w:t>
+      </w:r>
+      <w:proofErr w:type="spellEnd"/>
+      <w:r>
+        <w:rPr>
+          <w:rFonts w:eastAsia="新細明體"/>
+        </w:rPr>
+        <w:t xml:space="preserve"> </w:t>
+      </w:r>
+      <w:r>
+        <w:rPr>
+          <w:rFonts w:eastAsia="新細明體" w:hint="eastAsia"/>
+        </w:rPr>
+        <w:t>其實提供了</w:t>
+      </w:r>
+      <w:r>
+        <w:rPr>
+          <w:rFonts w:eastAsia="新細明體"/>
+        </w:rPr>
+        <w:t xml:space="preserve">auth, </w:t>
+      </w:r>
+      <w:r>
+        <w:rPr>
+          <w:rFonts w:eastAsia="新細明體" w:hint="eastAsia"/>
+        </w:rPr>
+        <w:t>各種</w:t>
+      </w:r>
+      <w:r>
+        <w:rPr>
+          <w:rFonts w:eastAsia="新細明體"/>
+        </w:rPr>
+        <w:t>DB</w:t>
+      </w:r>
+      <w:r>
+        <w:rPr>
+          <w:rFonts w:eastAsia="新細明體" w:hint="eastAsia"/>
+        </w:rPr>
+        <w:t>的存儲，所以很方便，</w:t>
+      </w:r>
+      <w:r>
+        <w:rPr>
+          <w:rFonts w:eastAsia="新細明體" w:hint="eastAsia"/>
+        </w:rPr>
+        <w:lastRenderedPageBreak/>
+        <w:t>可以把</w:t>
+      </w:r>
+      <w:r>
+        <w:rPr>
+          <w:rFonts w:eastAsia="新細明體"/>
+        </w:rPr>
+        <w:t>pdf</w:t>
+      </w:r>
+      <w:r>
+        <w:rPr>
+          <w:rFonts w:eastAsia="新細明體" w:hint="eastAsia"/>
+        </w:rPr>
+        <w:t>跟其他關聯式資料庫存在一起，又不用自己搞</w:t>
+      </w:r>
+      <w:r>
+        <w:rPr>
+          <w:rFonts w:eastAsia="新細明體"/>
+        </w:rPr>
+        <w:t>auth</w:t>
+      </w:r>
+    </w:p>
+    <w:p>
+      <w:pPr>
+        <w:pStyle w:val="a9"/>
+        <w:numPr>
+          <w:ilvl w:val="3"/>
+          <w:numId w:val="15"/>
+        </w:numPr>
+        <w:rPr>
+          <w:rFonts w:eastAsia="新細明體" w:hint="eastAsia"/>
+        </w:rPr>
+      </w:pPr>
+      <w:r>
+        <w:rPr>
+          <w:rFonts w:eastAsia="新細明體" w:hint="eastAsia"/>
+        </w:rPr>
+        <w:t>可是我想到大型</w:t>
+      </w:r>
+      <w:r>
+        <w:rPr>
+          <w:rFonts w:eastAsia="新細明體"/>
+        </w:rPr>
+        <w:t xml:space="preserve">pdf </w:t>
+      </w:r>
+      <w:r>
+        <w:rPr>
+          <w:rFonts w:eastAsia="新細明體" w:hint="eastAsia"/>
+        </w:rPr>
+        <w:t>很佔空間，免費試用版本的空間只有</w:t>
+      </w:r>
+      <w:r>
+        <w:rPr>
+          <w:rFonts w:eastAsia="新細明體"/>
+        </w:rPr>
+        <w:t>0.5G</w:t>
+      </w:r>
+      <w:r>
+        <w:rPr>
+          <w:rFonts w:eastAsia="新細明體" w:hint="eastAsia"/>
+        </w:rPr>
+        <w:t>，如果我改用</w:t>
+      </w:r>
+      <w:r>
+        <w:rPr>
+          <w:rFonts w:eastAsia="新細明體"/>
+        </w:rPr>
+        <w:t>Neon</w:t>
+      </w:r>
+      <w:r>
+        <w:rPr>
+          <w:rFonts w:eastAsia="新細明體" w:hint="eastAsia"/>
+        </w:rPr>
+        <w:t>的話，雖然要自己設定</w:t>
+      </w:r>
+      <w:r>
+        <w:rPr>
+          <w:rFonts w:eastAsia="新細明體"/>
+        </w:rPr>
+        <w:t>auth</w:t>
+      </w:r>
+      <w:r>
+        <w:rPr>
+          <w:rFonts w:eastAsia="新細明體" w:hint="eastAsia"/>
+        </w:rPr>
+        <w:t>，可是</w:t>
+      </w:r>
+      <w:r>
+        <w:rPr>
+          <w:rFonts w:eastAsia="新細明體"/>
+        </w:rPr>
+        <w:t>neon</w:t>
+      </w:r>
+      <w:r>
+        <w:rPr>
+          <w:rFonts w:eastAsia="新細明體" w:hint="eastAsia"/>
+        </w:rPr>
+        <w:t>只負責存關聯式資料庫，我可以把</w:t>
+      </w:r>
+      <w:r>
+        <w:rPr>
+          <w:rFonts w:eastAsia="新細明體"/>
+        </w:rPr>
+        <w:t>pdf</w:t>
+      </w:r>
+      <w:r>
+        <w:rPr>
+          <w:rFonts w:eastAsia="新細明體" w:hint="eastAsia"/>
+        </w:rPr>
+        <w:t>存在</w:t>
+      </w:r>
+      <w:r>
+        <w:rPr>
+          <w:rFonts w:eastAsia="新細明體"/>
+        </w:rPr>
+        <w:t>S3</w:t>
+      </w:r>
+      <w:r>
+        <w:rPr>
+          <w:rFonts w:eastAsia="新細明體" w:hint="eastAsia"/>
+        </w:rPr>
+        <w:t>，這樣每個服務都有他的試用量，就可以不用花錢</w:t>
+      </w:r>
+    </w:p>
+    <w:p>
+      <w:pPr>
+        <w:pStyle w:val="a9"/>
+        <w:numPr>
+          <w:ilvl w:val="1"/>
+          <w:numId w:val="15"/>
+        </w:numPr>
+        <w:rPr>
+          <w:rFonts w:eastAsia="新細明體"/>
+        </w:rPr>
+      </w:pPr>
+      <w:r>
+        <w:rPr>
+          <w:rFonts w:eastAsia="新細明體" w:hint="eastAsia"/>
+        </w:rPr>
+        <w:t>做</w:t>
+      </w:r>
+      <w:r>
+        <w:rPr>
+          <w:rFonts w:eastAsia="新細明體" w:hint="eastAsia"/>
+        </w:rPr>
+        <w:t xml:space="preserve"> </w:t>
+      </w:r>
+      <w:r>
+        <w:rPr>
+          <w:rFonts w:eastAsia="新細明體"/>
+        </w:rPr>
+        <w:t>auth</w:t>
+      </w:r>
+      <w:r>
+        <w:rPr>
+          <w:rFonts w:eastAsia="新細明體" w:hint="eastAsia"/>
+        </w:rPr>
+        <w:t>：用</w:t>
+      </w:r>
+      <w:r>
+        <w:rPr>
+          <w:rFonts w:eastAsia="新細明體"/>
+        </w:rPr>
+        <w:t>next auth</w:t>
+      </w:r>
+      <w:r>
+        <w:rPr>
+          <w:rFonts w:eastAsia="新細明體" w:hint="eastAsia"/>
+        </w:rPr>
+        <w:t>，</w:t>
+      </w:r>
+      <w:r>
+        <w:rPr>
+          <w:rFonts w:eastAsia="新細明體"/>
+        </w:rPr>
+        <w:t>SDK</w:t>
+      </w:r>
+      <w:r>
+        <w:rPr>
+          <w:rFonts w:eastAsia="新細明體" w:hint="eastAsia"/>
+        </w:rPr>
+        <w:t>有說就是設定</w:t>
+      </w:r>
+      <w:r>
+        <w:rPr>
+          <w:rFonts w:eastAsia="新細明體"/>
+        </w:rPr>
+        <w:t xml:space="preserve">provider, session </w:t>
+      </w:r>
+      <w:r>
+        <w:rPr>
+          <w:rFonts w:eastAsia="新細明體" w:hint="eastAsia"/>
+        </w:rPr>
+        <w:t>那些，然後資料庫要新增</w:t>
+      </w:r>
+      <w:r>
+        <w:rPr>
+          <w:rFonts w:eastAsia="新細明體" w:hint="eastAsia"/>
+        </w:rPr>
+        <w:t xml:space="preserve"> </w:t>
+      </w:r>
+      <w:r>
+        <w:rPr>
+          <w:rFonts w:eastAsia="新細明體"/>
+        </w:rPr>
+        <w:t>user</w:t>
+      </w:r>
+      <w:r>
+        <w:rPr>
+          <w:rFonts w:eastAsia="新細明體" w:hint="eastAsia"/>
+        </w:rPr>
+        <w:t>跟</w:t>
+      </w:r>
+      <w:r>
+        <w:rPr>
+          <w:rFonts w:eastAsia="新細明體"/>
+        </w:rPr>
+        <w:t>account</w:t>
+      </w:r>
+      <w:r>
+        <w:rPr>
+          <w:rFonts w:eastAsia="新細明體" w:hint="eastAsia"/>
+        </w:rPr>
+        <w:t>，並且每隻</w:t>
+      </w:r>
+      <w:proofErr w:type="spellStart"/>
+      <w:r>
+        <w:rPr>
+          <w:rFonts w:eastAsia="新細明體"/>
+        </w:rPr>
+        <w:t>api</w:t>
+      </w:r>
+      <w:proofErr w:type="spellEnd"/>
+      <w:r>
+        <w:rPr>
+          <w:rFonts w:eastAsia="新細明體" w:hint="eastAsia"/>
+        </w:rPr>
+        <w:t>都要加上</w:t>
+      </w:r>
+      <w:r>
+        <w:rPr>
+          <w:rFonts w:eastAsia="新細明體"/>
+        </w:rPr>
+        <w:t>token ID</w:t>
+      </w:r>
+      <w:r>
+        <w:rPr>
+          <w:rFonts w:eastAsia="新細明體" w:hint="eastAsia"/>
+        </w:rPr>
+        <w:t>（</w:t>
+      </w:r>
+      <w:proofErr w:type="spellStart"/>
+      <w:r>
+        <w:rPr>
+          <w:rFonts w:eastAsia="新細明體"/>
+        </w:rPr>
+        <w:t>jwt</w:t>
+      </w:r>
+      <w:proofErr w:type="spellEnd"/>
+      <w:r>
+        <w:rPr>
+          <w:rFonts w:eastAsia="新細明體"/>
+        </w:rPr>
+        <w:t xml:space="preserve"> token</w:t>
+      </w:r>
+      <w:r>
+        <w:rPr>
+          <w:rFonts w:eastAsia="新細明體" w:hint="eastAsia"/>
+        </w:rPr>
+        <w:t>）</w:t>
+      </w:r>
+    </w:p>
+    <w:p>
+      <w:pPr>
+        <w:pStyle w:val="a9"/>
+        <w:numPr>
+          <w:ilvl w:val="0"/>
+          <w:numId w:val="15"/>
+        </w:numPr>
+        <w:rPr>
+          <w:rFonts w:eastAsia="新細明體"/>
+        </w:rPr>
+      </w:pPr>
+      <w:r>
+        <w:rPr>
+          <w:rFonts w:eastAsia="新細明體" w:hint="eastAsia"/>
+        </w:rPr>
+        <w:t>規劃：</w:t>
+      </w:r>
+    </w:p>
+    <w:p>
+      <w:pPr>
+        <w:pStyle w:val="a9"/>
+        <w:numPr>
+          <w:ilvl w:val="1"/>
+          <w:numId w:val="15"/>
+        </w:numPr>
+        <w:rPr>
+          <w:rFonts w:eastAsia="新細明體"/>
+        </w:rPr>
+      </w:pPr>
+      <w:r>
+        <w:rPr>
+          <w:rFonts w:eastAsia="新細明體"/>
+        </w:rPr>
+        <w:t>UI</w:t>
+      </w:r>
+      <w:r>
+        <w:rPr>
+          <w:rFonts w:eastAsia="新細明體" w:hint="eastAsia"/>
+        </w:rPr>
+        <w:t>要修改：</w:t>
+      </w:r>
+    </w:p>
+    <w:p>
+      <w:pPr>
+        <w:pStyle w:val="a9"/>
+        <w:numPr>
+          <w:ilvl w:val="2"/>
+          <w:numId w:val="15"/>
+        </w:numPr>
+        <w:rPr>
+          <w:rFonts w:eastAsia="新細明體"/>
+        </w:rPr>
+      </w:pPr>
+      <w:r>
+        <w:rPr>
+          <w:rFonts w:eastAsia="新細明體" w:hint="eastAsia"/>
+        </w:rPr>
+        <w:t>進入資料夾沒有返回按鈕</w:t>
+      </w:r>
+    </w:p>
+    <w:p>
+      <w:pPr>
+        <w:pStyle w:val="a9"/>
+        <w:numPr>
+          <w:ilvl w:val="2"/>
+          <w:numId w:val="15"/>
+        </w:numPr>
+        <w:rPr>
+          <w:rFonts w:eastAsia="新細明體"/>
+        </w:rPr>
+      </w:pPr>
+      <w:r>
+        <w:rPr>
+          <w:rFonts w:eastAsia="新細明體" w:hint="eastAsia"/>
+        </w:rPr>
+        <w:t>登入頁面（首頁）很醜</w:t>
+      </w:r>
+      <w:r>
+        <w:rPr>
+          <w:rFonts w:eastAsia="新細明體" w:hint="eastAsia"/>
+        </w:rPr>
+        <w:t>，可以改成一個動態影像</w:t>
+      </w:r>
+      <w:r>
+        <w:rPr>
+          <w:rFonts w:eastAsia="新細明體"/>
+        </w:rPr>
+        <w:t>demo</w:t>
+      </w:r>
+      <w:r>
+        <w:rPr>
+          <w:rFonts w:eastAsia="新細明體" w:hint="eastAsia"/>
+        </w:rPr>
+        <w:t>整個筆記摘要並且加上一些解說的首頁，然後提供登入按鈕，登入後就到</w:t>
+      </w:r>
+      <w:r>
+        <w:rPr>
+          <w:rFonts w:eastAsia="新細明體"/>
+        </w:rPr>
+        <w:t>library browser</w:t>
+      </w:r>
+    </w:p>
+    <w:p>
+      <w:pPr>
+        <w:pStyle w:val="a9"/>
+        <w:numPr>
+          <w:ilvl w:val="2"/>
+          <w:numId w:val="15"/>
+        </w:numPr>
+        <w:rPr>
+          <w:rFonts w:eastAsia="新細明體"/>
+        </w:rPr>
+      </w:pPr>
+      <w:r>
+        <w:rPr>
+          <w:rFonts w:eastAsia="新細明體" w:hint="eastAsia"/>
+        </w:rPr>
+        <w:t>要提供非登入的選項，直接試用</w:t>
+      </w:r>
+    </w:p>
+    <w:p>
+      <w:pPr>
+        <w:pStyle w:val="a9"/>
+        <w:numPr>
+          <w:ilvl w:val="1"/>
+          <w:numId w:val="15"/>
+        </w:numPr>
+        <w:rPr>
+          <w:rFonts w:eastAsia="新細明體"/>
+        </w:rPr>
+      </w:pPr>
+      <w:r>
+        <w:rPr>
+          <w:rFonts w:eastAsia="新細明體" w:hint="eastAsia"/>
+        </w:rPr>
+        <w:t>功能：</w:t>
+      </w:r>
+    </w:p>
+    <w:p>
+      <w:pPr>
+        <w:pStyle w:val="a9"/>
+        <w:numPr>
+          <w:ilvl w:val="2"/>
+          <w:numId w:val="15"/>
+        </w:numPr>
+        <w:rPr>
+          <w:rFonts w:eastAsia="新細明體"/>
+        </w:rPr>
+      </w:pPr>
+      <w:r>
+        <w:rPr>
+          <w:rFonts w:eastAsia="新細明體" w:hint="eastAsia"/>
+        </w:rPr>
+        <w:t>可以把筆記自動匯入到</w:t>
+      </w:r>
+      <w:r>
+        <w:rPr>
+          <w:rFonts w:eastAsia="新細明體" w:hint="eastAsia"/>
+        </w:rPr>
+        <w:t xml:space="preserve"> </w:t>
+      </w:r>
+      <w:r>
+        <w:rPr>
+          <w:rFonts w:eastAsia="新細明體"/>
+        </w:rPr>
+        <w:t>notion</w:t>
+      </w:r>
+    </w:p>
+    <w:p>
+      <w:pPr>
+        <w:pStyle w:val="a9"/>
+        <w:numPr>
+          <w:ilvl w:val="1"/>
+          <w:numId w:val="15"/>
+        </w:numPr>
+        <w:rPr>
+          <w:rFonts w:eastAsia="新細明體"/>
+        </w:rPr>
+      </w:pPr>
+      <w:r>
+        <w:rPr>
+          <w:rFonts w:eastAsia="新細明體"/>
+        </w:rPr>
+        <w:t>Pdf</w:t>
+      </w:r>
+      <w:r>
+        <w:rPr>
+          <w:rFonts w:eastAsia="新細明體" w:hint="eastAsia"/>
+        </w:rPr>
+        <w:t>文件要存到</w:t>
+      </w:r>
+      <w:r>
+        <w:rPr>
+          <w:rFonts w:ascii="Segoe UI" w:hAnsi="Segoe UI" w:cs="Segoe UI"/>
+          <w:color w:val="0A0A0A"/>
+          <w:sz w:val="21"/>
+          <w:szCs w:val="21"/>
+          <w:shd w:val="clear" w:color="auto" w:fill="FDFDFC"/>
+        </w:rPr>
+        <w:t>Blob</w:t>
+      </w:r>
+      <w:r>
+        <w:rPr>
+          <w:rFonts w:ascii="Segoe UI" w:hAnsi="Segoe UI" w:cs="Segoe UI" w:hint="eastAsia"/>
+          <w:color w:val="0A0A0A"/>
+          <w:sz w:val="21"/>
+          <w:szCs w:val="21"/>
+          <w:shd w:val="clear" w:color="auto" w:fill="FDFDFC"/>
+        </w:rPr>
+        <w:t>或是</w:t>
+      </w:r>
+      <w:r>
+        <w:rPr>
+          <w:rFonts w:ascii="Segoe UI" w:hAnsi="Segoe UI" w:cs="Segoe UI"/>
+          <w:color w:val="0A0A0A"/>
+          <w:sz w:val="21"/>
+          <w:szCs w:val="21"/>
+          <w:shd w:val="clear" w:color="auto" w:fill="FDFDFC"/>
+        </w:rPr>
+        <w:t>S3</w:t>
+      </w:r>
+    </w:p>
+    <w:p>
+      <w:pPr>
+        <w:pStyle w:val="a9"/>
+        <w:numPr>
+          <w:ilvl w:val="1"/>
+          <w:numId w:val="15"/>
+        </w:numPr>
+        <w:rPr>
+          <w:rFonts w:eastAsia="新細明體"/>
+        </w:rPr>
+      </w:pPr>
+      <w:r>
+        <w:rPr>
+          <w:rFonts w:ascii="Segoe UI" w:hAnsi="Segoe UI" w:cs="Segoe UI" w:hint="eastAsia"/>
+          <w:color w:val="0A0A0A"/>
+          <w:shd w:val="clear" w:color="auto" w:fill="FDFDFC"/>
+        </w:rPr>
+        <w:t>部署到</w:t>
+      </w:r>
+      <w:r>
+        <w:rPr>
+          <w:rFonts w:ascii="Segoe UI" w:hAnsi="Segoe UI" w:cs="Segoe UI" w:hint="eastAsia"/>
+          <w:color w:val="0A0A0A"/>
+          <w:shd w:val="clear" w:color="auto" w:fill="FDFDFC"/>
+        </w:rPr>
+        <w:t xml:space="preserve"> </w:t>
+      </w:r>
+      <w:proofErr w:type="spellStart"/>
+      <w:r>
+        <w:rPr>
+          <w:rFonts w:ascii="Segoe UI" w:hAnsi="Segoe UI" w:cs="Segoe UI"/>
+          <w:color w:val="0A0A0A"/>
+          <w:shd w:val="clear" w:color="auto" w:fill="FDFDFC"/>
+        </w:rPr>
+        <w:t>vercel</w:t>
+      </w:r>
+      <w:proofErr w:type="spellEnd"/>
     </w:p>
     <w:sectPr>
       <w:pgSz w:w="11906" w:h="16838"/>
@@ -5884,6 +6483,119 @@
     </w:lvl>
   </w:abstractNum>
   <w:abstractNum w:abstractNumId="8" w15:restartNumberingAfterBreak="0">
+    <w:nsid w:val="1AEE502B"/>
+    <w:multiLevelType w:val="hybridMultilevel"/>
+    <w:tmpl w:val="9F96D9A6"/>
+    <w:lvl w:ilvl="0" w:tplc="04090001">
+      <w:start w:val="1"/>
+      <w:numFmt w:val="bullet"/>
+      <w:lvlText w:val=""/>
+      <w:lvlJc w:val="left"/>
+      <w:pPr>
+        <w:ind w:left="480" w:hanging="480"/>
+      </w:pPr>
+      <w:rPr>
+        <w:rFonts w:ascii="Wingdings" w:hAnsi="Wingdings" w:hint="default"/>
+      </w:rPr>
+    </w:lvl>
+    <w:lvl w:ilvl="1" w:tplc="04090003">
+      <w:start w:val="1"/>
+      <w:numFmt w:val="bullet"/>
+      <w:lvlText w:val=""/>
+      <w:lvlJc w:val="left"/>
+      <w:pPr>
+        <w:ind w:left="960" w:hanging="480"/>
+      </w:pPr>
+      <w:rPr>
+        <w:rFonts w:ascii="Wingdings" w:hAnsi="Wingdings" w:hint="default"/>
+      </w:rPr>
+    </w:lvl>
+    <w:lvl w:ilvl="2" w:tplc="04090005">
+      <w:start w:val="1"/>
+      <w:numFmt w:val="bullet"/>
+      <w:lvlText w:val=""/>
+      <w:lvlJc w:val="left"/>
+      <w:pPr>
+        <w:ind w:left="1440" w:hanging="480"/>
+      </w:pPr>
+      <w:rPr>
+        <w:rFonts w:ascii="Wingdings" w:hAnsi="Wingdings" w:hint="default"/>
+      </w:rPr>
+    </w:lvl>
+    <w:lvl w:ilvl="3" w:tplc="04090001">
+      <w:start w:val="1"/>
+      <w:numFmt w:val="bullet"/>
+      <w:lvlText w:val=""/>
+      <w:lvlJc w:val="left"/>
+      <w:pPr>
+        <w:ind w:left="1920" w:hanging="480"/>
+      </w:pPr>
+      <w:rPr>
+        <w:rFonts w:ascii="Wingdings" w:hAnsi="Wingdings" w:hint="default"/>
+      </w:rPr>
+    </w:lvl>
+    <w:lvl w:ilvl="4" w:tplc="04090003" w:tentative="1">
+      <w:start w:val="1"/>
+      <w:numFmt w:val="bullet"/>
+      <w:lvlText w:val=""/>
+      <w:lvlJc w:val="left"/>
+      <w:pPr>
+        <w:ind w:left="2400" w:hanging="480"/>
+      </w:pPr>
+      <w:rPr>
+        <w:rFonts w:ascii="Wingdings" w:hAnsi="Wingdings" w:hint="default"/>
+      </w:rPr>
+    </w:lvl>
+    <w:lvl w:ilvl="5" w:tplc="04090005" w:tentative="1">
+      <w:start w:val="1"/>
+      <w:numFmt w:val="bullet"/>
+      <w:lvlText w:val=""/>
+      <w:lvlJc w:val="left"/>
+      <w:pPr>
+        <w:ind w:left="2880" w:hanging="480"/>
+      </w:pPr>
+      <w:rPr>
+        <w:rFonts w:ascii="Wingdings" w:hAnsi="Wingdings" w:hint="default"/>
+      </w:rPr>
+    </w:lvl>
+    <w:lvl w:ilvl="6" w:tplc="04090001" w:tentative="1">
+      <w:start w:val="1"/>
+      <w:numFmt w:val="bullet"/>
+      <w:lvlText w:val=""/>
+      <w:lvlJc w:val="left"/>
+      <w:pPr>
+        <w:ind w:left="3360" w:hanging="480"/>
+      </w:pPr>
+      <w:rPr>
+        <w:rFonts w:ascii="Wingdings" w:hAnsi="Wingdings" w:hint="default"/>
+      </w:rPr>
+    </w:lvl>
+    <w:lvl w:ilvl="7" w:tplc="04090003" w:tentative="1">
+      <w:start w:val="1"/>
+      <w:numFmt w:val="bullet"/>
+      <w:lvlText w:val=""/>
+      <w:lvlJc w:val="left"/>
+      <w:pPr>
+        <w:ind w:left="3840" w:hanging="480"/>
+      </w:pPr>
+      <w:rPr>
+        <w:rFonts w:ascii="Wingdings" w:hAnsi="Wingdings" w:hint="default"/>
+      </w:rPr>
+    </w:lvl>
+    <w:lvl w:ilvl="8" w:tplc="04090005" w:tentative="1">
+      <w:start w:val="1"/>
+      <w:numFmt w:val="bullet"/>
+      <w:lvlText w:val=""/>
+      <w:lvlJc w:val="left"/>
+      <w:pPr>
+        <w:ind w:left="4320" w:hanging="480"/>
+      </w:pPr>
+      <w:rPr>
+        <w:rFonts w:ascii="Wingdings" w:hAnsi="Wingdings" w:hint="default"/>
+      </w:rPr>
+    </w:lvl>
+  </w:abstractNum>
+  <w:abstractNum w:abstractNumId="9" w15:restartNumberingAfterBreak="0">
     <w:nsid w:val="2D821E64"/>
     <w:multiLevelType w:val="multilevel"/>
     <w:tmpl w:val="2D821E64"/>
@@ -5996,7 +6708,7 @@
       </w:rPr>
     </w:lvl>
   </w:abstractNum>
-  <w:abstractNum w:abstractNumId="9" w15:restartNumberingAfterBreak="0">
+  <w:abstractNum w:abstractNumId="10" w15:restartNumberingAfterBreak="0">
     <w:nsid w:val="378FFA6E"/>
     <w:multiLevelType w:val="multilevel"/>
     <w:tmpl w:val="378FFA6E"/>
@@ -6136,7 +6848,7 @@
       </w:rPr>
     </w:lvl>
   </w:abstractNum>
-  <w:abstractNum w:abstractNumId="10" w15:restartNumberingAfterBreak="0">
+  <w:abstractNum w:abstractNumId="11" w15:restartNumberingAfterBreak="0">
     <w:nsid w:val="4FD600E5"/>
     <w:multiLevelType w:val="hybridMultilevel"/>
     <w:tmpl w:val="D98429C4"/>
@@ -6249,7 +6961,7 @@
       </w:rPr>
     </w:lvl>
   </w:abstractNum>
-  <w:abstractNum w:abstractNumId="11" w15:restartNumberingAfterBreak="0">
+  <w:abstractNum w:abstractNumId="12" w15:restartNumberingAfterBreak="0">
     <w:nsid w:val="63E17044"/>
     <w:multiLevelType w:val="multilevel"/>
     <w:tmpl w:val="3E0CACAE"/>
@@ -6398,7 +7110,7 @@
       </w:rPr>
     </w:lvl>
   </w:abstractNum>
-  <w:abstractNum w:abstractNumId="12" w15:restartNumberingAfterBreak="0">
+  <w:abstractNum w:abstractNumId="13" w15:restartNumberingAfterBreak="0">
     <w:nsid w:val="6E2F5D5C"/>
     <w:multiLevelType w:val="hybridMultilevel"/>
     <w:tmpl w:val="B47ED062"/>
@@ -6511,7 +7223,7 @@
       </w:rPr>
     </w:lvl>
   </w:abstractNum>
-  <w:abstractNum w:abstractNumId="13" w15:restartNumberingAfterBreak="0">
+  <w:abstractNum w:abstractNumId="14" w15:restartNumberingAfterBreak="0">
     <w:nsid w:val="7FFBCA86"/>
     <w:multiLevelType w:val="singleLevel"/>
     <w:tmpl w:val="7FFBCA86"/>
@@ -6544,13 +7256,13 @@
     <w:abstractNumId w:val="1"/>
   </w:num>
   <w:num w:numId="5" w16cid:durableId="1383938641">
-    <w:abstractNumId w:val="8"/>
+    <w:abstractNumId w:val="9"/>
   </w:num>
   <w:num w:numId="6" w16cid:durableId="399136289">
-    <w:abstractNumId w:val="9"/>
+    <w:abstractNumId w:val="10"/>
   </w:num>
   <w:num w:numId="7" w16cid:durableId="997878970">
-    <w:abstractNumId w:val="13"/>
+    <w:abstractNumId w:val="14"/>
   </w:num>
   <w:num w:numId="8" w16cid:durableId="1120684404">
     <w:abstractNumId w:val="2"/>
@@ -6565,13 +7277,16 @@
     <w:abstractNumId w:val="5"/>
   </w:num>
   <w:num w:numId="12" w16cid:durableId="2053841961">
+    <w:abstractNumId w:val="13"/>
+  </w:num>
+  <w:num w:numId="13" w16cid:durableId="94177580">
     <w:abstractNumId w:val="12"/>
   </w:num>
-  <w:num w:numId="13" w16cid:durableId="94177580">
+  <w:num w:numId="14" w16cid:durableId="925188702">
     <w:abstractNumId w:val="11"/>
   </w:num>
-  <w:num w:numId="14" w16cid:durableId="925188702">
-    <w:abstractNumId w:val="10"/>
+  <w:num w:numId="15" w16cid:durableId="47150535">
+    <w:abstractNumId w:val="8"/>
   </w:num>
 </w:numbering>
 </file>

</xml_diff>

<commit_message>
feat: integrate CloudFlare R2 for PDF upload and download
</commit_message>
<xml_diff>
--- a/日記.docx
+++ b/日記.docx
@@ -1,6 +1,6 @@
 
 <file path=word/document.xml><?xml version="1.0" encoding="utf-8"?>
-<w:document xmlns:wpc="http://schemas.microsoft.com/office/word/2010/wordprocessingCanvas" xmlns:cx="http://schemas.microsoft.com/office/drawing/2014/chartex" xmlns:cx1="http://schemas.microsoft.com/office/drawing/2015/9/8/chartex" xmlns:cx2="http://schemas.microsoft.com/office/drawing/2015/10/21/chartex" xmlns:cx3="http://schemas.microsoft.com/office/drawing/2016/5/9/chartex" xmlns:cx4="http://schemas.microsoft.com/office/drawing/2016/5/10/chartex" xmlns:cx5="http://schemas.microsoft.com/office/drawing/2016/5/11/chartex" xmlns:cx6="http://schemas.microsoft.com/office/drawing/2016/5/12/chartex" xmlns:cx7="http://schemas.microsoft.com/office/drawing/2016/5/13/chartex" xmlns:cx8="http://schemas.microsoft.com/office/drawing/2016/5/14/chartex" xmlns:mc="http://schemas.openxmlformats.org/markup-compatibility/2006" xmlns:m="http://schemas.openxmlformats.org/officeDocument/2006/math" xmlns:aink="http://schemas.microsoft.com/office/drawing/2016/ink" xmlns:am3d="http://schemas.microsoft.com/office/drawing/2017/model3d" xmlns:oel="http://schemas.microsoft.com/office/2019/extlst" xmlns:r="http://schemas.openxmlformats.org/officeDocument/2006/relationships" xmlns:wp14="http://schemas.microsoft.com/office/word/2010/wordprocessingDrawing" xmlns:wp="http://schemas.openxmlformats.org/drawingml/2006/wordprocessingDrawing" xmlns:wpg="http://schemas.microsoft.com/office/word/2010/wordprocessingGroup" xmlns:wpi="http://schemas.microsoft.com/office/word/2010/wordprocessingInk" xmlns:wps="http://schemas.microsoft.com/office/word/2010/wordprocessingShape" xmlns:o="urn:schemas-microsoft-com:office:office" xmlns:v="urn:schemas-microsoft-com:vml" xmlns:w10="urn:schemas-microsoft-com:office:word" xmlns:w="http://schemas.openxmlformats.org/wordprocessingml/2006/main" xmlns:w14="http://schemas.microsoft.com/office/word/2010/wordml" xmlns:w15="http://schemas.microsoft.com/office/word/2012/wordml" xmlns:w16cei="http://schemas.microsoft.com/office/word/2026/wordml/cei" xmlns:w16cex="http://schemas.microsoft.com/office/word/2018/wordml/cex" xmlns:w16cid="http://schemas.microsoft.com/office/word/2016/wordml/cid" xmlns:w16="http://schemas.microsoft.com/office/word/2018/wordml" xmlns:w16sdtdh="http://schemas.microsoft.com/office/word/2020/wordml/sdtdatahash" xmlns:w16sdtfl="http://schemas.microsoft.com/office/word/2024/wordml/sdtformatlock" xmlns:w16se="http://schemas.microsoft.com/office/word/2015/wordml/symex" xmlns:w16du="http://schemas.microsoft.com/office/word/2023/wordml/word16du" xmlns:wne="http://schemas.microsoft.com/office/word/2006/wordml" mc:Ignorable="w14 w15 w16se w16cid w16 w16cex w16sdtdh w16sdtfl w16du wp14">
+<w:document xmlns:wpc="http://schemas.microsoft.com/office/word/2010/wordprocessingCanvas" xmlns:cx="http://schemas.microsoft.com/office/drawing/2014/chartex" xmlns:cx1="http://schemas.microsoft.com/office/drawing/2015/9/8/chartex" xmlns:cx2="http://schemas.microsoft.com/office/drawing/2015/10/21/chartex" xmlns:cx3="http://schemas.microsoft.com/office/drawing/2016/5/9/chartex" xmlns:cx4="http://schemas.microsoft.com/office/drawing/2016/5/10/chartex" xmlns:cx5="http://schemas.microsoft.com/office/drawing/2016/5/11/chartex" xmlns:cx6="http://schemas.microsoft.com/office/drawing/2016/5/12/chartex" xmlns:cx7="http://schemas.microsoft.com/office/drawing/2016/5/13/chartex" xmlns:cx8="http://schemas.microsoft.com/office/drawing/2016/5/14/chartex" xmlns:mc="http://schemas.openxmlformats.org/markup-compatibility/2006" xmlns:m="http://schemas.openxmlformats.org/officeDocument/2006/math" xmlns:aink="http://schemas.microsoft.com/office/drawing/2016/ink" xmlns:am3d="http://schemas.microsoft.com/office/drawing/2017/model3d" xmlns:oel="http://schemas.microsoft.com/office/2019/extlst" xmlns:r="http://schemas.openxmlformats.org/officeDocument/2006/relationships" xmlns:wp14="http://schemas.microsoft.com/office/word/2010/wordprocessingDrawing" xmlns:wp="http://schemas.openxmlformats.org/drawingml/2006/wordprocessingDrawing" xmlns:wpg="http://schemas.microsoft.com/office/word/2010/wordprocessingGroup" xmlns:wpi="http://schemas.microsoft.com/office/word/2010/wordprocessingInk" xmlns:wps="http://schemas.microsoft.com/office/word/2010/wordprocessingShape" xmlns:o="urn:schemas-microsoft-com:office:office" xmlns:v="urn:schemas-microsoft-com:vml" xmlns:w10="urn:schemas-microsoft-com:office:word" xmlns:w="http://schemas.openxmlformats.org/wordprocessingml/2006/main" xmlns:w14="http://schemas.microsoft.com/office/word/2010/wordml" xmlns:w15="http://schemas.microsoft.com/office/word/2012/wordml" xmlns:w16cex="http://schemas.microsoft.com/office/word/2018/wordml/cex" xmlns:w16cid="http://schemas.microsoft.com/office/word/2016/wordml/cid" xmlns:w16="http://schemas.microsoft.com/office/word/2018/wordml" xmlns:w16sdtdh="http://schemas.microsoft.com/office/word/2020/wordml/sdtdatahash" xmlns:w16sdtfl="http://schemas.microsoft.com/office/word/2024/wordml/sdtformatlock" xmlns:w16se="http://schemas.microsoft.com/office/word/2015/wordml/symex" xmlns:w16du="http://schemas.microsoft.com/office/word/2023/wordml/word16du" xmlns:wne="http://schemas.microsoft.com/office/word/2006/wordml" mc:Ignorable="w14 w15 w16se w16cid w16 w16cex w16sdtdh w16sdtfl w16du wp14">
   <w:body>
     <w:p>
       <w:r>
@@ -4945,7 +4945,7 @@
           <w:numId w:val="15"/>
         </w:numPr>
         <w:rPr>
-          <w:rFonts w:eastAsia="新細明體" w:hint="eastAsia"/>
+          <w:rFonts w:eastAsia="新細明體"/>
         </w:rPr>
       </w:pPr>
       <w:r>
@@ -5446,6 +5446,260 @@
         <w:t>vercel</w:t>
       </w:r>
       <w:proofErr w:type="spellEnd"/>
+    </w:p>
+    <w:p>
+      <w:pPr>
+        <w:rPr>
+          <w:rFonts w:eastAsia="新細明體"/>
+        </w:rPr>
+      </w:pPr>
+      <w:r>
+        <w:rPr>
+          <w:rFonts w:eastAsia="新細明體"/>
+        </w:rPr>
+        <w:t>7/14/2026</w:t>
+      </w:r>
+    </w:p>
+    <w:p>
+      <w:pPr>
+        <w:pStyle w:val="a9"/>
+        <w:numPr>
+          <w:ilvl w:val="0"/>
+          <w:numId w:val="16"/>
+        </w:numPr>
+        <w:rPr>
+          <w:rFonts w:eastAsia="新細明體"/>
+        </w:rPr>
+      </w:pPr>
+      <w:r>
+        <w:rPr>
+          <w:rFonts w:eastAsia="新細明體" w:hint="eastAsia"/>
+        </w:rPr>
+        <w:t>思考要用</w:t>
+      </w:r>
+      <w:r>
+        <w:rPr>
+          <w:rFonts w:eastAsia="新細明體" w:hint="eastAsia"/>
+        </w:rPr>
+        <w:t xml:space="preserve"> </w:t>
+      </w:r>
+      <w:r>
+        <w:rPr>
+          <w:rFonts w:eastAsia="新細明體"/>
+        </w:rPr>
+        <w:t xml:space="preserve">S3 vs. </w:t>
+      </w:r>
+      <w:proofErr w:type="spellStart"/>
+      <w:r>
+        <w:rPr>
+          <w:rFonts w:eastAsia="新細明體"/>
+        </w:rPr>
+        <w:t>Vercel</w:t>
+      </w:r>
+      <w:proofErr w:type="spellEnd"/>
+      <w:r>
+        <w:rPr>
+          <w:rFonts w:eastAsia="新細明體"/>
+        </w:rPr>
+        <w:t xml:space="preserve"> Blob vs. </w:t>
+      </w:r>
+      <w:r>
+        <w:rPr>
+          <w:rFonts w:eastAsia="新細明體"/>
+        </w:rPr>
+        <w:t>Cloudflare R2</w:t>
+      </w:r>
+    </w:p>
+    <w:p>
+      <w:pPr>
+        <w:pStyle w:val="a9"/>
+        <w:numPr>
+          <w:ilvl w:val="1"/>
+          <w:numId w:val="16"/>
+        </w:numPr>
+        <w:rPr>
+          <w:rFonts w:eastAsia="新細明體"/>
+        </w:rPr>
+      </w:pPr>
+      <w:proofErr w:type="spellStart"/>
+      <w:r>
+        <w:rPr>
+          <w:rFonts w:eastAsia="新細明體"/>
+        </w:rPr>
+        <w:t>Vercel</w:t>
+      </w:r>
+      <w:proofErr w:type="spellEnd"/>
+      <w:r>
+        <w:rPr>
+          <w:rFonts w:eastAsia="新細明體"/>
+        </w:rPr>
+        <w:t xml:space="preserve"> Blob </w:t>
+      </w:r>
+      <w:r>
+        <w:rPr>
+          <w:rFonts w:eastAsia="新細明體" w:hint="eastAsia"/>
+        </w:rPr>
+        <w:t>就是方便，跟</w:t>
+      </w:r>
+      <w:r>
+        <w:rPr>
+          <w:rFonts w:eastAsia="新細明體" w:hint="eastAsia"/>
+        </w:rPr>
+        <w:t xml:space="preserve"> </w:t>
+      </w:r>
+      <w:r>
+        <w:rPr>
+          <w:rFonts w:eastAsia="新細明體"/>
+        </w:rPr>
+        <w:t xml:space="preserve">Next.js </w:t>
+      </w:r>
+      <w:r>
+        <w:rPr>
+          <w:rFonts w:eastAsia="新細明體" w:hint="eastAsia"/>
+        </w:rPr>
+        <w:t>整合性高，但是他不安全，因為他是用很長的網址去儲存各種物件</w:t>
+      </w:r>
+    </w:p>
+    <w:p>
+      <w:pPr>
+        <w:pStyle w:val="a9"/>
+        <w:numPr>
+          <w:ilvl w:val="1"/>
+          <w:numId w:val="16"/>
+        </w:numPr>
+        <w:rPr>
+          <w:rFonts w:eastAsia="新細明體"/>
+        </w:rPr>
+      </w:pPr>
+      <w:r>
+        <w:rPr>
+          <w:rFonts w:eastAsia="新細明體" w:hint="eastAsia"/>
+        </w:rPr>
+        <w:t>最後決定用</w:t>
+      </w:r>
+      <w:r>
+        <w:rPr>
+          <w:rFonts w:eastAsia="新細明體" w:hint="eastAsia"/>
+        </w:rPr>
+        <w:t xml:space="preserve"> </w:t>
+      </w:r>
+      <w:r>
+        <w:rPr>
+          <w:rFonts w:eastAsia="新細明體"/>
+        </w:rPr>
+        <w:t>R2</w:t>
+      </w:r>
+      <w:r>
+        <w:rPr>
+          <w:rFonts w:eastAsia="新細明體" w:hint="eastAsia"/>
+        </w:rPr>
+        <w:t>，因為他</w:t>
+      </w:r>
+      <w:r>
+        <w:rPr>
+          <w:rFonts w:eastAsia="新細明體"/>
+        </w:rPr>
+        <w:t xml:space="preserve"> </w:t>
+      </w:r>
+      <w:r>
+        <w:rPr>
+          <w:rFonts w:eastAsia="新細明體"/>
+        </w:rPr>
+        <w:t>Egress</w:t>
+      </w:r>
+      <w:r>
+        <w:rPr>
+          <w:rFonts w:eastAsia="新細明體"/>
+        </w:rPr>
+        <w:t xml:space="preserve"> </w:t>
+      </w:r>
+      <w:r>
+        <w:rPr>
+          <w:rFonts w:eastAsia="新細明體" w:hint="eastAsia"/>
+        </w:rPr>
+        <w:t>不用錢，我們的情境中很常需要打開已經上傳的文件，因此</w:t>
+      </w:r>
+      <w:r>
+        <w:rPr>
+          <w:rFonts w:eastAsia="新細明體" w:hint="eastAsia"/>
+        </w:rPr>
+        <w:t xml:space="preserve"> </w:t>
+      </w:r>
+      <w:r>
+        <w:t>Egress</w:t>
+      </w:r>
+      <w:r>
+        <w:rPr>
+          <w:rFonts w:hint="eastAsia"/>
+        </w:rPr>
+        <w:t xml:space="preserve"> </w:t>
+      </w:r>
+      <w:r>
+        <w:rPr>
+          <w:rFonts w:hint="eastAsia"/>
+        </w:rPr>
+        <w:t>不用錢的話會省很多</w:t>
+      </w:r>
+    </w:p>
+    <w:p>
+      <w:pPr>
+        <w:pStyle w:val="a9"/>
+        <w:numPr>
+          <w:ilvl w:val="2"/>
+          <w:numId w:val="16"/>
+        </w:numPr>
+        <w:rPr>
+          <w:rFonts w:eastAsia="新細明體"/>
+        </w:rPr>
+      </w:pPr>
+      <w:r>
+        <w:t>Ingress</w:t>
+      </w:r>
+      <w:r>
+        <w:rPr>
+          <w:rFonts w:hint="eastAsia"/>
+        </w:rPr>
+        <w:t>：上傳文件，</w:t>
+      </w:r>
+      <w:r>
+        <w:t>資料進入雲端</w:t>
+      </w:r>
+    </w:p>
+    <w:p>
+      <w:pPr>
+        <w:pStyle w:val="a9"/>
+        <w:numPr>
+          <w:ilvl w:val="2"/>
+          <w:numId w:val="16"/>
+        </w:numPr>
+        <w:rPr>
+          <w:rFonts w:eastAsia="新細明體" w:hint="eastAsia"/>
+        </w:rPr>
+      </w:pPr>
+      <w:r>
+        <w:t>Egress</w:t>
+      </w:r>
+      <w:r>
+        <w:rPr>
+          <w:rFonts w:hint="eastAsia"/>
+        </w:rPr>
+        <w:t>：下載文件，資料離開雲端</w:t>
+      </w:r>
+      <w:r>
+        <w:rPr>
+          <w:rFonts w:hint="eastAsia"/>
+        </w:rPr>
+        <w:t xml:space="preserve"> </w:t>
+      </w:r>
+      <w:r>
+        <w:t xml:space="preserve">e.g. </w:t>
+      </w:r>
+      <w:r>
+        <w:t>使用者下載或預覽</w:t>
+      </w:r>
+      <w:r>
+        <w:t xml:space="preserve"> PDF</w:t>
+      </w:r>
     </w:p>
     <w:sectPr>
       <w:pgSz w:w="11906" w:h="16838"/>
@@ -5458,7 +5712,7 @@
 </file>
 
 <file path=word/endnotes.xml><?xml version="1.0" encoding="utf-8"?>
-<w:endnotes xmlns:wpc="http://schemas.microsoft.com/office/word/2010/wordprocessingCanvas" xmlns:cx="http://schemas.microsoft.com/office/drawing/2014/chartex" xmlns:cx1="http://schemas.microsoft.com/office/drawing/2015/9/8/chartex" xmlns:cx2="http://schemas.microsoft.com/office/drawing/2015/10/21/chartex" xmlns:cx3="http://schemas.microsoft.com/office/drawing/2016/5/9/chartex" xmlns:cx4="http://schemas.microsoft.com/office/drawing/2016/5/10/chartex" xmlns:cx5="http://schemas.microsoft.com/office/drawing/2016/5/11/chartex" xmlns:cx6="http://schemas.microsoft.com/office/drawing/2016/5/12/chartex" xmlns:cx7="http://schemas.microsoft.com/office/drawing/2016/5/13/chartex" xmlns:cx8="http://schemas.microsoft.com/office/drawing/2016/5/14/chartex" xmlns:mc="http://schemas.openxmlformats.org/markup-compatibility/2006" xmlns:m="http://schemas.openxmlformats.org/officeDocument/2006/math" xmlns:aink="http://schemas.microsoft.com/office/drawing/2016/ink" xmlns:am3d="http://schemas.microsoft.com/office/drawing/2017/model3d" xmlns:oel="http://schemas.microsoft.com/office/2019/extlst" xmlns:r="http://schemas.openxmlformats.org/officeDocument/2006/relationships" xmlns:wp14="http://schemas.microsoft.com/office/word/2010/wordprocessingDrawing" xmlns:wp="http://schemas.openxmlformats.org/drawingml/2006/wordprocessingDrawing" xmlns:wpg="http://schemas.microsoft.com/office/word/2010/wordprocessingGroup" xmlns:wpi="http://schemas.microsoft.com/office/word/2010/wordprocessingInk" xmlns:wps="http://schemas.microsoft.com/office/word/2010/wordprocessingShape" xmlns:o="urn:schemas-microsoft-com:office:office" xmlns:v="urn:schemas-microsoft-com:vml" xmlns:w10="urn:schemas-microsoft-com:office:word" xmlns:w="http://schemas.openxmlformats.org/wordprocessingml/2006/main" xmlns:w14="http://schemas.microsoft.com/office/word/2010/wordml" xmlns:w15="http://schemas.microsoft.com/office/word/2012/wordml" xmlns:w16cei="http://schemas.microsoft.com/office/word/2026/wordml/cei" xmlns:w16cex="http://schemas.microsoft.com/office/word/2018/wordml/cex" xmlns:w16cid="http://schemas.microsoft.com/office/word/2016/wordml/cid" xmlns:w16="http://schemas.microsoft.com/office/word/2018/wordml" xmlns:w16sdtdh="http://schemas.microsoft.com/office/word/2020/wordml/sdtdatahash" xmlns:w16sdtfl="http://schemas.microsoft.com/office/word/2024/wordml/sdtformatlock" xmlns:w16se="http://schemas.microsoft.com/office/word/2015/wordml/symex" xmlns:w16du="http://schemas.microsoft.com/office/word/2023/wordml/word16du" xmlns:wne="http://schemas.microsoft.com/office/word/2006/wordml" mc:Ignorable="w14 w15 w16se w16cid w16 w16cex w16sdtdh w16sdtfl w16du wp14">
+<w:endnotes xmlns:wpc="http://schemas.microsoft.com/office/word/2010/wordprocessingCanvas" xmlns:cx="http://schemas.microsoft.com/office/drawing/2014/chartex" xmlns:cx1="http://schemas.microsoft.com/office/drawing/2015/9/8/chartex" xmlns:cx2="http://schemas.microsoft.com/office/drawing/2015/10/21/chartex" xmlns:cx3="http://schemas.microsoft.com/office/drawing/2016/5/9/chartex" xmlns:cx4="http://schemas.microsoft.com/office/drawing/2016/5/10/chartex" xmlns:cx5="http://schemas.microsoft.com/office/drawing/2016/5/11/chartex" xmlns:cx6="http://schemas.microsoft.com/office/drawing/2016/5/12/chartex" xmlns:cx7="http://schemas.microsoft.com/office/drawing/2016/5/13/chartex" xmlns:cx8="http://schemas.microsoft.com/office/drawing/2016/5/14/chartex" xmlns:mc="http://schemas.openxmlformats.org/markup-compatibility/2006" xmlns:m="http://schemas.openxmlformats.org/officeDocument/2006/math" xmlns:aink="http://schemas.microsoft.com/office/drawing/2016/ink" xmlns:am3d="http://schemas.microsoft.com/office/drawing/2017/model3d" xmlns:oel="http://schemas.microsoft.com/office/2019/extlst" xmlns:r="http://schemas.openxmlformats.org/officeDocument/2006/relationships" xmlns:wp14="http://schemas.microsoft.com/office/word/2010/wordprocessingDrawing" xmlns:wp="http://schemas.openxmlformats.org/drawingml/2006/wordprocessingDrawing" xmlns:wpg="http://schemas.microsoft.com/office/word/2010/wordprocessingGroup" xmlns:wpi="http://schemas.microsoft.com/office/word/2010/wordprocessingInk" xmlns:wps="http://schemas.microsoft.com/office/word/2010/wordprocessingShape" xmlns:o="urn:schemas-microsoft-com:office:office" xmlns:v="urn:schemas-microsoft-com:vml" xmlns:w10="urn:schemas-microsoft-com:office:word" xmlns:w="http://schemas.openxmlformats.org/wordprocessingml/2006/main" xmlns:w14="http://schemas.microsoft.com/office/word/2010/wordml" xmlns:w15="http://schemas.microsoft.com/office/word/2012/wordml" xmlns:w16cex="http://schemas.microsoft.com/office/word/2018/wordml/cex" xmlns:w16cid="http://schemas.microsoft.com/office/word/2016/wordml/cid" xmlns:w16="http://schemas.microsoft.com/office/word/2018/wordml" xmlns:w16sdtdh="http://schemas.microsoft.com/office/word/2020/wordml/sdtdatahash" xmlns:w16sdtfl="http://schemas.microsoft.com/office/word/2024/wordml/sdtformatlock" xmlns:w16se="http://schemas.microsoft.com/office/word/2015/wordml/symex" xmlns:w16du="http://schemas.microsoft.com/office/word/2023/wordml/word16du" xmlns:wne="http://schemas.microsoft.com/office/word/2006/wordml" mc:Ignorable="w14 w15 w16se w16cid w16 w16cex w16sdtdh w16sdtfl w16du wp14">
   <w:endnote w:type="separator" w:id="-1">
     <w:p>
       <w:pPr>
@@ -5483,7 +5737,7 @@
 </file>
 
 <file path=word/footnotes.xml><?xml version="1.0" encoding="utf-8"?>
-<w:footnotes xmlns:wpc="http://schemas.microsoft.com/office/word/2010/wordprocessingCanvas" xmlns:cx="http://schemas.microsoft.com/office/drawing/2014/chartex" xmlns:cx1="http://schemas.microsoft.com/office/drawing/2015/9/8/chartex" xmlns:cx2="http://schemas.microsoft.com/office/drawing/2015/10/21/chartex" xmlns:cx3="http://schemas.microsoft.com/office/drawing/2016/5/9/chartex" xmlns:cx4="http://schemas.microsoft.com/office/drawing/2016/5/10/chartex" xmlns:cx5="http://schemas.microsoft.com/office/drawing/2016/5/11/chartex" xmlns:cx6="http://schemas.microsoft.com/office/drawing/2016/5/12/chartex" xmlns:cx7="http://schemas.microsoft.com/office/drawing/2016/5/13/chartex" xmlns:cx8="http://schemas.microsoft.com/office/drawing/2016/5/14/chartex" xmlns:mc="http://schemas.openxmlformats.org/markup-compatibility/2006" xmlns:m="http://schemas.openxmlformats.org/officeDocument/2006/math" xmlns:aink="http://schemas.microsoft.com/office/drawing/2016/ink" xmlns:am3d="http://schemas.microsoft.com/office/drawing/2017/model3d" xmlns:oel="http://schemas.microsoft.com/office/2019/extlst" xmlns:r="http://schemas.openxmlformats.org/officeDocument/2006/relationships" xmlns:wp14="http://schemas.microsoft.com/office/word/2010/wordprocessingDrawing" xmlns:wp="http://schemas.openxmlformats.org/drawingml/2006/wordprocessingDrawing" xmlns:wpg="http://schemas.microsoft.com/office/word/2010/wordprocessingGroup" xmlns:wpi="http://schemas.microsoft.com/office/word/2010/wordprocessingInk" xmlns:wps="http://schemas.microsoft.com/office/word/2010/wordprocessingShape" xmlns:o="urn:schemas-microsoft-com:office:office" xmlns:v="urn:schemas-microsoft-com:vml" xmlns:w10="urn:schemas-microsoft-com:office:word" xmlns:w="http://schemas.openxmlformats.org/wordprocessingml/2006/main" xmlns:w14="http://schemas.microsoft.com/office/word/2010/wordml" xmlns:w15="http://schemas.microsoft.com/office/word/2012/wordml" xmlns:w16cei="http://schemas.microsoft.com/office/word/2026/wordml/cei" xmlns:w16cex="http://schemas.microsoft.com/office/word/2018/wordml/cex" xmlns:w16cid="http://schemas.microsoft.com/office/word/2016/wordml/cid" xmlns:w16="http://schemas.microsoft.com/office/word/2018/wordml" xmlns:w16sdtdh="http://schemas.microsoft.com/office/word/2020/wordml/sdtdatahash" xmlns:w16sdtfl="http://schemas.microsoft.com/office/word/2024/wordml/sdtformatlock" xmlns:w16se="http://schemas.microsoft.com/office/word/2015/wordml/symex" xmlns:w16du="http://schemas.microsoft.com/office/word/2023/wordml/word16du" xmlns:wne="http://schemas.microsoft.com/office/word/2006/wordml" mc:Ignorable="w14 w15 w16se w16cid w16 w16cex w16sdtdh w16sdtfl w16du wp14">
+<w:footnotes xmlns:wpc="http://schemas.microsoft.com/office/word/2010/wordprocessingCanvas" xmlns:cx="http://schemas.microsoft.com/office/drawing/2014/chartex" xmlns:cx1="http://schemas.microsoft.com/office/drawing/2015/9/8/chartex" xmlns:cx2="http://schemas.microsoft.com/office/drawing/2015/10/21/chartex" xmlns:cx3="http://schemas.microsoft.com/office/drawing/2016/5/9/chartex" xmlns:cx4="http://schemas.microsoft.com/office/drawing/2016/5/10/chartex" xmlns:cx5="http://schemas.microsoft.com/office/drawing/2016/5/11/chartex" xmlns:cx6="http://schemas.microsoft.com/office/drawing/2016/5/12/chartex" xmlns:cx7="http://schemas.microsoft.com/office/drawing/2016/5/13/chartex" xmlns:cx8="http://schemas.microsoft.com/office/drawing/2016/5/14/chartex" xmlns:mc="http://schemas.openxmlformats.org/markup-compatibility/2006" xmlns:m="http://schemas.openxmlformats.org/officeDocument/2006/math" xmlns:aink="http://schemas.microsoft.com/office/drawing/2016/ink" xmlns:am3d="http://schemas.microsoft.com/office/drawing/2017/model3d" xmlns:oel="http://schemas.microsoft.com/office/2019/extlst" xmlns:r="http://schemas.openxmlformats.org/officeDocument/2006/relationships" xmlns:wp14="http://schemas.microsoft.com/office/word/2010/wordprocessingDrawing" xmlns:wp="http://schemas.openxmlformats.org/drawingml/2006/wordprocessingDrawing" xmlns:wpg="http://schemas.microsoft.com/office/word/2010/wordprocessingGroup" xmlns:wpi="http://schemas.microsoft.com/office/word/2010/wordprocessingInk" xmlns:wps="http://schemas.microsoft.com/office/word/2010/wordprocessingShape" xmlns:o="urn:schemas-microsoft-com:office:office" xmlns:v="urn:schemas-microsoft-com:vml" xmlns:w10="urn:schemas-microsoft-com:office:word" xmlns:w="http://schemas.openxmlformats.org/wordprocessingml/2006/main" xmlns:w14="http://schemas.microsoft.com/office/word/2010/wordml" xmlns:w15="http://schemas.microsoft.com/office/word/2012/wordml" xmlns:w16cex="http://schemas.microsoft.com/office/word/2018/wordml/cex" xmlns:w16cid="http://schemas.microsoft.com/office/word/2016/wordml/cid" xmlns:w16="http://schemas.microsoft.com/office/word/2018/wordml" xmlns:w16sdtdh="http://schemas.microsoft.com/office/word/2020/wordml/sdtdatahash" xmlns:w16sdtfl="http://schemas.microsoft.com/office/word/2024/wordml/sdtformatlock" xmlns:w16se="http://schemas.microsoft.com/office/word/2015/wordml/symex" xmlns:w16du="http://schemas.microsoft.com/office/word/2023/wordml/word16du" xmlns:wne="http://schemas.microsoft.com/office/word/2006/wordml" mc:Ignorable="w14 w15 w16se w16cid w16 w16cex w16sdtdh w16sdtfl w16du wp14">
   <w:footnote w:type="separator" w:id="-1">
     <w:p>
       <w:pPr>
@@ -5508,7 +5762,7 @@
 </file>
 
 <file path=word/numbering.xml><?xml version="1.0" encoding="utf-8"?>
-<w:numbering xmlns:wpc="http://schemas.microsoft.com/office/word/2010/wordprocessingCanvas" xmlns:cx="http://schemas.microsoft.com/office/drawing/2014/chartex" xmlns:cx1="http://schemas.microsoft.com/office/drawing/2015/9/8/chartex" xmlns:cx2="http://schemas.microsoft.com/office/drawing/2015/10/21/chartex" xmlns:cx3="http://schemas.microsoft.com/office/drawing/2016/5/9/chartex" xmlns:cx4="http://schemas.microsoft.com/office/drawing/2016/5/10/chartex" xmlns:cx5="http://schemas.microsoft.com/office/drawing/2016/5/11/chartex" xmlns:cx6="http://schemas.microsoft.com/office/drawing/2016/5/12/chartex" xmlns:cx7="http://schemas.microsoft.com/office/drawing/2016/5/13/chartex" xmlns:cx8="http://schemas.microsoft.com/office/drawing/2016/5/14/chartex" xmlns:mc="http://schemas.openxmlformats.org/markup-compatibility/2006" xmlns:m="http://schemas.openxmlformats.org/officeDocument/2006/math" xmlns:aink="http://schemas.microsoft.com/office/drawing/2016/ink" xmlns:am3d="http://schemas.microsoft.com/office/drawing/2017/model3d" xmlns:oel="http://schemas.microsoft.com/office/2019/extlst" xmlns:r="http://schemas.openxmlformats.org/officeDocument/2006/relationships" xmlns:wp14="http://schemas.microsoft.com/office/word/2010/wordprocessingDrawing" xmlns:wp="http://schemas.openxmlformats.org/drawingml/2006/wordprocessingDrawing" xmlns:wpg="http://schemas.microsoft.com/office/word/2010/wordprocessingGroup" xmlns:wpi="http://schemas.microsoft.com/office/word/2010/wordprocessingInk" xmlns:wps="http://schemas.microsoft.com/office/word/2010/wordprocessingShape" xmlns:o="urn:schemas-microsoft-com:office:office" xmlns:v="urn:schemas-microsoft-com:vml" xmlns:w10="urn:schemas-microsoft-com:office:word" xmlns:w="http://schemas.openxmlformats.org/wordprocessingml/2006/main" xmlns:w14="http://schemas.microsoft.com/office/word/2010/wordml" xmlns:w15="http://schemas.microsoft.com/office/word/2012/wordml" xmlns:w16cei="http://schemas.microsoft.com/office/word/2026/wordml/cei" xmlns:w16cex="http://schemas.microsoft.com/office/word/2018/wordml/cex" xmlns:w16cid="http://schemas.microsoft.com/office/word/2016/wordml/cid" xmlns:w16="http://schemas.microsoft.com/office/word/2018/wordml" xmlns:w16sdtdh="http://schemas.microsoft.com/office/word/2020/wordml/sdtdatahash" xmlns:w16sdtfl="http://schemas.microsoft.com/office/word/2024/wordml/sdtformatlock" xmlns:w16se="http://schemas.microsoft.com/office/word/2015/wordml/symex" xmlns:w16du="http://schemas.microsoft.com/office/word/2023/wordml/word16du" xmlns:wne="http://schemas.microsoft.com/office/word/2006/wordml" mc:Ignorable="w14 w15 w16se w16cid w16 w16cex w16sdtdh w16sdtfl w16du wp14">
+<w:numbering xmlns:wpc="http://schemas.microsoft.com/office/word/2010/wordprocessingCanvas" xmlns:cx="http://schemas.microsoft.com/office/drawing/2014/chartex" xmlns:cx1="http://schemas.microsoft.com/office/drawing/2015/9/8/chartex" xmlns:cx2="http://schemas.microsoft.com/office/drawing/2015/10/21/chartex" xmlns:cx3="http://schemas.microsoft.com/office/drawing/2016/5/9/chartex" xmlns:cx4="http://schemas.microsoft.com/office/drawing/2016/5/10/chartex" xmlns:cx5="http://schemas.microsoft.com/office/drawing/2016/5/11/chartex" xmlns:cx6="http://schemas.microsoft.com/office/drawing/2016/5/12/chartex" xmlns:cx7="http://schemas.microsoft.com/office/drawing/2016/5/13/chartex" xmlns:cx8="http://schemas.microsoft.com/office/drawing/2016/5/14/chartex" xmlns:mc="http://schemas.openxmlformats.org/markup-compatibility/2006" xmlns:m="http://schemas.openxmlformats.org/officeDocument/2006/math" xmlns:aink="http://schemas.microsoft.com/office/drawing/2016/ink" xmlns:am3d="http://schemas.microsoft.com/office/drawing/2017/model3d" xmlns:oel="http://schemas.microsoft.com/office/2019/extlst" xmlns:r="http://schemas.openxmlformats.org/officeDocument/2006/relationships" xmlns:wp14="http://schemas.microsoft.com/office/word/2010/wordprocessingDrawing" xmlns:wp="http://schemas.openxmlformats.org/drawingml/2006/wordprocessingDrawing" xmlns:wpg="http://schemas.microsoft.com/office/word/2010/wordprocessingGroup" xmlns:wpi="http://schemas.microsoft.com/office/word/2010/wordprocessingInk" xmlns:wps="http://schemas.microsoft.com/office/word/2010/wordprocessingShape" xmlns:o="urn:schemas-microsoft-com:office:office" xmlns:v="urn:schemas-microsoft-com:vml" xmlns:w10="urn:schemas-microsoft-com:office:word" xmlns:w="http://schemas.openxmlformats.org/wordprocessingml/2006/main" xmlns:w14="http://schemas.microsoft.com/office/word/2010/wordml" xmlns:w15="http://schemas.microsoft.com/office/word/2012/wordml" xmlns:w16cex="http://schemas.microsoft.com/office/word/2018/wordml/cex" xmlns:w16cid="http://schemas.microsoft.com/office/word/2016/wordml/cid" xmlns:w16="http://schemas.microsoft.com/office/word/2018/wordml" xmlns:w16sdtdh="http://schemas.microsoft.com/office/word/2020/wordml/sdtdatahash" xmlns:w16sdtfl="http://schemas.microsoft.com/office/word/2024/wordml/sdtformatlock" xmlns:w16se="http://schemas.microsoft.com/office/word/2015/wordml/symex" xmlns:w16du="http://schemas.microsoft.com/office/word/2023/wordml/word16du" xmlns:wne="http://schemas.microsoft.com/office/word/2006/wordml" mc:Ignorable="w14 w15 w16se w16cid w16 w16cex w16sdtdh w16sdtfl w16du wp14">
   <w:abstractNum w:abstractNumId="0" w15:restartNumberingAfterBreak="0">
     <w:nsid w:val="A2BB565E"/>
     <w:multiLevelType w:val="multilevel"/>
@@ -7111,6 +7365,119 @@
     </w:lvl>
   </w:abstractNum>
   <w:abstractNum w:abstractNumId="13" w15:restartNumberingAfterBreak="0">
+    <w:nsid w:val="669C28F3"/>
+    <w:multiLevelType w:val="hybridMultilevel"/>
+    <w:tmpl w:val="46B2B1DA"/>
+    <w:lvl w:ilvl="0" w:tplc="04090001">
+      <w:start w:val="1"/>
+      <w:numFmt w:val="bullet"/>
+      <w:lvlText w:val=""/>
+      <w:lvlJc w:val="left"/>
+      <w:pPr>
+        <w:ind w:left="480" w:hanging="480"/>
+      </w:pPr>
+      <w:rPr>
+        <w:rFonts w:ascii="Wingdings" w:hAnsi="Wingdings" w:hint="default"/>
+      </w:rPr>
+    </w:lvl>
+    <w:lvl w:ilvl="1" w:tplc="04090003">
+      <w:start w:val="1"/>
+      <w:numFmt w:val="bullet"/>
+      <w:lvlText w:val=""/>
+      <w:lvlJc w:val="left"/>
+      <w:pPr>
+        <w:ind w:left="960" w:hanging="480"/>
+      </w:pPr>
+      <w:rPr>
+        <w:rFonts w:ascii="Wingdings" w:hAnsi="Wingdings" w:hint="default"/>
+      </w:rPr>
+    </w:lvl>
+    <w:lvl w:ilvl="2" w:tplc="04090005">
+      <w:start w:val="1"/>
+      <w:numFmt w:val="bullet"/>
+      <w:lvlText w:val=""/>
+      <w:lvlJc w:val="left"/>
+      <w:pPr>
+        <w:ind w:left="1440" w:hanging="480"/>
+      </w:pPr>
+      <w:rPr>
+        <w:rFonts w:ascii="Wingdings" w:hAnsi="Wingdings" w:hint="default"/>
+      </w:rPr>
+    </w:lvl>
+    <w:lvl w:ilvl="3" w:tplc="04090001" w:tentative="1">
+      <w:start w:val="1"/>
+      <w:numFmt w:val="bullet"/>
+      <w:lvlText w:val=""/>
+      <w:lvlJc w:val="left"/>
+      <w:pPr>
+        <w:ind w:left="1920" w:hanging="480"/>
+      </w:pPr>
+      <w:rPr>
+        <w:rFonts w:ascii="Wingdings" w:hAnsi="Wingdings" w:hint="default"/>
+      </w:rPr>
+    </w:lvl>
+    <w:lvl w:ilvl="4" w:tplc="04090003" w:tentative="1">
+      <w:start w:val="1"/>
+      <w:numFmt w:val="bullet"/>
+      <w:lvlText w:val=""/>
+      <w:lvlJc w:val="left"/>
+      <w:pPr>
+        <w:ind w:left="2400" w:hanging="480"/>
+      </w:pPr>
+      <w:rPr>
+        <w:rFonts w:ascii="Wingdings" w:hAnsi="Wingdings" w:hint="default"/>
+      </w:rPr>
+    </w:lvl>
+    <w:lvl w:ilvl="5" w:tplc="04090005" w:tentative="1">
+      <w:start w:val="1"/>
+      <w:numFmt w:val="bullet"/>
+      <w:lvlText w:val=""/>
+      <w:lvlJc w:val="left"/>
+      <w:pPr>
+        <w:ind w:left="2880" w:hanging="480"/>
+      </w:pPr>
+      <w:rPr>
+        <w:rFonts w:ascii="Wingdings" w:hAnsi="Wingdings" w:hint="default"/>
+      </w:rPr>
+    </w:lvl>
+    <w:lvl w:ilvl="6" w:tplc="04090001" w:tentative="1">
+      <w:start w:val="1"/>
+      <w:numFmt w:val="bullet"/>
+      <w:lvlText w:val=""/>
+      <w:lvlJc w:val="left"/>
+      <w:pPr>
+        <w:ind w:left="3360" w:hanging="480"/>
+      </w:pPr>
+      <w:rPr>
+        <w:rFonts w:ascii="Wingdings" w:hAnsi="Wingdings" w:hint="default"/>
+      </w:rPr>
+    </w:lvl>
+    <w:lvl w:ilvl="7" w:tplc="04090003" w:tentative="1">
+      <w:start w:val="1"/>
+      <w:numFmt w:val="bullet"/>
+      <w:lvlText w:val=""/>
+      <w:lvlJc w:val="left"/>
+      <w:pPr>
+        <w:ind w:left="3840" w:hanging="480"/>
+      </w:pPr>
+      <w:rPr>
+        <w:rFonts w:ascii="Wingdings" w:hAnsi="Wingdings" w:hint="default"/>
+      </w:rPr>
+    </w:lvl>
+    <w:lvl w:ilvl="8" w:tplc="04090005" w:tentative="1">
+      <w:start w:val="1"/>
+      <w:numFmt w:val="bullet"/>
+      <w:lvlText w:val=""/>
+      <w:lvlJc w:val="left"/>
+      <w:pPr>
+        <w:ind w:left="4320" w:hanging="480"/>
+      </w:pPr>
+      <w:rPr>
+        <w:rFonts w:ascii="Wingdings" w:hAnsi="Wingdings" w:hint="default"/>
+      </w:rPr>
+    </w:lvl>
+  </w:abstractNum>
+  <w:abstractNum w:abstractNumId="14" w15:restartNumberingAfterBreak="0">
     <w:nsid w:val="6E2F5D5C"/>
     <w:multiLevelType w:val="hybridMultilevel"/>
     <w:tmpl w:val="B47ED062"/>
@@ -7223,7 +7590,7 @@
       </w:rPr>
     </w:lvl>
   </w:abstractNum>
-  <w:abstractNum w:abstractNumId="14" w15:restartNumberingAfterBreak="0">
+  <w:abstractNum w:abstractNumId="15" w15:restartNumberingAfterBreak="0">
     <w:nsid w:val="7FFBCA86"/>
     <w:multiLevelType w:val="singleLevel"/>
     <w:tmpl w:val="7FFBCA86"/>
@@ -7262,7 +7629,7 @@
     <w:abstractNumId w:val="10"/>
   </w:num>
   <w:num w:numId="7" w16cid:durableId="997878970">
-    <w:abstractNumId w:val="14"/>
+    <w:abstractNumId w:val="15"/>
   </w:num>
   <w:num w:numId="8" w16cid:durableId="1120684404">
     <w:abstractNumId w:val="2"/>
@@ -7277,7 +7644,7 @@
     <w:abstractNumId w:val="5"/>
   </w:num>
   <w:num w:numId="12" w16cid:durableId="2053841961">
-    <w:abstractNumId w:val="13"/>
+    <w:abstractNumId w:val="14"/>
   </w:num>
   <w:num w:numId="13" w16cid:durableId="94177580">
     <w:abstractNumId w:val="12"/>
@@ -7287,6 +7654,9 @@
   </w:num>
   <w:num w:numId="15" w16cid:durableId="47150535">
     <w:abstractNumId w:val="8"/>
+  </w:num>
+  <w:num w:numId="16" w16cid:durableId="1092623967">
+    <w:abstractNumId w:val="13"/>
   </w:num>
 </w:numbering>
 </file>
@@ -8189,6 +8559,33 @@
       <w14:ligatures w14:val="none"/>
     </w:rPr>
   </w:style>
+  <w:style w:type="paragraph" w:styleId="ac">
+    <w:name w:val="Date"/>
+    <w:basedOn w:val="a"/>
+    <w:next w:val="a"/>
+    <w:link w:val="ad"/>
+    <w:uiPriority w:val="99"/>
+    <w:semiHidden/>
+    <w:unhideWhenUsed/>
+    <w:rsid w:val="00621E55"/>
+    <w:pPr>
+      <w:jc w:val="right"/>
+    </w:pPr>
+  </w:style>
+  <w:style w:type="character" w:customStyle="1" w:styleId="ad">
+    <w:name w:val="日期 字元"/>
+    <w:basedOn w:val="a0"/>
+    <w:link w:val="ac"/>
+    <w:uiPriority w:val="99"/>
+    <w:semiHidden/>
+    <w:rsid w:val="00621E55"/>
+    <w:rPr>
+      <w:kern w:val="2"/>
+      <w:sz w:val="24"/>
+      <w:szCs w:val="24"/>
+      <w14:ligatures w14:val="standardContextual"/>
+    </w:rPr>
+  </w:style>
 </w:styles>
 </file>
 

</xml_diff>

<commit_message>
feat: add landing page demo and feature art components
- Implemented a self-playing product demo for the landing page showcasing three subjects: machine learning, economics, and statistics.
- Created feature art components for upload, reading, and exporting notes, enhancing the visual appeal of the landing page.
- Added scroll-triggered reveal effects for improved user experience.
- Updated launch configuration for development environment.
- Removed temporary files and updated existing document files.
</commit_message>
<xml_diff>
--- a/日記.docx
+++ b/日記.docx
@@ -5673,7 +5673,7 @@
           <w:numId w:val="16"/>
         </w:numPr>
         <w:rPr>
-          <w:rFonts w:eastAsia="新細明體" w:hint="eastAsia"/>
+          <w:rFonts w:eastAsia="新細明體"/>
         </w:rPr>
       </w:pPr>
       <w:r>
@@ -5700,6 +5700,596 @@
       <w:r>
         <w:t xml:space="preserve"> PDF</w:t>
       </w:r>
+    </w:p>
+    <w:p>
+      <w:pPr>
+        <w:pStyle w:val="a9"/>
+        <w:numPr>
+          <w:ilvl w:val="2"/>
+          <w:numId w:val="16"/>
+        </w:numPr>
+        <w:rPr>
+          <w:rFonts w:eastAsia="新細明體"/>
+        </w:rPr>
+      </w:pPr>
+      <w:r>
+        <w:rPr>
+          <w:rFonts w:hint="eastAsia"/>
+        </w:rPr>
+        <w:t>整體流程</w:t>
+      </w:r>
+    </w:p>
+    <w:p>
+      <w:pPr>
+        <w:pStyle w:val="a9"/>
+        <w:ind w:left="1440"/>
+        <w:rPr>
+          <w:rFonts w:eastAsia="新細明體"/>
+        </w:rPr>
+      </w:pPr>
+      <w:r>
+        <w:rPr>
+          <w:rFonts w:eastAsia="新細明體"/>
+          <w:noProof/>
+        </w:rPr>
+        <w:lastRenderedPageBreak/>
+        <w:drawing>
+          <wp:inline distT="0" distB="0" distL="0" distR="0" wp14:anchorId="5F57EA00" wp14:editId="4AB8F6F6">
+            <wp:extent cx="4259385" cy="2332765"/>
+            <wp:effectExtent l="0" t="0" r="0" b="4445"/>
+            <wp:docPr id="1261624711" name="圖片 1"/>
+            <wp:cNvGraphicFramePr>
+              <a:graphicFrameLocks xmlns:a="http://schemas.openxmlformats.org/drawingml/2006/main" noChangeAspect="1"/>
+            </wp:cNvGraphicFramePr>
+            <a:graphic xmlns:a="http://schemas.openxmlformats.org/drawingml/2006/main">
+              <a:graphicData uri="http://schemas.openxmlformats.org/drawingml/2006/picture">
+                <pic:pic xmlns:pic="http://schemas.openxmlformats.org/drawingml/2006/picture">
+                  <pic:nvPicPr>
+                    <pic:cNvPr id="1261624711" name=""/>
+                    <pic:cNvPicPr/>
+                  </pic:nvPicPr>
+                  <pic:blipFill>
+                    <a:blip r:embed="rId9"/>
+                    <a:stretch>
+                      <a:fillRect/>
+                    </a:stretch>
+                  </pic:blipFill>
+                  <pic:spPr>
+                    <a:xfrm>
+                      <a:off x="0" y="0"/>
+                      <a:ext cx="4288687" cy="2348813"/>
+                    </a:xfrm>
+                    <a:prstGeom prst="rect">
+                      <a:avLst/>
+                    </a:prstGeom>
+                  </pic:spPr>
+                </pic:pic>
+              </a:graphicData>
+            </a:graphic>
+          </wp:inline>
+        </w:drawing>
+      </w:r>
+    </w:p>
+    <w:p>
+      <w:pPr>
+        <w:pStyle w:val="a9"/>
+        <w:numPr>
+          <w:ilvl w:val="0"/>
+          <w:numId w:val="16"/>
+        </w:numPr>
+        <w:rPr>
+          <w:rFonts w:eastAsia="新細明體"/>
+        </w:rPr>
+      </w:pPr>
+      <w:r>
+        <w:t xml:space="preserve">Deploy </w:t>
+      </w:r>
+      <w:r>
+        <w:rPr>
+          <w:rFonts w:hint="eastAsia"/>
+        </w:rPr>
+        <w:t>到</w:t>
+      </w:r>
+      <w:r>
+        <w:rPr>
+          <w:rFonts w:hint="eastAsia"/>
+        </w:rPr>
+        <w:t xml:space="preserve"> </w:t>
+      </w:r>
+      <w:proofErr w:type="spellStart"/>
+      <w:r>
+        <w:t>vercel</w:t>
+      </w:r>
+      <w:proofErr w:type="spellEnd"/>
+      <w:r>
+        <w:t xml:space="preserve"> </w:t>
+      </w:r>
+      <w:r>
+        <w:rPr>
+          <w:rFonts w:hint="eastAsia"/>
+        </w:rPr>
+        <w:t>上</w:t>
+      </w:r>
+    </w:p>
+    <w:p>
+      <w:pPr>
+        <w:pStyle w:val="a9"/>
+        <w:numPr>
+          <w:ilvl w:val="1"/>
+          <w:numId w:val="16"/>
+        </w:numPr>
+        <w:rPr>
+          <w:rFonts w:eastAsia="新細明體"/>
+        </w:rPr>
+      </w:pPr>
+      <w:r>
+        <w:rPr>
+          <w:rFonts w:hint="eastAsia"/>
+        </w:rPr>
+        <w:t>同步把</w:t>
+      </w:r>
+      <w:r>
+        <w:rPr>
+          <w:rFonts w:hint="eastAsia"/>
+        </w:rPr>
+        <w:t xml:space="preserve"> </w:t>
+      </w:r>
+      <w:r>
+        <w:t xml:space="preserve">Google </w:t>
+      </w:r>
+      <w:proofErr w:type="spellStart"/>
+      <w:r>
+        <w:rPr>
+          <w:rFonts w:hint="eastAsia"/>
+        </w:rPr>
+        <w:t>O</w:t>
+      </w:r>
+      <w:r>
+        <w:t>auth</w:t>
+      </w:r>
+      <w:proofErr w:type="spellEnd"/>
+      <w:r>
+        <w:rPr>
+          <w:rFonts w:hint="eastAsia"/>
+        </w:rPr>
+        <w:t xml:space="preserve"> </w:t>
+      </w:r>
+      <w:r>
+        <w:rPr>
+          <w:rFonts w:hint="eastAsia"/>
+        </w:rPr>
+        <w:t>的</w:t>
+      </w:r>
+      <w:r>
+        <w:t>Authorized JavaScript origins</w:t>
+      </w:r>
+      <w:r>
+        <w:t>、</w:t>
+      </w:r>
+      <w:r>
+        <w:t>Authorized redirect URIs</w:t>
+      </w:r>
+      <w:r>
+        <w:rPr>
+          <w:rFonts w:hint="eastAsia"/>
+        </w:rPr>
+        <w:t xml:space="preserve"> </w:t>
+      </w:r>
+      <w:r>
+        <w:rPr>
+          <w:rFonts w:hint="eastAsia"/>
+        </w:rPr>
+        <w:t>設定好</w:t>
+      </w:r>
+    </w:p>
+    <w:p>
+      <w:pPr>
+        <w:pStyle w:val="a9"/>
+        <w:numPr>
+          <w:ilvl w:val="1"/>
+          <w:numId w:val="16"/>
+        </w:numPr>
+        <w:rPr>
+          <w:rFonts w:eastAsia="新細明體"/>
+        </w:rPr>
+      </w:pPr>
+      <w:r>
+        <w:rPr>
+          <w:rFonts w:hint="eastAsia"/>
+        </w:rPr>
+        <w:t>也在</w:t>
+      </w:r>
+      <w:r>
+        <w:rPr>
+          <w:rFonts w:hint="eastAsia"/>
+        </w:rPr>
+        <w:t xml:space="preserve"> </w:t>
+      </w:r>
+      <w:r>
+        <w:rPr>
+          <w:rFonts w:eastAsia="新細明體"/>
+        </w:rPr>
+        <w:t>R2</w:t>
+      </w:r>
+      <w:r>
+        <w:rPr>
+          <w:rFonts w:eastAsia="新細明體" w:hint="eastAsia"/>
+        </w:rPr>
+        <w:t xml:space="preserve"> </w:t>
+      </w:r>
+      <w:r>
+        <w:rPr>
+          <w:rFonts w:eastAsia="新細明體" w:hint="eastAsia"/>
+        </w:rPr>
+        <w:t>的</w:t>
+      </w:r>
+      <w:r>
+        <w:rPr>
+          <w:rFonts w:eastAsia="新細明體" w:hint="eastAsia"/>
+        </w:rPr>
+        <w:t xml:space="preserve"> </w:t>
+      </w:r>
+      <w:r>
+        <w:rPr>
+          <w:rFonts w:eastAsia="新細明體"/>
+        </w:rPr>
+        <w:t xml:space="preserve">CORS </w:t>
+      </w:r>
+      <w:r>
+        <w:rPr>
+          <w:rFonts w:eastAsia="新細明體" w:hint="eastAsia"/>
+        </w:rPr>
+        <w:t>多設定</w:t>
+      </w:r>
+      <w:proofErr w:type="spellStart"/>
+      <w:r>
+        <w:rPr>
+          <w:rFonts w:eastAsia="新細明體"/>
+        </w:rPr>
+        <w:t>AllowedOrigins</w:t>
+      </w:r>
+      <w:proofErr w:type="spellEnd"/>
+      <w:r>
+        <w:rPr>
+          <w:rFonts w:eastAsia="新細明體"/>
+        </w:rPr>
+        <w:t xml:space="preserve"> </w:t>
+      </w:r>
+      <w:r>
+        <w:rPr>
+          <w:rFonts w:eastAsia="新細明體"/>
+        </w:rPr>
+        <w:t>加正式網域</w:t>
+      </w:r>
+    </w:p>
+    <w:p>
+      <w:pPr>
+        <w:pStyle w:val="a9"/>
+        <w:numPr>
+          <w:ilvl w:val="0"/>
+          <w:numId w:val="16"/>
+        </w:numPr>
+        <w:rPr>
+          <w:rFonts w:eastAsia="新細明體"/>
+        </w:rPr>
+      </w:pPr>
+      <w:r>
+        <w:rPr>
+          <w:rFonts w:eastAsia="新細明體" w:hint="eastAsia"/>
+        </w:rPr>
+        <w:t>理解</w:t>
+      </w:r>
+      <w:r>
+        <w:rPr>
+          <w:rFonts w:eastAsia="新細明體"/>
+        </w:rPr>
+        <w:t xml:space="preserve"> </w:t>
+      </w:r>
+      <w:proofErr w:type="spellStart"/>
+      <w:r>
+        <w:rPr>
+          <w:rFonts w:eastAsia="新細明體"/>
+        </w:rPr>
+        <w:t>Oauth</w:t>
+      </w:r>
+      <w:proofErr w:type="spellEnd"/>
+      <w:r>
+        <w:rPr>
+          <w:rFonts w:eastAsia="新細明體"/>
+        </w:rPr>
+        <w:t xml:space="preserve"> </w:t>
+      </w:r>
+      <w:r>
+        <w:rPr>
+          <w:rFonts w:eastAsia="新細明體" w:hint="eastAsia"/>
+        </w:rPr>
+        <w:t>的流程</w:t>
+      </w:r>
+    </w:p>
+    <w:p>
+      <w:pPr>
+        <w:pStyle w:val="a9"/>
+        <w:ind w:left="480"/>
+        <w:rPr>
+          <w:rFonts w:eastAsia="新細明體"/>
+        </w:rPr>
+      </w:pPr>
+      <w:r>
+        <w:rPr>
+          <w:rFonts w:eastAsia="新細明體"/>
+          <w:noProof/>
+        </w:rPr>
+        <w:drawing>
+          <wp:inline distT="0" distB="0" distL="0" distR="0" wp14:anchorId="6EF06A27" wp14:editId="3EAB306C">
+            <wp:extent cx="2810532" cy="4650154"/>
+            <wp:effectExtent l="0" t="0" r="0" b="0"/>
+            <wp:docPr id="1756270557" name="圖片 1"/>
+            <wp:cNvGraphicFramePr>
+              <a:graphicFrameLocks xmlns:a="http://schemas.openxmlformats.org/drawingml/2006/main" noChangeAspect="1"/>
+            </wp:cNvGraphicFramePr>
+            <a:graphic xmlns:a="http://schemas.openxmlformats.org/drawingml/2006/main">
+              <a:graphicData uri="http://schemas.openxmlformats.org/drawingml/2006/picture">
+                <pic:pic xmlns:pic="http://schemas.openxmlformats.org/drawingml/2006/picture">
+                  <pic:nvPicPr>
+                    <pic:cNvPr id="1756270557" name=""/>
+                    <pic:cNvPicPr/>
+                  </pic:nvPicPr>
+                  <pic:blipFill>
+                    <a:blip r:embed="rId10"/>
+                    <a:stretch>
+                      <a:fillRect/>
+                    </a:stretch>
+                  </pic:blipFill>
+                  <pic:spPr>
+                    <a:xfrm>
+                      <a:off x="0" y="0"/>
+                      <a:ext cx="2823735" cy="4671998"/>
+                    </a:xfrm>
+                    <a:prstGeom prst="rect">
+                      <a:avLst/>
+                    </a:prstGeom>
+                  </pic:spPr>
+                </pic:pic>
+              </a:graphicData>
+            </a:graphic>
+          </wp:inline>
+        </w:drawing>
+      </w:r>
+    </w:p>
+    <w:p>
+      <w:pPr>
+        <w:pStyle w:val="a9"/>
+        <w:numPr>
+          <w:ilvl w:val="0"/>
+          <w:numId w:val="16"/>
+        </w:numPr>
+        <w:rPr>
+          <w:rFonts w:eastAsia="新細明體"/>
+        </w:rPr>
+      </w:pPr>
+      <w:r>
+        <w:rPr>
+          <w:rFonts w:eastAsia="新細明體" w:hint="eastAsia"/>
+        </w:rPr>
+        <w:lastRenderedPageBreak/>
+        <w:t>規劃</w:t>
+      </w:r>
+    </w:p>
+    <w:p>
+      <w:pPr>
+        <w:pStyle w:val="a9"/>
+        <w:numPr>
+          <w:ilvl w:val="1"/>
+          <w:numId w:val="16"/>
+        </w:numPr>
+        <w:rPr>
+          <w:rFonts w:eastAsia="新細明體"/>
+        </w:rPr>
+      </w:pPr>
+      <w:r>
+        <w:rPr>
+          <w:rFonts w:eastAsia="新細明體" w:hint="eastAsia"/>
+        </w:rPr>
+        <w:t>做免費流量限制、免登入試用、可以放自己的</w:t>
+      </w:r>
+      <w:r>
+        <w:rPr>
+          <w:rFonts w:eastAsia="新細明體"/>
+        </w:rPr>
+        <w:t>AI API key</w:t>
+      </w:r>
+    </w:p>
+    <w:p>
+      <w:pPr>
+        <w:pStyle w:val="a9"/>
+        <w:numPr>
+          <w:ilvl w:val="1"/>
+          <w:numId w:val="16"/>
+        </w:numPr>
+        <w:rPr>
+          <w:rFonts w:eastAsia="新細明體"/>
+        </w:rPr>
+      </w:pPr>
+      <w:r>
+        <w:rPr>
+          <w:rFonts w:eastAsia="新細明體" w:hint="eastAsia"/>
+        </w:rPr>
+        <w:t>收費的機制</w:t>
+      </w:r>
+    </w:p>
+    <w:p>
+      <w:pPr>
+        <w:pStyle w:val="a9"/>
+        <w:numPr>
+          <w:ilvl w:val="1"/>
+          <w:numId w:val="16"/>
+        </w:numPr>
+        <w:rPr>
+          <w:rFonts w:eastAsia="新細明體"/>
+        </w:rPr>
+      </w:pPr>
+      <w:r>
+        <w:rPr>
+          <w:rFonts w:eastAsia="新細明體"/>
+        </w:rPr>
+        <w:t>Readme</w:t>
+      </w:r>
+      <w:r>
+        <w:rPr>
+          <w:rFonts w:eastAsia="新細明體" w:hint="eastAsia"/>
+        </w:rPr>
+        <w:t>更新</w:t>
+      </w:r>
+    </w:p>
+    <w:p>
+      <w:pPr>
+        <w:pStyle w:val="a9"/>
+        <w:numPr>
+          <w:ilvl w:val="1"/>
+          <w:numId w:val="16"/>
+        </w:numPr>
+        <w:rPr>
+          <w:rFonts w:eastAsia="新細明體"/>
+        </w:rPr>
+      </w:pPr>
+      <w:r>
+        <w:rPr>
+          <w:rFonts w:eastAsia="新細明體" w:hint="eastAsia"/>
+        </w:rPr>
+        <w:t>買網域（？</w:t>
+      </w:r>
+    </w:p>
+    <w:p>
+      <w:pPr>
+        <w:pStyle w:val="a9"/>
+        <w:numPr>
+          <w:ilvl w:val="1"/>
+          <w:numId w:val="16"/>
+        </w:numPr>
+        <w:rPr>
+          <w:rFonts w:eastAsia="新細明體"/>
+        </w:rPr>
+      </w:pPr>
+      <w:r>
+        <w:rPr>
+          <w:rFonts w:eastAsia="新細明體" w:hint="eastAsia"/>
+        </w:rPr>
+        <w:t>思考行銷策略</w:t>
+      </w:r>
+    </w:p>
+    <w:p>
+      <w:pPr>
+        <w:pStyle w:val="a9"/>
+        <w:numPr>
+          <w:ilvl w:val="1"/>
+          <w:numId w:val="16"/>
+        </w:numPr>
+        <w:rPr>
+          <w:rFonts w:eastAsia="新細明體" w:hint="eastAsia"/>
+        </w:rPr>
+      </w:pPr>
+      <w:r>
+        <w:rPr>
+          <w:rFonts w:hint="eastAsia"/>
+        </w:rPr>
+        <w:t>修改封面，讓</w:t>
+      </w:r>
+      <w:r>
+        <w:t>demo</w:t>
+      </w:r>
+      <w:r>
+        <w:rPr>
+          <w:rFonts w:hint="eastAsia"/>
+        </w:rPr>
+        <w:t>的內容更完整</w:t>
+      </w:r>
+    </w:p>
+    <w:p>
+      <w:pPr>
+        <w:pStyle w:val="a9"/>
+        <w:numPr>
+          <w:ilvl w:val="1"/>
+          <w:numId w:val="16"/>
+        </w:numPr>
+        <w:rPr>
+          <w:rFonts w:eastAsia="新細明體"/>
+        </w:rPr>
+      </w:pPr>
+      <w:r>
+        <w:rPr>
+          <w:rFonts w:eastAsia="新細明體" w:hint="eastAsia"/>
+        </w:rPr>
+        <w:t>非</w:t>
+      </w:r>
+      <w:r>
+        <w:rPr>
+          <w:rFonts w:eastAsia="新細明體" w:hint="eastAsia"/>
+        </w:rPr>
+        <w:t xml:space="preserve"> </w:t>
+      </w:r>
+      <w:r>
+        <w:rPr>
+          <w:rFonts w:eastAsia="新細明體"/>
+        </w:rPr>
+        <w:t>MVP</w:t>
+      </w:r>
+    </w:p>
+    <w:p>
+      <w:pPr>
+        <w:pStyle w:val="a9"/>
+        <w:numPr>
+          <w:ilvl w:val="2"/>
+          <w:numId w:val="16"/>
+        </w:numPr>
+        <w:rPr>
+          <w:rFonts w:eastAsia="新細明體"/>
+        </w:rPr>
+      </w:pPr>
+      <w:r>
+        <w:rPr>
+          <w:rFonts w:eastAsia="新細明體" w:hint="eastAsia"/>
+        </w:rPr>
+        <w:t>分享功能</w:t>
+      </w:r>
+    </w:p>
+    <w:p>
+      <w:pPr>
+        <w:pStyle w:val="a9"/>
+        <w:numPr>
+          <w:ilvl w:val="2"/>
+          <w:numId w:val="16"/>
+        </w:numPr>
+        <w:rPr>
+          <w:rFonts w:eastAsia="新細明體"/>
+        </w:rPr>
+      </w:pPr>
+      <w:r>
+        <w:rPr>
+          <w:rFonts w:eastAsia="新細明體" w:hint="eastAsia"/>
+        </w:rPr>
+        <w:t>同步到</w:t>
+      </w:r>
+      <w:r>
+        <w:rPr>
+          <w:rFonts w:eastAsia="新細明體" w:hint="eastAsia"/>
+        </w:rPr>
+        <w:t xml:space="preserve"> </w:t>
+      </w:r>
+      <w:r>
+        <w:rPr>
+          <w:rFonts w:eastAsia="新細明體"/>
+        </w:rPr>
+        <w:t>notion</w:t>
+      </w:r>
+    </w:p>
+    <w:p>
+      <w:pPr>
+        <w:pStyle w:val="a9"/>
+        <w:ind w:left="1440"/>
+        <w:rPr>
+          <w:rFonts w:eastAsia="新細明體" w:hint="eastAsia"/>
+        </w:rPr>
+      </w:pPr>
     </w:p>
     <w:sectPr>
       <w:pgSz w:w="11906" w:h="16838"/>
@@ -7367,7 +7957,7 @@
   <w:abstractNum w:abstractNumId="13" w15:restartNumberingAfterBreak="0">
     <w:nsid w:val="669C28F3"/>
     <w:multiLevelType w:val="hybridMultilevel"/>
-    <w:tmpl w:val="46B2B1DA"/>
+    <w:tmpl w:val="71289FCC"/>
     <w:lvl w:ilvl="0" w:tplc="04090001">
       <w:start w:val="1"/>
       <w:numFmt w:val="bullet"/>

</xml_diff>